<commit_message>
minor edits for clarity and consistency
</commit_message>
<xml_diff>
--- a/paper/S2-supplement-site-assignment.docx
+++ b/paper/S2-supplement-site-assignment.docx
@@ -51,19 +51,37 @@
         <w:t xml:space="preserve"> </w:t>
       </w:r>
       <w:r>
-        <w:t xml:space="preserve">as</w:t>
-      </w:r>
-      <w:r>
-        <w:t xml:space="preserve"> </w:t>
-      </w:r>
-      <w:r>
-        <w:t xml:space="preserve">proxies</w:t>
-      </w:r>
-      <w:r>
-        <w:t xml:space="preserve"> </w:t>
-      </w:r>
-      <w:r>
-        <w:t xml:space="preserve">for</w:t>
+        <w:t xml:space="preserve">reveal</w:t>
+      </w:r>
+      <w:r>
+        <w:t xml:space="preserve"> </w:t>
+      </w:r>
+      <w:r>
+        <w:t xml:space="preserve">a</w:t>
+      </w:r>
+      <w:r>
+        <w:t xml:space="preserve"> </w:t>
+      </w:r>
+      <w:r>
+        <w:t xml:space="preserve">continuum</w:t>
+      </w:r>
+      <w:r>
+        <w:t xml:space="preserve"> </w:t>
+      </w:r>
+      <w:r>
+        <w:t xml:space="preserve">rather</w:t>
+      </w:r>
+      <w:r>
+        <w:t xml:space="preserve"> </w:t>
+      </w:r>
+      <w:r>
+        <w:t xml:space="preserve">than</w:t>
+      </w:r>
+      <w:r>
+        <w:t xml:space="preserve"> </w:t>
+      </w:r>
+      <w:r>
+        <w:t xml:space="preserve">discrete</w:t>
       </w:r>
       <w:r>
         <w:t xml:space="preserve"> </w:t>
@@ -75,31 +93,19 @@
         <w:t xml:space="preserve"> </w:t>
       </w:r>
       <w:r>
-        <w:t xml:space="preserve">connectivity</w:t>
-      </w:r>
-      <w:r>
-        <w:t xml:space="preserve"> </w:t>
-      </w:r>
-      <w:r>
-        <w:t xml:space="preserve">during</w:t>
+        <w:t xml:space="preserve">groups</w:t>
+      </w:r>
+      <w:r>
+        <w:t xml:space="preserve"> </w:t>
+      </w:r>
+      <w:r>
+        <w:t xml:space="preserve">in</w:t>
       </w:r>
       <w:r>
         <w:t xml:space="preserve"> </w:t>
       </w:r>
       <w:r>
         <w:t xml:space="preserve">the</w:t>
-      </w:r>
-      <w:r>
-        <w:t xml:space="preserve"> </w:t>
-      </w:r>
-      <w:r>
-        <w:t xml:space="preserve">Western</w:t>
-      </w:r>
-      <w:r>
-        <w:t xml:space="preserve"> </w:t>
-      </w:r>
-      <w:r>
-        <w:t xml:space="preserve">Eurasian</w:t>
       </w:r>
       <w:r>
         <w:t xml:space="preserve"> </w:t>
@@ -205,13 +211,13 @@
         <w:pStyle w:val="Date"/>
       </w:pPr>
       <w:r>
-        <w:t xml:space="preserve">September</w:t>
-      </w:r>
-      <w:r>
-        <w:t xml:space="preserve"> </w:t>
-      </w:r>
-      <w:r>
-        <w:t xml:space="preserve">7,</w:t>
+        <w:t xml:space="preserve">October</w:t>
+      </w:r>
+      <w:r>
+        <w:t xml:space="preserve"> </w:t>
+      </w:r>
+      <w:r>
+        <w:t xml:space="preserve">3,</w:t>
       </w:r>
       <w:r>
         <w:t xml:space="preserve"> </w:t>

</xml_diff>

<commit_message>
working on revisions to paper and S1 and S2
</commit_message>
<xml_diff>
--- a/paper/S2-supplement-site-assignment.docx
+++ b/paper/S2-supplement-site-assignment.docx
@@ -217,7 +217,7 @@
         <w:t xml:space="preserve"> </w:t>
       </w:r>
       <w:r>
-        <w:t xml:space="preserve">3,</w:t>
+        <w:t xml:space="preserve">16,</w:t>
       </w:r>
       <w:r>
         <w:t xml:space="preserve"> </w:t>
@@ -255,7 +255,7 @@
         <w:t xml:space="preserve"> </w:t>
       </w:r>
       <w:r>
-        <w:t xml:space="preserve">Scientific Computing and Computing Institute, University of Utah, Salt Lake City, USA</w:t>
+        <w:t xml:space="preserve">Scientific Computing and Imaging Institute, University of Utah, Salt Lake City, USA</w:t>
       </w:r>
     </w:p>
     <w:p>
@@ -410,19 +410,10 @@
         </w:r>
       </w:hyperlink>
       <w:r>
-        <w:t xml:space="preserve">). The robustness of these assignments to reverting to purely date-based criteria is tested in S2</w:t>
-      </w:r>
-      <w:r>
-        <w:t xml:space="preserve"> </w:t>
-      </w:r>
-      <w:r>
-        <w:t xml:space="preserve">“</w:t>
-      </w:r>
-      <w:r>
-        <w:t xml:space="preserve">Site Phase Assignments</w:t>
-      </w:r>
-      <w:r>
-        <w:t xml:space="preserve">”</w:t>
+        <w:t xml:space="preserve">). The robustness of these assignments to reverting to purely date-based criteria is tested in S1 §</w:t>
+      </w:r>
+      <w:r>
+        <w:t xml:space="preserve">S1.5.5</w:t>
       </w:r>
       <w:r>
         <w:t xml:space="preserve">, where stratigraphic mixing concerns at Vogelherd are also addressed</w:t>
@@ -476,7 +467,7 @@
         <w:pStyle w:val="FirstParagraph"/>
       </w:pPr>
       <w:r>
-        <w:t xml:space="preserve">The following code loads the raw SignBase dataset, parses radiocarbon dates, calibrates them, and assigns objects to phases. Sites excluded from the main analysis are filtered out, and sites reassigned based on technological attribution are overrides. Date parsing handles both ends of date ranges, routes OSL ages around radiocarbon calibration, and uses IntCal20 explicitly. Sensitivity to variant choice is explored in Supplement S1. The resulting per-site assignment and basis are listed in</w:t>
+        <w:t xml:space="preserve">The following code loads the raw SignBase dataset, parses radiocarbon dates, calibrates them, and assigns objects to phases. Sites excluded from the main analysis are filtered out, and sites reassigned based on technological attribution are overridden. Date parsing handles both ends of date ranges, routes OSL ages around radiocarbon calibration, and uses IntCal20 explicitly. Sensitivity to variant choice is explored in Supplement S1. The resulting per-site assignment and basis are listed in</w:t>
       </w:r>
       <w:r>
         <w:t xml:space="preserve"> </w:t>
@@ -2722,7 +2713,7 @@
         <w:t xml:space="preserve">”</w:t>
       </w:r>
       <w:r>
-        <w:t xml:space="preserve">; its radiocarbon dates of 33–30 ka uncal BP are not older than those of the Western European Late Aurignacian. This is the direct basis for placing AH IV and the overlying III and II-series layers in Aur-P2 (Evolved/Late).</w:t>
+        <w:t xml:space="preserve">; its radiocarbon dates of 33–30 ka ¹⁴C BP are not older than those of the Western European Late Aurignacian. This is the direct basis for placing AH IV and the overlying III and II-series layers in Aur-P2 (Evolved/Late).</w:t>
       </w:r>
     </w:p>
     <w:p>
@@ -2734,7 +2725,7 @@
         <w:pStyle w:val="Compact"/>
       </w:pPr>
       <w:r>
-        <w:t xml:space="preserve">AH V (Va, Vaa, Vab, Vb) is the earlier Aurignacian unit at Hohle Fels and is retained in Aur-P1 (Early Aurignacian); its calibrated median dates (~39.7–43.3 ka BP) are consistent with that placement.</w:t>
+        <w:t xml:space="preserve">AH V (Va, Vaa, Vab, Vb) is the earlier Aurignacian unit at Hohle Fels and is retained in Aur-P1 (Early Aurignacian); its calibrated median dates (~39.7–43.3 ka cal BP) are consistent with that placement.</w:t>
       </w:r>
     </w:p>
     <w:p>
@@ -2822,7 +2813,7 @@
         <w:pStyle w:val="Compact"/>
       </w:pPr>
       <w:r>
-        <w:t xml:space="preserve">Both Geissenklösterle layers remain in Aur-P1: the calibrated median dates of the SignBase radiocarbon determinations for AH II (~40.7 ka BP) and AH III (~42.7 ka BP) fall within the Aur-P1 range, so the technology- and date-based assignments agree for this site. A reassessment [places AH III later (~33–35 ka BP)</w:t>
+        <w:t xml:space="preserve">Both Geissenklösterle layers remain in Aur-P1: the calibrated median dates of the SignBase radiocarbon determinations for AH II (~40.7 ka cal BP) and AH III (~42.7 ka cal BP) fall within the Aur-P1 range, so the technology- and date-based assignments agree for this site. A reassessment places AH III later (~33–35 ka BP)</w:t>
       </w:r>
       <w:r>
         <w:t xml:space="preserve"> </w:t>
@@ -2865,7 +2856,16 @@
         <w:t xml:space="preserve"> </w:t>
       </w:r>
       <w:r>
-        <w:t xml:space="preserve">the Aurignacian and other technocomplexes (Gravettian, Magdalenian), not between Aur-P1 and Aur-P2 Aurignacian facies, so no layer-level phase boundary can be drawn from the published reassessments. The mixing concern is instead addressed directly in Supplement S8 Analysis B (exclusion of Vogelherd).</w:t>
+        <w:t xml:space="preserve">the Aurignacian and other technocomplexes (Gravettian, Magdalenian), not between Aur-P1 and Aur-P2 Aurignacian facies, so no layer-level phase boundary can be drawn from the published reassessments. The mixing concern is instead addressed directly in S1 §</w:t>
+      </w:r>
+      <w:r>
+        <w:t xml:space="preserve">S1.5.5</w:t>
+      </w:r>
+      <w:r>
+        <w:t xml:space="preserve"> </w:t>
+      </w:r>
+      <w:r>
+        <w:t xml:space="preserve">(Analysis B, exclusion of Vogelherd).</w:t>
       </w:r>
     </w:p>
     <w:p>
@@ -2883,7 +2883,7 @@
         <w:t xml:space="preserve"> </w:t>
       </w:r>
       <w:r>
-        <w:t xml:space="preserve">: Reassesses cultural stratigraphy; AH IV–V are Aurignacian but with severe mixing (38 refit connections between layers); 15 radiocarbon dates span 42–34.5 ka BP (calibrated); Gravettian also present.</w:t>
+        <w:t xml:space="preserve">: Reassesses cultural stratigraphy; AH IV–V are Aurignacian but with severe mixing (38 refit connections between layers); 15 radiocarbon dates span 42–34.5 ka cal BP; Gravettian also present.</w:t>
       </w:r>
     </w:p>
     <w:p>
@@ -2904,18 +2904,6 @@
         <w:t xml:space="preserve">: Blade/bladelet production analysis; mixing documented but majority of artifacts are Aurignacian.</w:t>
       </w:r>
     </w:p>
-    <w:p>
-      <w:pPr>
-        <w:numPr>
-          <w:ilvl w:val="0"/>
-          <w:numId w:val="1003"/>
-        </w:numPr>
-        <w:pStyle w:val="Compact"/>
-      </w:pPr>
-      <w:r>
-        <w:t xml:space="preserve">Original dating of Vogelherd Aurignacian to 41–35 ka BP (calibrated).</w:t>
-      </w:r>
-    </w:p>
     <w:bookmarkEnd w:id="26"/>
     <w:bookmarkStart w:id="27" w:name="fumane-protoaurignacian"/>
     <w:p>
@@ -3336,7 +3324,7 @@
         <w:t xml:space="preserve">531 objects distributed across 65 sites</w:t>
       </w:r>
       <w:r>
-        <w:t xml:space="preserve">. 15 objects from 13 sites carry no geometric signs and are excluded upstream (see</w:t>
+        <w:t xml:space="preserve">. 16 objects from 13 sites carry no geometric signs and are excluded upstream (see</w:t>
       </w:r>
       <w:r>
         <w:t xml:space="preserve"> </w:t>
@@ -3350,7 +3338,22 @@
         </w:r>
       </w:hyperlink>
       <w:r>
-        <w:t xml:space="preserve">). A further eight sites are removed from the sample before phase assignment (Willendorf; Muralovka, Shanidar Cave and Hayonim Cave for geographic isolation; El Salitre for lack of a reliable chronological context; Riparo di Fontana Nuova and Grotte De La Princesse Pauline, and Šandalja II as later or peripheral). After phase reclassification and the exclusion of the two mixed-assemblage sites Spy and El Castillo (see</w:t>
+        <w:t xml:space="preserve">). A further eight sites are removed from the sample before phase assignment: Willendorf, because its single object carries only a sign coded as</w:t>
+      </w:r>
+      <w:r>
+        <w:t xml:space="preserve"> </w:t>
+      </w:r>
+      <w:r>
+        <w:t xml:space="preserve">“</w:t>
+      </w:r>
+      <w:r>
+        <w:t xml:space="preserve">other</w:t>
+      </w:r>
+      <w:r>
+        <w:t xml:space="preserve">”</w:t>
+      </w:r>
+      <w:r>
+        <w:t xml:space="preserve">; Riparo di Fontana Nuova, Muralovka, Shanidar Cave and Hayonim Cave, because of geographic isolation; El Salitre, because it lacks a reliable chronological context; and Grotte De La Princesse Pauline and Šandalja II, because they date much later than the other assemblages. After phase reclassification and the exclusion of the two mixed-assemblage sites Spy and El Castillo (see</w:t>
       </w:r>
       <w:r>
         <w:t xml:space="preserve"> </w:t>
@@ -5176,7 +5179,7 @@
         <w:pStyle w:val="FirstParagraph"/>
       </w:pPr>
       <w:r>
-        <w:t xml:space="preserve">One site is placed in Aur-P2 on technological grounds (see</w:t>
+        <w:t xml:space="preserve">Mladeč and the upper horizons of Hohle Fels (AH IV, III and the II-series) are placed in Aur-P2 on technological grounds (see</w:t>
       </w:r>
       <w:r>
         <w:t xml:space="preserve"> </w:t>
@@ -5602,7 +5605,7 @@
         <w:pStyle w:val="FirstParagraph"/>
       </w:pPr>
       <w:r>
-        <w:t xml:space="preserve">Twenty-seven sites are excluded because their SignBase records lack a parsable</w:t>
+        <w:t xml:space="preserve">We exclude 27 sites because their SignBase records lack a parsable</w:t>
       </w:r>
       <w:r>
         <w:t xml:space="preserve"> </w:t>
@@ -5681,7 +5684,7 @@
           <w:bCs/>
           <w:b/>
         </w:rPr>
-        <w:t xml:space="preserve">field in SignBase): 16 sites with 30 total objects (27 signed).</w:t>
+        <w:t xml:space="preserve">field in SignBase): 16 sites with 30 total objects (26 signed).</w:t>
       </w:r>
       <w:r>
         <w:t xml:space="preserve"> </w:t>
@@ -5854,7 +5857,74 @@
                     <w:jc w:val="left"/>
                   </w:pPr>
                   <w:r>
-                    <w:t xml:space="preserve">Exemption reason</w:t>
+                    <w:t xml:space="preserve">Exclusion reason</w:t>
+                  </w:r>
+                </w:p>
+              </w:tc>
+            </w:tr>
+            <w:tr>
+              <w:tc>
+                <w:tcPr/>
+                <w:p>
+                  <w:pPr>
+                    <w:pStyle w:val="Compact"/>
+                    <w:jc w:val="left"/>
+                    <w:jc w:val="left"/>
+                  </w:pPr>
+                  <w:r>
+                    <w:t xml:space="preserve">Abri Lartet/Gorge d’Enfer</w:t>
+                  </w:r>
+                </w:p>
+              </w:tc>
+              <w:tc>
+                <w:tcPr/>
+                <w:p>
+                  <w:pPr>
+                    <w:pStyle w:val="Compact"/>
+                    <w:jc w:val="left"/>
+                    <w:jc w:val="left"/>
+                  </w:pPr>
+                  <w:r>
+                    <w:t xml:space="preserve">B</w:t>
+                  </w:r>
+                </w:p>
+              </w:tc>
+              <w:tc>
+                <w:tcPr/>
+                <w:p>
+                  <w:pPr>
+                    <w:pStyle w:val="Compact"/>
+                    <w:jc w:val="left"/>
+                    <w:jc w:val="left"/>
+                  </w:pPr>
+                  <w:r>
+                    <w:t xml:space="preserve">2</w:t>
+                  </w:r>
+                </w:p>
+              </w:tc>
+              <w:tc>
+                <w:tcPr/>
+                <w:p>
+                  <w:pPr>
+                    <w:pStyle w:val="Compact"/>
+                    <w:jc w:val="left"/>
+                    <w:jc w:val="left"/>
+                  </w:pPr>
+                  <w:r>
+                    <w:t xml:space="preserve">2</w:t>
+                  </w:r>
+                </w:p>
+              </w:tc>
+              <w:tc>
+                <w:tcPr/>
+                <w:p>
+                  <w:pPr>
+                    <w:pStyle w:val="Compact"/>
+                    <w:jc w:val="left"/>
+                    <w:jc w:val="left"/>
+                  </w:pPr>
+                  <w:r>
+                    <w:t xml:space="preserve">No date_bp_max_min</w:t>
                   </w:r>
                 </w:p>
               </w:tc>
@@ -5908,6 +5978,1521 @@
                     <w:jc w:val="left"/>
                   </w:pPr>
                   <w:r>
+                    <w:t xml:space="preserve">4</w:t>
+                  </w:r>
+                </w:p>
+              </w:tc>
+              <w:tc>
+                <w:tcPr/>
+                <w:p>
+                  <w:pPr>
+                    <w:pStyle w:val="Compact"/>
+                    <w:jc w:val="left"/>
+                    <w:jc w:val="left"/>
+                  </w:pPr>
+                  <w:r>
+                    <w:t xml:space="preserve">No date_bp_max_min</w:t>
+                  </w:r>
+                </w:p>
+              </w:tc>
+            </w:tr>
+            <w:tr>
+              <w:tc>
+                <w:tcPr/>
+                <w:p>
+                  <w:pPr>
+                    <w:pStyle w:val="Compact"/>
+                    <w:jc w:val="left"/>
+                    <w:jc w:val="left"/>
+                  </w:pPr>
+                  <w:r>
+                    <w:t xml:space="preserve">Abri du Poisson</w:t>
+                  </w:r>
+                </w:p>
+              </w:tc>
+              <w:tc>
+                <w:tcPr/>
+                <w:p>
+                  <w:pPr>
+                    <w:pStyle w:val="Compact"/>
+                    <w:jc w:val="left"/>
+                    <w:jc w:val="left"/>
+                  </w:pPr>
+                  <w:r>
+                    <w:t xml:space="preserve">B</w:t>
+                  </w:r>
+                </w:p>
+              </w:tc>
+              <w:tc>
+                <w:tcPr/>
+                <w:p>
+                  <w:pPr>
+                    <w:pStyle w:val="Compact"/>
+                    <w:jc w:val="left"/>
+                    <w:jc w:val="left"/>
+                  </w:pPr>
+                  <w:r>
+                    <w:t xml:space="preserve">1</w:t>
+                  </w:r>
+                </w:p>
+              </w:tc>
+              <w:tc>
+                <w:tcPr/>
+                <w:p>
+                  <w:pPr>
+                    <w:pStyle w:val="Compact"/>
+                    <w:jc w:val="left"/>
+                    <w:jc w:val="left"/>
+                  </w:pPr>
+                  <w:r>
+                    <w:t xml:space="preserve">1</w:t>
+                  </w:r>
+                </w:p>
+              </w:tc>
+              <w:tc>
+                <w:tcPr/>
+                <w:p>
+                  <w:pPr>
+                    <w:pStyle w:val="Compact"/>
+                    <w:jc w:val="left"/>
+                    <w:jc w:val="left"/>
+                  </w:pPr>
+                  <w:r>
+                    <w:t xml:space="preserve">No date_bp_max_min</w:t>
+                  </w:r>
+                </w:p>
+              </w:tc>
+            </w:tr>
+            <w:tr>
+              <w:tc>
+                <w:tcPr/>
+                <w:p>
+                  <w:pPr>
+                    <w:pStyle w:val="Compact"/>
+                    <w:jc w:val="left"/>
+                    <w:jc w:val="left"/>
+                  </w:pPr>
+                  <w:r>
+                    <w:t xml:space="preserve">Aurignac</w:t>
+                  </w:r>
+                </w:p>
+              </w:tc>
+              <w:tc>
+                <w:tcPr/>
+                <w:p>
+                  <w:pPr>
+                    <w:pStyle w:val="Compact"/>
+                    <w:jc w:val="left"/>
+                    <w:jc w:val="left"/>
+                  </w:pPr>
+                  <w:r>
+                    <w:t xml:space="preserve">B</w:t>
+                  </w:r>
+                </w:p>
+              </w:tc>
+              <w:tc>
+                <w:tcPr/>
+                <w:p>
+                  <w:pPr>
+                    <w:pStyle w:val="Compact"/>
+                    <w:jc w:val="left"/>
+                    <w:jc w:val="left"/>
+                  </w:pPr>
+                  <w:r>
+                    <w:t xml:space="preserve">1</w:t>
+                  </w:r>
+                </w:p>
+              </w:tc>
+              <w:tc>
+                <w:tcPr/>
+                <w:p>
+                  <w:pPr>
+                    <w:pStyle w:val="Compact"/>
+                    <w:jc w:val="left"/>
+                    <w:jc w:val="left"/>
+                  </w:pPr>
+                  <w:r>
+                    <w:t xml:space="preserve">1</w:t>
+                  </w:r>
+                </w:p>
+              </w:tc>
+              <w:tc>
+                <w:tcPr/>
+                <w:p>
+                  <w:pPr>
+                    <w:pStyle w:val="Compact"/>
+                    <w:jc w:val="left"/>
+                    <w:jc w:val="left"/>
+                  </w:pPr>
+                  <w:r>
+                    <w:t xml:space="preserve">No date_bp_max_min</w:t>
+                  </w:r>
+                </w:p>
+              </w:tc>
+            </w:tr>
+            <w:tr>
+              <w:tc>
+                <w:tcPr/>
+                <w:p>
+                  <w:pPr>
+                    <w:pStyle w:val="Compact"/>
+                    <w:jc w:val="left"/>
+                    <w:jc w:val="left"/>
+                  </w:pPr>
+                  <w:r>
+                    <w:t xml:space="preserve">El Rascaño</w:t>
+                  </w:r>
+                </w:p>
+              </w:tc>
+              <w:tc>
+                <w:tcPr/>
+                <w:p>
+                  <w:pPr>
+                    <w:pStyle w:val="Compact"/>
+                    <w:jc w:val="left"/>
+                    <w:jc w:val="left"/>
+                  </w:pPr>
+                  <w:r>
+                    <w:t xml:space="preserve">B</w:t>
+                  </w:r>
+                </w:p>
+              </w:tc>
+              <w:tc>
+                <w:tcPr/>
+                <w:p>
+                  <w:pPr>
+                    <w:pStyle w:val="Compact"/>
+                    <w:jc w:val="left"/>
+                    <w:jc w:val="left"/>
+                  </w:pPr>
+                  <w:r>
+                    <w:t xml:space="preserve">1</w:t>
+                  </w:r>
+                </w:p>
+              </w:tc>
+              <w:tc>
+                <w:tcPr/>
+                <w:p>
+                  <w:pPr>
+                    <w:pStyle w:val="Compact"/>
+                    <w:jc w:val="left"/>
+                    <w:jc w:val="left"/>
+                  </w:pPr>
+                  <w:r>
+                    <w:t xml:space="preserve">1</w:t>
+                  </w:r>
+                </w:p>
+              </w:tc>
+              <w:tc>
+                <w:tcPr/>
+                <w:p>
+                  <w:pPr>
+                    <w:pStyle w:val="Compact"/>
+                    <w:jc w:val="left"/>
+                    <w:jc w:val="left"/>
+                  </w:pPr>
+                  <w:r>
+                    <w:t xml:space="preserve">No date_bp_max_min</w:t>
+                  </w:r>
+                </w:p>
+              </w:tc>
+            </w:tr>
+            <w:tr>
+              <w:tc>
+                <w:tcPr/>
+                <w:p>
+                  <w:pPr>
+                    <w:pStyle w:val="Compact"/>
+                    <w:jc w:val="left"/>
+                    <w:jc w:val="left"/>
+                  </w:pPr>
+                  <w:r>
+                    <w:t xml:space="preserve">Göpfelsteinhöhle</w:t>
+                  </w:r>
+                </w:p>
+              </w:tc>
+              <w:tc>
+                <w:tcPr/>
+                <w:p>
+                  <w:pPr>
+                    <w:pStyle w:val="Compact"/>
+                    <w:jc w:val="left"/>
+                    <w:jc w:val="left"/>
+                  </w:pPr>
+                  <w:r>
+                    <w:t xml:space="preserve">B</w:t>
+                  </w:r>
+                </w:p>
+              </w:tc>
+              <w:tc>
+                <w:tcPr/>
+                <w:p>
+                  <w:pPr>
+                    <w:pStyle w:val="Compact"/>
+                    <w:jc w:val="left"/>
+                    <w:jc w:val="left"/>
+                  </w:pPr>
+                  <w:r>
+                    <w:t xml:space="preserve">1</w:t>
+                  </w:r>
+                </w:p>
+              </w:tc>
+              <w:tc>
+                <w:tcPr/>
+                <w:p>
+                  <w:pPr>
+                    <w:pStyle w:val="Compact"/>
+                    <w:jc w:val="left"/>
+                    <w:jc w:val="left"/>
+                  </w:pPr>
+                  <w:r>
+                    <w:t xml:space="preserve">1</w:t>
+                  </w:r>
+                </w:p>
+              </w:tc>
+              <w:tc>
+                <w:tcPr/>
+                <w:p>
+                  <w:pPr>
+                    <w:pStyle w:val="Compact"/>
+                    <w:jc w:val="left"/>
+                    <w:jc w:val="left"/>
+                  </w:pPr>
+                  <w:r>
+                    <w:t xml:space="preserve">No date_bp_max_min</w:t>
+                  </w:r>
+                </w:p>
+              </w:tc>
+            </w:tr>
+            <w:tr>
+              <w:tc>
+                <w:tcPr/>
+                <w:p>
+                  <w:pPr>
+                    <w:pStyle w:val="Compact"/>
+                    <w:jc w:val="left"/>
+                    <w:jc w:val="left"/>
+                  </w:pPr>
+                  <w:r>
+                    <w:t xml:space="preserve">Kvasice</w:t>
+                  </w:r>
+                </w:p>
+              </w:tc>
+              <w:tc>
+                <w:tcPr/>
+                <w:p>
+                  <w:pPr>
+                    <w:pStyle w:val="Compact"/>
+                    <w:jc w:val="left"/>
+                    <w:jc w:val="left"/>
+                  </w:pPr>
+                  <w:r>
+                    <w:t xml:space="preserve">B</w:t>
+                  </w:r>
+                </w:p>
+              </w:tc>
+              <w:tc>
+                <w:tcPr/>
+                <w:p>
+                  <w:pPr>
+                    <w:pStyle w:val="Compact"/>
+                    <w:jc w:val="left"/>
+                    <w:jc w:val="left"/>
+                  </w:pPr>
+                  <w:r>
+                    <w:t xml:space="preserve">1</w:t>
+                  </w:r>
+                </w:p>
+              </w:tc>
+              <w:tc>
+                <w:tcPr/>
+                <w:p>
+                  <w:pPr>
+                    <w:pStyle w:val="Compact"/>
+                    <w:jc w:val="left"/>
+                    <w:jc w:val="left"/>
+                  </w:pPr>
+                  <w:r>
+                    <w:t xml:space="preserve">1</w:t>
+                  </w:r>
+                </w:p>
+              </w:tc>
+              <w:tc>
+                <w:tcPr/>
+                <w:p>
+                  <w:pPr>
+                    <w:pStyle w:val="Compact"/>
+                    <w:jc w:val="left"/>
+                    <w:jc w:val="left"/>
+                  </w:pPr>
+                  <w:r>
+                    <w:t xml:space="preserve">No date_bp_max_min</w:t>
+                  </w:r>
+                </w:p>
+              </w:tc>
+            </w:tr>
+            <w:tr>
+              <w:tc>
+                <w:tcPr/>
+                <w:p>
+                  <w:pPr>
+                    <w:pStyle w:val="Compact"/>
+                    <w:jc w:val="left"/>
+                    <w:jc w:val="left"/>
+                  </w:pPr>
+                  <w:r>
+                    <w:t xml:space="preserve">La Souquette</w:t>
+                  </w:r>
+                </w:p>
+              </w:tc>
+              <w:tc>
+                <w:tcPr/>
+                <w:p>
+                  <w:pPr>
+                    <w:pStyle w:val="Compact"/>
+                    <w:jc w:val="left"/>
+                    <w:jc w:val="left"/>
+                  </w:pPr>
+                  <w:r>
+                    <w:t xml:space="preserve">B</w:t>
+                  </w:r>
+                </w:p>
+              </w:tc>
+              <w:tc>
+                <w:tcPr/>
+                <w:p>
+                  <w:pPr>
+                    <w:pStyle w:val="Compact"/>
+                    <w:jc w:val="left"/>
+                    <w:jc w:val="left"/>
+                  </w:pPr>
+                  <w:r>
+                    <w:t xml:space="preserve">2</w:t>
+                  </w:r>
+                </w:p>
+              </w:tc>
+              <w:tc>
+                <w:tcPr/>
+                <w:p>
+                  <w:pPr>
+                    <w:pStyle w:val="Compact"/>
+                    <w:jc w:val="left"/>
+                    <w:jc w:val="left"/>
+                  </w:pPr>
+                  <w:r>
+                    <w:t xml:space="preserve">2</w:t>
+                  </w:r>
+                </w:p>
+              </w:tc>
+              <w:tc>
+                <w:tcPr/>
+                <w:p>
+                  <w:pPr>
+                    <w:pStyle w:val="Compact"/>
+                    <w:jc w:val="left"/>
+                    <w:jc w:val="left"/>
+                  </w:pPr>
+                  <w:r>
+                    <w:t xml:space="preserve">No date_bp_max_min</w:t>
+                  </w:r>
+                </w:p>
+              </w:tc>
+            </w:tr>
+            <w:tr>
+              <w:tc>
+                <w:tcPr/>
+                <w:p>
+                  <w:pPr>
+                    <w:pStyle w:val="Compact"/>
+                    <w:jc w:val="left"/>
+                    <w:jc w:val="left"/>
+                  </w:pPr>
+                  <w:r>
+                    <w:t xml:space="preserve">Le Terme Pialat</w:t>
+                  </w:r>
+                </w:p>
+              </w:tc>
+              <w:tc>
+                <w:tcPr/>
+                <w:p>
+                  <w:pPr>
+                    <w:pStyle w:val="Compact"/>
+                    <w:jc w:val="left"/>
+                    <w:jc w:val="left"/>
+                  </w:pPr>
+                  <w:r>
+                    <w:t xml:space="preserve">B</w:t>
+                  </w:r>
+                </w:p>
+              </w:tc>
+              <w:tc>
+                <w:tcPr/>
+                <w:p>
+                  <w:pPr>
+                    <w:pStyle w:val="Compact"/>
+                    <w:jc w:val="left"/>
+                    <w:jc w:val="left"/>
+                  </w:pPr>
+                  <w:r>
+                    <w:t xml:space="preserve">1</w:t>
+                  </w:r>
+                </w:p>
+              </w:tc>
+              <w:tc>
+                <w:tcPr/>
+                <w:p>
+                  <w:pPr>
+                    <w:pStyle w:val="Compact"/>
+                    <w:jc w:val="left"/>
+                    <w:jc w:val="left"/>
+                  </w:pPr>
+                  <w:r>
+                    <w:t xml:space="preserve">1</w:t>
+                  </w:r>
+                </w:p>
+              </w:tc>
+              <w:tc>
+                <w:tcPr/>
+                <w:p>
+                  <w:pPr>
+                    <w:pStyle w:val="Compact"/>
+                    <w:jc w:val="left"/>
+                    <w:jc w:val="left"/>
+                  </w:pPr>
+                  <w:r>
+                    <w:t xml:space="preserve">No date_bp_max_min</w:t>
+                  </w:r>
+                </w:p>
+              </w:tc>
+            </w:tr>
+            <w:tr>
+              <w:tc>
+                <w:tcPr/>
+                <w:p>
+                  <w:pPr>
+                    <w:pStyle w:val="Compact"/>
+                    <w:jc w:val="left"/>
+                    <w:jc w:val="left"/>
+                  </w:pPr>
+                  <w:r>
+                    <w:t xml:space="preserve">Lhotka</w:t>
+                  </w:r>
+                </w:p>
+              </w:tc>
+              <w:tc>
+                <w:tcPr/>
+                <w:p>
+                  <w:pPr>
+                    <w:pStyle w:val="Compact"/>
+                    <w:jc w:val="left"/>
+                    <w:jc w:val="left"/>
+                  </w:pPr>
+                  <w:r>
+                    <w:t xml:space="preserve">B</w:t>
+                  </w:r>
+                </w:p>
+              </w:tc>
+              <w:tc>
+                <w:tcPr/>
+                <w:p>
+                  <w:pPr>
+                    <w:pStyle w:val="Compact"/>
+                    <w:jc w:val="left"/>
+                    <w:jc w:val="left"/>
+                  </w:pPr>
+                  <w:r>
+                    <w:t xml:space="preserve">1</w:t>
+                  </w:r>
+                </w:p>
+              </w:tc>
+              <w:tc>
+                <w:tcPr/>
+                <w:p>
+                  <w:pPr>
+                    <w:pStyle w:val="Compact"/>
+                    <w:jc w:val="left"/>
+                    <w:jc w:val="left"/>
+                  </w:pPr>
+                  <w:r>
+                    <w:t xml:space="preserve">1</w:t>
+                  </w:r>
+                </w:p>
+              </w:tc>
+              <w:tc>
+                <w:tcPr/>
+                <w:p>
+                  <w:pPr>
+                    <w:pStyle w:val="Compact"/>
+                    <w:jc w:val="left"/>
+                    <w:jc w:val="left"/>
+                  </w:pPr>
+                  <w:r>
+                    <w:t xml:space="preserve">No date_bp_max_min</w:t>
+                  </w:r>
+                </w:p>
+              </w:tc>
+            </w:tr>
+            <w:tr>
+              <w:tc>
+                <w:tcPr/>
+                <w:p>
+                  <w:pPr>
+                    <w:pStyle w:val="Compact"/>
+                    <w:jc w:val="left"/>
+                    <w:jc w:val="left"/>
+                  </w:pPr>
+                  <w:r>
+                    <w:t xml:space="preserve">Menton/Grottes du Grimaldi</w:t>
+                  </w:r>
+                </w:p>
+              </w:tc>
+              <w:tc>
+                <w:tcPr/>
+                <w:p>
+                  <w:pPr>
+                    <w:pStyle w:val="Compact"/>
+                    <w:jc w:val="left"/>
+                    <w:jc w:val="left"/>
+                  </w:pPr>
+                  <w:r>
+                    <w:t xml:space="preserve">B</w:t>
+                  </w:r>
+                </w:p>
+              </w:tc>
+              <w:tc>
+                <w:tcPr/>
+                <w:p>
+                  <w:pPr>
+                    <w:pStyle w:val="Compact"/>
+                    <w:jc w:val="left"/>
+                    <w:jc w:val="left"/>
+                  </w:pPr>
+                  <w:r>
+                    <w:t xml:space="preserve">3</w:t>
+                  </w:r>
+                </w:p>
+              </w:tc>
+              <w:tc>
+                <w:tcPr/>
+                <w:p>
+                  <w:pPr>
+                    <w:pStyle w:val="Compact"/>
+                    <w:jc w:val="left"/>
+                    <w:jc w:val="left"/>
+                  </w:pPr>
+                  <w:r>
+                    <w:t xml:space="preserve">2</w:t>
+                  </w:r>
+                </w:p>
+              </w:tc>
+              <w:tc>
+                <w:tcPr/>
+                <w:p>
+                  <w:pPr>
+                    <w:pStyle w:val="Compact"/>
+                    <w:jc w:val="left"/>
+                    <w:jc w:val="left"/>
+                  </w:pPr>
+                  <w:r>
+                    <w:t xml:space="preserve">No date_bp_max_min</w:t>
+                  </w:r>
+                </w:p>
+              </w:tc>
+            </w:tr>
+            <w:tr>
+              <w:tc>
+                <w:tcPr/>
+                <w:p>
+                  <w:pPr>
+                    <w:pStyle w:val="Compact"/>
+                    <w:jc w:val="left"/>
+                    <w:jc w:val="left"/>
+                  </w:pPr>
+                  <w:r>
+                    <w:t xml:space="preserve">Nová Dědina</w:t>
+                  </w:r>
+                </w:p>
+              </w:tc>
+              <w:tc>
+                <w:tcPr/>
+                <w:p>
+                  <w:pPr>
+                    <w:pStyle w:val="Compact"/>
+                    <w:jc w:val="left"/>
+                    <w:jc w:val="left"/>
+                  </w:pPr>
+                  <w:r>
+                    <w:t xml:space="preserve">B</w:t>
+                  </w:r>
+                </w:p>
+              </w:tc>
+              <w:tc>
+                <w:tcPr/>
+                <w:p>
+                  <w:pPr>
+                    <w:pStyle w:val="Compact"/>
+                    <w:jc w:val="left"/>
+                    <w:jc w:val="left"/>
+                  </w:pPr>
+                  <w:r>
+                    <w:t xml:space="preserve">4</w:t>
+                  </w:r>
+                </w:p>
+              </w:tc>
+              <w:tc>
+                <w:tcPr/>
+                <w:p>
+                  <w:pPr>
+                    <w:pStyle w:val="Compact"/>
+                    <w:jc w:val="left"/>
+                    <w:jc w:val="left"/>
+                  </w:pPr>
+                  <w:r>
+                    <w:t xml:space="preserve">3</w:t>
+                  </w:r>
+                </w:p>
+              </w:tc>
+              <w:tc>
+                <w:tcPr/>
+                <w:p>
+                  <w:pPr>
+                    <w:pStyle w:val="Compact"/>
+                    <w:jc w:val="left"/>
+                    <w:jc w:val="left"/>
+                  </w:pPr>
+                  <w:r>
+                    <w:t xml:space="preserve">No date_bp_max_min</w:t>
+                  </w:r>
+                </w:p>
+              </w:tc>
+            </w:tr>
+            <w:tr>
+              <w:tc>
+                <w:tcPr/>
+                <w:p>
+                  <w:pPr>
+                    <w:pStyle w:val="Compact"/>
+                    <w:jc w:val="left"/>
+                    <w:jc w:val="left"/>
+                  </w:pPr>
+                  <w:r>
+                    <w:t xml:space="preserve">Otaslavice</w:t>
+                  </w:r>
+                </w:p>
+              </w:tc>
+              <w:tc>
+                <w:tcPr/>
+                <w:p>
+                  <w:pPr>
+                    <w:pStyle w:val="Compact"/>
+                    <w:jc w:val="left"/>
+                    <w:jc w:val="left"/>
+                  </w:pPr>
+                  <w:r>
+                    <w:t xml:space="preserve">B</w:t>
+                  </w:r>
+                </w:p>
+              </w:tc>
+              <w:tc>
+                <w:tcPr/>
+                <w:p>
+                  <w:pPr>
+                    <w:pStyle w:val="Compact"/>
+                    <w:jc w:val="left"/>
+                    <w:jc w:val="left"/>
+                  </w:pPr>
+                  <w:r>
+                    <w:t xml:space="preserve">1</w:t>
+                  </w:r>
+                </w:p>
+              </w:tc>
+              <w:tc>
+                <w:tcPr/>
+                <w:p>
+                  <w:pPr>
+                    <w:pStyle w:val="Compact"/>
+                    <w:jc w:val="left"/>
+                    <w:jc w:val="left"/>
+                  </w:pPr>
+                  <w:r>
+                    <w:t xml:space="preserve">1</w:t>
+                  </w:r>
+                </w:p>
+              </w:tc>
+              <w:tc>
+                <w:tcPr/>
+                <w:p>
+                  <w:pPr>
+                    <w:pStyle w:val="Compact"/>
+                    <w:jc w:val="left"/>
+                    <w:jc w:val="left"/>
+                  </w:pPr>
+                  <w:r>
+                    <w:t xml:space="preserve">No date_bp_max_min</w:t>
+                  </w:r>
+                </w:p>
+              </w:tc>
+            </w:tr>
+            <w:tr>
+              <w:tc>
+                <w:tcPr/>
+                <w:p>
+                  <w:pPr>
+                    <w:pStyle w:val="Compact"/>
+                    <w:jc w:val="left"/>
+                    <w:jc w:val="left"/>
+                  </w:pPr>
+                  <w:r>
+                    <w:t xml:space="preserve">Slatinice</w:t>
+                  </w:r>
+                </w:p>
+              </w:tc>
+              <w:tc>
+                <w:tcPr/>
+                <w:p>
+                  <w:pPr>
+                    <w:pStyle w:val="Compact"/>
+                    <w:jc w:val="left"/>
+                    <w:jc w:val="left"/>
+                  </w:pPr>
+                  <w:r>
+                    <w:t xml:space="preserve">B</w:t>
+                  </w:r>
+                </w:p>
+              </w:tc>
+              <w:tc>
+                <w:tcPr/>
+                <w:p>
+                  <w:pPr>
+                    <w:pStyle w:val="Compact"/>
+                    <w:jc w:val="left"/>
+                    <w:jc w:val="left"/>
+                  </w:pPr>
+                  <w:r>
+                    <w:t xml:space="preserve">1</w:t>
+                  </w:r>
+                </w:p>
+              </w:tc>
+              <w:tc>
+                <w:tcPr/>
+                <w:p>
+                  <w:pPr>
+                    <w:pStyle w:val="Compact"/>
+                    <w:jc w:val="left"/>
+                    <w:jc w:val="left"/>
+                  </w:pPr>
+                  <w:r>
+                    <w:t xml:space="preserve">1</w:t>
+                  </w:r>
+                </w:p>
+              </w:tc>
+              <w:tc>
+                <w:tcPr/>
+                <w:p>
+                  <w:pPr>
+                    <w:pStyle w:val="Compact"/>
+                    <w:jc w:val="left"/>
+                    <w:jc w:val="left"/>
+                  </w:pPr>
+                  <w:r>
+                    <w:t xml:space="preserve">No date_bp_max_min</w:t>
+                  </w:r>
+                </w:p>
+              </w:tc>
+            </w:tr>
+            <w:tr>
+              <w:tc>
+                <w:tcPr/>
+                <w:p>
+                  <w:pPr>
+                    <w:pStyle w:val="Compact"/>
+                    <w:jc w:val="left"/>
+                    <w:jc w:val="left"/>
+                  </w:pPr>
+                  <w:r>
+                    <w:t xml:space="preserve">d’Engihoul</w:t>
+                  </w:r>
+                </w:p>
+              </w:tc>
+              <w:tc>
+                <w:tcPr/>
+                <w:p>
+                  <w:pPr>
+                    <w:pStyle w:val="Compact"/>
+                    <w:jc w:val="left"/>
+                    <w:jc w:val="left"/>
+                  </w:pPr>
+                  <w:r>
+                    <w:t xml:space="preserve">B</w:t>
+                  </w:r>
+                </w:p>
+              </w:tc>
+              <w:tc>
+                <w:tcPr/>
+                <w:p>
+                  <w:pPr>
+                    <w:pStyle w:val="Compact"/>
+                    <w:jc w:val="left"/>
+                    <w:jc w:val="left"/>
+                  </w:pPr>
+                  <w:r>
+                    <w:t xml:space="preserve">1</w:t>
+                  </w:r>
+                </w:p>
+              </w:tc>
+              <w:tc>
+                <w:tcPr/>
+                <w:p>
+                  <w:pPr>
+                    <w:pStyle w:val="Compact"/>
+                    <w:jc w:val="left"/>
+                    <w:jc w:val="left"/>
+                  </w:pPr>
+                  <w:r>
+                    <w:t xml:space="preserve">1</w:t>
+                  </w:r>
+                </w:p>
+              </w:tc>
+              <w:tc>
+                <w:tcPr/>
+                <w:p>
+                  <w:pPr>
+                    <w:pStyle w:val="Compact"/>
+                    <w:jc w:val="left"/>
+                    <w:jc w:val="left"/>
+                  </w:pPr>
+                  <w:r>
+                    <w:t xml:space="preserve">No date_bp_max_min</w:t>
+                  </w:r>
+                </w:p>
+              </w:tc>
+            </w:tr>
+            <w:tr>
+              <w:tc>
+                <w:tcPr/>
+                <w:p>
+                  <w:pPr>
+                    <w:pStyle w:val="Compact"/>
+                    <w:jc w:val="left"/>
+                    <w:jc w:val="left"/>
+                  </w:pPr>
+                  <w:r>
+                    <w:t xml:space="preserve">Žlutava</w:t>
+                  </w:r>
+                </w:p>
+              </w:tc>
+              <w:tc>
+                <w:tcPr/>
+                <w:p>
+                  <w:pPr>
+                    <w:pStyle w:val="Compact"/>
+                    <w:jc w:val="left"/>
+                    <w:jc w:val="left"/>
+                  </w:pPr>
+                  <w:r>
+                    <w:t xml:space="preserve">B</w:t>
+                  </w:r>
+                </w:p>
+              </w:tc>
+              <w:tc>
+                <w:tcPr/>
+                <w:p>
+                  <w:pPr>
+                    <w:pStyle w:val="Compact"/>
+                    <w:jc w:val="left"/>
+                    <w:jc w:val="left"/>
+                  </w:pPr>
+                  <w:r>
+                    <w:t xml:space="preserve">3</w:t>
+                  </w:r>
+                </w:p>
+              </w:tc>
+              <w:tc>
+                <w:tcPr/>
+                <w:p>
+                  <w:pPr>
+                    <w:pStyle w:val="Compact"/>
+                    <w:jc w:val="left"/>
+                    <w:jc w:val="left"/>
+                  </w:pPr>
+                  <w:r>
+                    <w:t xml:space="preserve">3</w:t>
+                  </w:r>
+                </w:p>
+              </w:tc>
+              <w:tc>
+                <w:tcPr/>
+                <w:p>
+                  <w:pPr>
+                    <w:pStyle w:val="Compact"/>
+                    <w:jc w:val="left"/>
+                    <w:jc w:val="left"/>
+                  </w:pPr>
+                  <w:r>
+                    <w:t xml:space="preserve">No date_bp_max_min</w:t>
+                  </w:r>
+                </w:p>
+              </w:tc>
+            </w:tr>
+            <w:tr>
+              <w:tc>
+                <w:tcPr/>
+                <w:p>
+                  <w:pPr>
+                    <w:pStyle w:val="Compact"/>
+                    <w:jc w:val="left"/>
+                    <w:jc w:val="left"/>
+                  </w:pPr>
+                  <w:r>
+                    <w:t xml:space="preserve">Brassempouy</w:t>
+                  </w:r>
+                </w:p>
+              </w:tc>
+              <w:tc>
+                <w:tcPr/>
+                <w:p>
+                  <w:pPr>
+                    <w:pStyle w:val="Compact"/>
+                    <w:jc w:val="left"/>
+                    <w:jc w:val="left"/>
+                  </w:pPr>
+                  <w:r>
+                    <w:t xml:space="preserve">C</w:t>
+                  </w:r>
+                </w:p>
+              </w:tc>
+              <w:tc>
+                <w:tcPr/>
+                <w:p>
+                  <w:pPr>
+                    <w:pStyle w:val="Compact"/>
+                    <w:jc w:val="left"/>
+                    <w:jc w:val="left"/>
+                  </w:pPr>
+                  <w:r>
+                    <w:t xml:space="preserve">3</w:t>
+                  </w:r>
+                </w:p>
+              </w:tc>
+              <w:tc>
+                <w:tcPr/>
+                <w:p>
+                  <w:pPr>
+                    <w:pStyle w:val="Compact"/>
+                    <w:jc w:val="left"/>
+                    <w:jc w:val="left"/>
+                  </w:pPr>
+                  <w:r>
+                    <w:t xml:space="preserve">3</w:t>
+                  </w:r>
+                </w:p>
+              </w:tc>
+              <w:tc>
+                <w:tcPr/>
+                <w:p>
+                  <w:pPr>
+                    <w:pStyle w:val="Compact"/>
+                    <w:jc w:val="left"/>
+                    <w:jc w:val="left"/>
+                  </w:pPr>
+                  <w:r>
+                    <w:t xml:space="preserve">Date string</w:t>
+                  </w:r>
+                  <w:r>
+                    <w:t xml:space="preserve"> </w:t>
+                  </w:r>
+                  <w:r>
+                    <w:t xml:space="preserve">‘</w:t>
+                  </w:r>
+                  <w:r>
+                    <w:t xml:space="preserve">34000 - 30000</w:t>
+                  </w:r>
+                  <w:r>
+                    <w:t xml:space="preserve">’</w:t>
+                  </w:r>
+                  <w:r>
+                    <w:t xml:space="preserve"> </w:t>
+                  </w:r>
+                  <w:r>
+                    <w:t xml:space="preserve">(C14) has no ± error</w:t>
+                  </w:r>
+                </w:p>
+              </w:tc>
+            </w:tr>
+            <w:tr>
+              <w:tc>
+                <w:tcPr/>
+                <w:p>
+                  <w:pPr>
+                    <w:pStyle w:val="Compact"/>
+                    <w:jc w:val="left"/>
+                    <w:jc w:val="left"/>
+                  </w:pPr>
+                  <w:r>
+                    <w:t xml:space="preserve">Breitenbach</w:t>
+                  </w:r>
+                </w:p>
+              </w:tc>
+              <w:tc>
+                <w:tcPr/>
+                <w:p>
+                  <w:pPr>
+                    <w:pStyle w:val="Compact"/>
+                    <w:jc w:val="left"/>
+                    <w:jc w:val="left"/>
+                  </w:pPr>
+                  <w:r>
+                    <w:t xml:space="preserve">C</w:t>
+                  </w:r>
+                </w:p>
+              </w:tc>
+              <w:tc>
+                <w:tcPr/>
+                <w:p>
+                  <w:pPr>
+                    <w:pStyle w:val="Compact"/>
+                    <w:jc w:val="left"/>
+                    <w:jc w:val="left"/>
+                  </w:pPr>
+                  <w:r>
+                    <w:t xml:space="preserve">1</w:t>
+                  </w:r>
+                </w:p>
+              </w:tc>
+              <w:tc>
+                <w:tcPr/>
+                <w:p>
+                  <w:pPr>
+                    <w:pStyle w:val="Compact"/>
+                    <w:jc w:val="left"/>
+                    <w:jc w:val="left"/>
+                  </w:pPr>
+                  <w:r>
+                    <w:t xml:space="preserve">1</w:t>
+                  </w:r>
+                </w:p>
+              </w:tc>
+              <w:tc>
+                <w:tcPr/>
+                <w:p>
+                  <w:pPr>
+                    <w:pStyle w:val="Compact"/>
+                    <w:jc w:val="left"/>
+                    <w:jc w:val="left"/>
+                  </w:pPr>
+                  <w:r>
+                    <w:t xml:space="preserve">Date string</w:t>
+                  </w:r>
+                  <w:r>
+                    <w:t xml:space="preserve"> </w:t>
+                  </w:r>
+                  <w:r>
+                    <w:t xml:space="preserve">‘</w:t>
+                  </w:r>
+                  <w:r>
+                    <w:t xml:space="preserve">30000 - 27000; 26000 - 28 000 BP</w:t>
+                  </w:r>
+                  <w:r>
+                    <w:t xml:space="preserve">’</w:t>
+                  </w:r>
+                  <w:r>
+                    <w:t xml:space="preserve"> </w:t>
+                  </w:r>
+                  <w:r>
+                    <w:t xml:space="preserve">(C14) has no ± error</w:t>
+                  </w:r>
+                </w:p>
+              </w:tc>
+            </w:tr>
+            <w:tr>
+              <w:tc>
+                <w:tcPr/>
+                <w:p>
+                  <w:pPr>
+                    <w:pStyle w:val="Compact"/>
+                    <w:jc w:val="left"/>
+                    <w:jc w:val="left"/>
+                  </w:pPr>
+                  <w:r>
+                    <w:t xml:space="preserve">Grotte de Goyet</w:t>
+                  </w:r>
+                </w:p>
+              </w:tc>
+              <w:tc>
+                <w:tcPr/>
+                <w:p>
+                  <w:pPr>
+                    <w:pStyle w:val="Compact"/>
+                    <w:jc w:val="left"/>
+                    <w:jc w:val="left"/>
+                  </w:pPr>
+                  <w:r>
+                    <w:t xml:space="preserve">C</w:t>
+                  </w:r>
+                </w:p>
+              </w:tc>
+              <w:tc>
+                <w:tcPr/>
+                <w:p>
+                  <w:pPr>
+                    <w:pStyle w:val="Compact"/>
+                    <w:jc w:val="left"/>
+                    <w:jc w:val="left"/>
+                  </w:pPr>
+                  <w:r>
+                    <w:t xml:space="preserve">13</w:t>
+                  </w:r>
+                </w:p>
+              </w:tc>
+              <w:tc>
+                <w:tcPr/>
+                <w:p>
+                  <w:pPr>
+                    <w:pStyle w:val="Compact"/>
+                    <w:jc w:val="left"/>
+                    <w:jc w:val="left"/>
+                  </w:pPr>
+                  <w:r>
+                    <w:t xml:space="preserve">12</w:t>
+                  </w:r>
+                </w:p>
+              </w:tc>
+              <w:tc>
+                <w:tcPr/>
+                <w:p>
+                  <w:pPr>
+                    <w:pStyle w:val="Compact"/>
+                    <w:jc w:val="left"/>
+                    <w:jc w:val="left"/>
+                  </w:pPr>
+                  <w:r>
+                    <w:t xml:space="preserve">Date string</w:t>
+                  </w:r>
+                  <w:r>
+                    <w:t xml:space="preserve"> </w:t>
+                  </w:r>
+                  <w:r>
+                    <w:t xml:space="preserve">‘</w:t>
+                  </w:r>
+                  <w:r>
+                    <w:t xml:space="preserve">35160 - 33140</w:t>
+                  </w:r>
+                  <w:r>
+                    <w:t xml:space="preserve">’</w:t>
+                  </w:r>
+                  <w:r>
+                    <w:t xml:space="preserve"> </w:t>
+                  </w:r>
+                  <w:r>
+                    <w:t xml:space="preserve">(C14) has no ± error</w:t>
+                  </w:r>
+                </w:p>
+              </w:tc>
+            </w:tr>
+            <w:tr>
+              <w:tc>
+                <w:tcPr/>
+                <w:p>
+                  <w:pPr>
+                    <w:pStyle w:val="Compact"/>
+                    <w:jc w:val="left"/>
+                    <w:jc w:val="left"/>
+                  </w:pPr>
+                  <w:r>
+                    <w:t xml:space="preserve">Hornos de la Pena</w:t>
+                  </w:r>
+                </w:p>
+              </w:tc>
+              <w:tc>
+                <w:tcPr/>
+                <w:p>
+                  <w:pPr>
+                    <w:pStyle w:val="Compact"/>
+                    <w:jc w:val="left"/>
+                    <w:jc w:val="left"/>
+                  </w:pPr>
+                  <w:r>
+                    <w:t xml:space="preserve">C</w:t>
+                  </w:r>
+                </w:p>
+              </w:tc>
+              <w:tc>
+                <w:tcPr/>
+                <w:p>
+                  <w:pPr>
+                    <w:pStyle w:val="Compact"/>
+                    <w:jc w:val="left"/>
+                    <w:jc w:val="left"/>
+                  </w:pPr>
+                  <w:r>
+                    <w:t xml:space="preserve">1</w:t>
+                  </w:r>
+                </w:p>
+              </w:tc>
+              <w:tc>
+                <w:tcPr/>
+                <w:p>
+                  <w:pPr>
+                    <w:pStyle w:val="Compact"/>
+                    <w:jc w:val="left"/>
+                    <w:jc w:val="left"/>
+                  </w:pPr>
+                  <w:r>
+                    <w:t xml:space="preserve">1</w:t>
+                  </w:r>
+                </w:p>
+              </w:tc>
+              <w:tc>
+                <w:tcPr/>
+                <w:p>
+                  <w:pPr>
+                    <w:pStyle w:val="Compact"/>
+                    <w:jc w:val="left"/>
+                    <w:jc w:val="left"/>
+                  </w:pPr>
+                  <w:r>
+                    <w:t xml:space="preserve">Date string</w:t>
+                  </w:r>
+                  <w:r>
+                    <w:t xml:space="preserve"> </w:t>
+                  </w:r>
+                  <w:r>
+                    <w:t xml:space="preserve">‘</w:t>
+                  </w:r>
+                  <w:r>
+                    <w:t xml:space="preserve">34000 - 30000</w:t>
+                  </w:r>
+                  <w:r>
+                    <w:t xml:space="preserve">’</w:t>
+                  </w:r>
+                  <w:r>
+                    <w:t xml:space="preserve"> </w:t>
+                  </w:r>
+                  <w:r>
+                    <w:t xml:space="preserve">(C14) has no ± error</w:t>
+                  </w:r>
+                </w:p>
+              </w:tc>
+            </w:tr>
+            <w:tr>
+              <w:tc>
+                <w:tcPr/>
+                <w:p>
+                  <w:pPr>
+                    <w:pStyle w:val="Compact"/>
+                    <w:jc w:val="left"/>
+                    <w:jc w:val="left"/>
+                  </w:pPr>
+                  <w:r>
+                    <w:t xml:space="preserve">Istállóskő Cave</w:t>
+                  </w:r>
+                </w:p>
+              </w:tc>
+              <w:tc>
+                <w:tcPr/>
+                <w:p>
+                  <w:pPr>
+                    <w:pStyle w:val="Compact"/>
+                    <w:jc w:val="left"/>
+                    <w:jc w:val="left"/>
+                  </w:pPr>
+                  <w:r>
+                    <w:t xml:space="preserve">C</w:t>
+                  </w:r>
+                </w:p>
+              </w:tc>
+              <w:tc>
+                <w:tcPr/>
+                <w:p>
+                  <w:pPr>
+                    <w:pStyle w:val="Compact"/>
+                    <w:jc w:val="left"/>
+                    <w:jc w:val="left"/>
+                  </w:pPr>
+                  <w:r>
+                    <w:t xml:space="preserve">3</w:t>
+                  </w:r>
+                </w:p>
+              </w:tc>
+              <w:tc>
+                <w:tcPr/>
+                <w:p>
+                  <w:pPr>
+                    <w:pStyle w:val="Compact"/>
+                    <w:jc w:val="left"/>
+                    <w:jc w:val="left"/>
+                  </w:pPr>
+                  <w:r>
+                    <w:t xml:space="preserve">3</w:t>
+                  </w:r>
+                </w:p>
+              </w:tc>
+              <w:tc>
+                <w:tcPr/>
+                <w:p>
+                  <w:pPr>
+                    <w:pStyle w:val="Compact"/>
+                    <w:jc w:val="left"/>
+                    <w:jc w:val="left"/>
+                  </w:pPr>
+                  <w:r>
+                    <w:t xml:space="preserve">Date string</w:t>
+                  </w:r>
+                  <w:r>
+                    <w:t xml:space="preserve"> </w:t>
+                  </w:r>
+                  <w:r>
+                    <w:t xml:space="preserve">‘</w:t>
+                  </w:r>
+                  <w:r>
+                    <w:t xml:space="preserve">35000 - 32000</w:t>
+                  </w:r>
+                  <w:r>
+                    <w:t xml:space="preserve">’</w:t>
+                  </w:r>
+                  <w:r>
+                    <w:t xml:space="preserve"> </w:t>
+                  </w:r>
+                  <w:r>
+                    <w:t xml:space="preserve">(AMS) has no ± error</w:t>
+                  </w:r>
+                </w:p>
+              </w:tc>
+            </w:tr>
+            <w:tr>
+              <w:tc>
+                <w:tcPr/>
+                <w:p>
+                  <w:pPr>
+                    <w:pStyle w:val="Compact"/>
+                    <w:jc w:val="left"/>
+                    <w:jc w:val="left"/>
+                  </w:pPr>
+                  <w:r>
+                    <w:t xml:space="preserve">Le Trou Du Renard</w:t>
+                  </w:r>
+                </w:p>
+              </w:tc>
+              <w:tc>
+                <w:tcPr/>
+                <w:p>
+                  <w:pPr>
+                    <w:pStyle w:val="Compact"/>
+                    <w:jc w:val="left"/>
+                    <w:jc w:val="left"/>
+                  </w:pPr>
+                  <w:r>
+                    <w:t xml:space="preserve">C</w:t>
+                  </w:r>
+                </w:p>
+              </w:tc>
+              <w:tc>
+                <w:tcPr/>
+                <w:p>
+                  <w:pPr>
+                    <w:pStyle w:val="Compact"/>
+                    <w:jc w:val="left"/>
+                    <w:jc w:val="left"/>
+                  </w:pPr>
+                  <w:r>
+                    <w:t xml:space="preserve">2</w:t>
+                  </w:r>
+                </w:p>
+              </w:tc>
+              <w:tc>
+                <w:tcPr/>
+                <w:p>
+                  <w:pPr>
+                    <w:pStyle w:val="Compact"/>
+                    <w:jc w:val="left"/>
+                    <w:jc w:val="left"/>
+                  </w:pPr>
+                  <w:r>
+                    <w:t xml:space="preserve">2</w:t>
+                  </w:r>
+                </w:p>
+              </w:tc>
+              <w:tc>
+                <w:tcPr/>
+                <w:p>
+                  <w:pPr>
+                    <w:pStyle w:val="Compact"/>
+                    <w:jc w:val="left"/>
+                    <w:jc w:val="left"/>
+                  </w:pPr>
+                  <w:r>
+                    <w:t xml:space="preserve">Date string</w:t>
+                  </w:r>
+                  <w:r>
+                    <w:t xml:space="preserve"> </w:t>
+                  </w:r>
+                  <w:r>
+                    <w:t xml:space="preserve">‘</w:t>
+                  </w:r>
+                  <w:r>
+                    <w:t xml:space="preserve">33000 - 32000</w:t>
+                  </w:r>
+                  <w:r>
+                    <w:t xml:space="preserve">’</w:t>
+                  </w:r>
+                  <w:r>
+                    <w:t xml:space="preserve"> </w:t>
+                  </w:r>
+                  <w:r>
+                    <w:t xml:space="preserve">(C14) has no ± error</w:t>
+                  </w:r>
+                </w:p>
+              </w:tc>
+            </w:tr>
+            <w:tr>
+              <w:tc>
+                <w:tcPr/>
+                <w:p>
+                  <w:pPr>
+                    <w:pStyle w:val="Compact"/>
+                    <w:jc w:val="left"/>
+                    <w:jc w:val="left"/>
+                  </w:pPr>
+                  <w:r>
+                    <w:t xml:space="preserve">Maisières-Canal</w:t>
+                  </w:r>
+                </w:p>
+              </w:tc>
+              <w:tc>
+                <w:tcPr/>
+                <w:p>
+                  <w:pPr>
+                    <w:pStyle w:val="Compact"/>
+                    <w:jc w:val="left"/>
+                    <w:jc w:val="left"/>
+                  </w:pPr>
+                  <w:r>
+                    <w:t xml:space="preserve">C</w:t>
+                  </w:r>
+                </w:p>
+              </w:tc>
+              <w:tc>
+                <w:tcPr/>
+                <w:p>
+                  <w:pPr>
+                    <w:pStyle w:val="Compact"/>
+                    <w:jc w:val="left"/>
+                    <w:jc w:val="left"/>
+                  </w:pPr>
+                  <w:r>
+                    <w:t xml:space="preserve">7</w:t>
+                  </w:r>
+                </w:p>
+              </w:tc>
+              <w:tc>
+                <w:tcPr/>
+                <w:p>
+                  <w:pPr>
+                    <w:pStyle w:val="Compact"/>
+                    <w:jc w:val="left"/>
+                    <w:jc w:val="left"/>
+                  </w:pPr>
+                  <w:r>
                     <w:t xml:space="preserve">5</w:t>
                   </w:r>
                 </w:p>
@@ -5921,35 +7506,223 @@
                     <w:jc w:val="left"/>
                   </w:pPr>
                   <w:r>
-                    <w:t xml:space="preserve">No date_bp_max_min; signed objects from deep Dordogne Late Aurignacian context</w:t>
-                  </w:r>
-                </w:p>
-              </w:tc>
-            </w:tr>
-            <w:tr>
-              <w:tc>
-                <w:tcPr/>
-                <w:p>
-                  <w:pPr>
-                    <w:pStyle w:val="Compact"/>
-                    <w:jc w:val="left"/>
-                    <w:jc w:val="left"/>
-                  </w:pPr>
-                  <w:r>
-                    <w:t xml:space="preserve">Abri Lartet/Gorge d’Enfer</w:t>
-                  </w:r>
-                </w:p>
-              </w:tc>
-              <w:tc>
-                <w:tcPr/>
-                <w:p>
-                  <w:pPr>
-                    <w:pStyle w:val="Compact"/>
-                    <w:jc w:val="left"/>
-                    <w:jc w:val="left"/>
-                  </w:pPr>
-                  <w:r>
-                    <w:t xml:space="preserve">B</w:t>
+                    <w:t xml:space="preserve">Date string</w:t>
+                  </w:r>
+                  <w:r>
+                    <w:t xml:space="preserve"> </w:t>
+                  </w:r>
+                  <w:r>
+                    <w:t xml:space="preserve">‘</w:t>
+                  </w:r>
+                  <w:r>
+                    <w:t xml:space="preserve">33000 - 32000</w:t>
+                  </w:r>
+                  <w:r>
+                    <w:t xml:space="preserve">’</w:t>
+                  </w:r>
+                  <w:r>
+                    <w:t xml:space="preserve"> </w:t>
+                  </w:r>
+                  <w:r>
+                    <w:t xml:space="preserve">(C14) has no ± error</w:t>
+                  </w:r>
+                </w:p>
+              </w:tc>
+            </w:tr>
+            <w:tr>
+              <w:tc>
+                <w:tcPr/>
+                <w:p>
+                  <w:pPr>
+                    <w:pStyle w:val="Compact"/>
+                    <w:jc w:val="left"/>
+                    <w:jc w:val="left"/>
+                  </w:pPr>
+                  <w:r>
+                    <w:t xml:space="preserve">Peskő Cave</w:t>
+                  </w:r>
+                </w:p>
+              </w:tc>
+              <w:tc>
+                <w:tcPr/>
+                <w:p>
+                  <w:pPr>
+                    <w:pStyle w:val="Compact"/>
+                    <w:jc w:val="left"/>
+                    <w:jc w:val="left"/>
+                  </w:pPr>
+                  <w:r>
+                    <w:t xml:space="preserve">C</w:t>
+                  </w:r>
+                </w:p>
+              </w:tc>
+              <w:tc>
+                <w:tcPr/>
+                <w:p>
+                  <w:pPr>
+                    <w:pStyle w:val="Compact"/>
+                    <w:jc w:val="left"/>
+                    <w:jc w:val="left"/>
+                  </w:pPr>
+                  <w:r>
+                    <w:t xml:space="preserve">1</w:t>
+                  </w:r>
+                </w:p>
+              </w:tc>
+              <w:tc>
+                <w:tcPr/>
+                <w:p>
+                  <w:pPr>
+                    <w:pStyle w:val="Compact"/>
+                    <w:jc w:val="left"/>
+                    <w:jc w:val="left"/>
+                  </w:pPr>
+                  <w:r>
+                    <w:t xml:space="preserve">1</w:t>
+                  </w:r>
+                </w:p>
+              </w:tc>
+              <w:tc>
+                <w:tcPr/>
+                <w:p>
+                  <w:pPr>
+                    <w:pStyle w:val="Compact"/>
+                    <w:jc w:val="left"/>
+                    <w:jc w:val="left"/>
+                  </w:pPr>
+                  <w:r>
+                    <w:t xml:space="preserve">Date string</w:t>
+                  </w:r>
+                  <w:r>
+                    <w:t xml:space="preserve"> </w:t>
+                  </w:r>
+                  <w:r>
+                    <w:t xml:space="preserve">‘</w:t>
+                  </w:r>
+                  <w:r>
+                    <w:t xml:space="preserve">38300 - 33500</w:t>
+                  </w:r>
+                  <w:r>
+                    <w:t xml:space="preserve">’</w:t>
+                  </w:r>
+                  <w:r>
+                    <w:t xml:space="preserve"> </w:t>
+                  </w:r>
+                  <w:r>
+                    <w:t xml:space="preserve">(AMS) has no ± error</w:t>
+                  </w:r>
+                </w:p>
+              </w:tc>
+            </w:tr>
+            <w:tr>
+              <w:tc>
+                <w:tcPr/>
+                <w:p>
+                  <w:pPr>
+                    <w:pStyle w:val="Compact"/>
+                    <w:jc w:val="left"/>
+                    <w:jc w:val="left"/>
+                  </w:pPr>
+                  <w:r>
+                    <w:t xml:space="preserve">Shelter Birów IV</w:t>
+                  </w:r>
+                </w:p>
+              </w:tc>
+              <w:tc>
+                <w:tcPr/>
+                <w:p>
+                  <w:pPr>
+                    <w:pStyle w:val="Compact"/>
+                    <w:jc w:val="left"/>
+                    <w:jc w:val="left"/>
+                  </w:pPr>
+                  <w:r>
+                    <w:t xml:space="preserve">C</w:t>
+                  </w:r>
+                </w:p>
+              </w:tc>
+              <w:tc>
+                <w:tcPr/>
+                <w:p>
+                  <w:pPr>
+                    <w:pStyle w:val="Compact"/>
+                    <w:jc w:val="left"/>
+                    <w:jc w:val="left"/>
+                  </w:pPr>
+                  <w:r>
+                    <w:t xml:space="preserve">1</w:t>
+                  </w:r>
+                </w:p>
+              </w:tc>
+              <w:tc>
+                <w:tcPr/>
+                <w:p>
+                  <w:pPr>
+                    <w:pStyle w:val="Compact"/>
+                    <w:jc w:val="left"/>
+                    <w:jc w:val="left"/>
+                  </w:pPr>
+                  <w:r>
+                    <w:t xml:space="preserve">1</w:t>
+                  </w:r>
+                </w:p>
+              </w:tc>
+              <w:tc>
+                <w:tcPr/>
+                <w:p>
+                  <w:pPr>
+                    <w:pStyle w:val="Compact"/>
+                    <w:jc w:val="left"/>
+                    <w:jc w:val="left"/>
+                  </w:pPr>
+                  <w:r>
+                    <w:t xml:space="preserve">Date string</w:t>
+                  </w:r>
+                  <w:r>
+                    <w:t xml:space="preserve"> </w:t>
+                  </w:r>
+                  <w:r>
+                    <w:t xml:space="preserve">‘</w:t>
+                  </w:r>
+                  <w:r>
+                    <w:t xml:space="preserve">34000 - 30000</w:t>
+                  </w:r>
+                  <w:r>
+                    <w:t xml:space="preserve">’</w:t>
+                  </w:r>
+                  <w:r>
+                    <w:t xml:space="preserve"> </w:t>
+                  </w:r>
+                  <w:r>
+                    <w:t xml:space="preserve">(C14) has no ± error</w:t>
+                  </w:r>
+                </w:p>
+              </w:tc>
+            </w:tr>
+            <w:tr>
+              <w:tc>
+                <w:tcPr/>
+                <w:p>
+                  <w:pPr>
+                    <w:pStyle w:val="Compact"/>
+                    <w:jc w:val="left"/>
+                    <w:jc w:val="left"/>
+                  </w:pPr>
+                  <w:r>
+                    <w:t xml:space="preserve">Tuto de Camalhot</w:t>
+                  </w:r>
+                </w:p>
+              </w:tc>
+              <w:tc>
+                <w:tcPr/>
+                <w:p>
+                  <w:pPr>
+                    <w:pStyle w:val="Compact"/>
+                    <w:jc w:val="left"/>
+                    <w:jc w:val="left"/>
+                  </w:pPr>
+                  <w:r>
+                    <w:t xml:space="preserve">C</w:t>
                   </w:r>
                 </w:p>
               </w:tc>
@@ -5988,35 +7761,53 @@
                     <w:jc w:val="left"/>
                   </w:pPr>
                   <w:r>
-                    <w:t xml:space="preserve">No date_bp_max_min; multiple Aurignacian levels reported by historical excavations</w:t>
-                  </w:r>
-                </w:p>
-              </w:tc>
-            </w:tr>
-            <w:tr>
-              <w:tc>
-                <w:tcPr/>
-                <w:p>
-                  <w:pPr>
-                    <w:pStyle w:val="Compact"/>
-                    <w:jc w:val="left"/>
-                    <w:jc w:val="left"/>
-                  </w:pPr>
-                  <w:r>
-                    <w:t xml:space="preserve">Abri du Poisson</w:t>
-                  </w:r>
-                </w:p>
-              </w:tc>
-              <w:tc>
-                <w:tcPr/>
-                <w:p>
-                  <w:pPr>
-                    <w:pStyle w:val="Compact"/>
-                    <w:jc w:val="left"/>
-                    <w:jc w:val="left"/>
-                  </w:pPr>
-                  <w:r>
-                    <w:t xml:space="preserve">B</w:t>
+                    <w:t xml:space="preserve">Date string</w:t>
+                  </w:r>
+                  <w:r>
+                    <w:t xml:space="preserve"> </w:t>
+                  </w:r>
+                  <w:r>
+                    <w:t xml:space="preserve">‘</w:t>
+                  </w:r>
+                  <w:r>
+                    <w:t xml:space="preserve">34750</w:t>
+                  </w:r>
+                  <w:r>
+                    <w:t xml:space="preserve">’</w:t>
+                  </w:r>
+                  <w:r>
+                    <w:t xml:space="preserve"> </w:t>
+                  </w:r>
+                  <w:r>
+                    <w:t xml:space="preserve">(C14) has no ± error</w:t>
+                  </w:r>
+                </w:p>
+              </w:tc>
+            </w:tr>
+            <w:tr>
+              <w:tc>
+                <w:tcPr/>
+                <w:p>
+                  <w:pPr>
+                    <w:pStyle w:val="Compact"/>
+                    <w:jc w:val="left"/>
+                    <w:jc w:val="left"/>
+                  </w:pPr>
+                  <w:r>
+                    <w:t xml:space="preserve">Wildscheuer</w:t>
+                  </w:r>
+                </w:p>
+              </w:tc>
+              <w:tc>
+                <w:tcPr/>
+                <w:p>
+                  <w:pPr>
+                    <w:pStyle w:val="Compact"/>
+                    <w:jc w:val="left"/>
+                    <w:jc w:val="left"/>
+                  </w:pPr>
+                  <w:r>
+                    <w:t xml:space="preserve">C</w:t>
                   </w:r>
                 </w:p>
               </w:tc>
@@ -6055,1615 +7846,25 @@
                     <w:jc w:val="left"/>
                   </w:pPr>
                   <w:r>
-                    <w:t xml:space="preserve">No date_bp_max_min; single object from historical excavation</w:t>
-                  </w:r>
-                </w:p>
-              </w:tc>
-            </w:tr>
-            <w:tr>
-              <w:tc>
-                <w:tcPr/>
-                <w:p>
-                  <w:pPr>
-                    <w:pStyle w:val="Compact"/>
-                    <w:jc w:val="left"/>
-                    <w:jc w:val="left"/>
-                  </w:pPr>
-                  <w:r>
-                    <w:t xml:space="preserve">Aurignac</w:t>
-                  </w:r>
-                </w:p>
-              </w:tc>
-              <w:tc>
-                <w:tcPr/>
-                <w:p>
-                  <w:pPr>
-                    <w:pStyle w:val="Compact"/>
-                    <w:jc w:val="left"/>
-                    <w:jc w:val="left"/>
-                  </w:pPr>
-                  <w:r>
-                    <w:t xml:space="preserve">B</w:t>
-                  </w:r>
-                </w:p>
-              </w:tc>
-              <w:tc>
-                <w:tcPr/>
-                <w:p>
-                  <w:pPr>
-                    <w:pStyle w:val="Compact"/>
-                    <w:jc w:val="left"/>
-                    <w:jc w:val="left"/>
-                  </w:pPr>
-                  <w:r>
-                    <w:t xml:space="preserve">1</w:t>
-                  </w:r>
-                </w:p>
-              </w:tc>
-              <w:tc>
-                <w:tcPr/>
-                <w:p>
-                  <w:pPr>
-                    <w:pStyle w:val="Compact"/>
-                    <w:jc w:val="left"/>
-                    <w:jc w:val="left"/>
-                  </w:pPr>
-                  <w:r>
-                    <w:t xml:space="preserve">1</w:t>
-                  </w:r>
-                </w:p>
-              </w:tc>
-              <w:tc>
-                <w:tcPr/>
-                <w:p>
-                  <w:pPr>
-                    <w:pStyle w:val="Compact"/>
-                    <w:jc w:val="left"/>
-                    <w:jc w:val="left"/>
-                  </w:pPr>
-                  <w:r>
-                    <w:t xml:space="preserve">No date_bp_max_min; isolated Italian Early Aurignacian find with no associated dating</w:t>
-                  </w:r>
-                </w:p>
-              </w:tc>
-            </w:tr>
-            <w:tr>
-              <w:tc>
-                <w:tcPr/>
-                <w:p>
-                  <w:pPr>
-                    <w:pStyle w:val="Compact"/>
-                    <w:jc w:val="left"/>
-                    <w:jc w:val="left"/>
-                  </w:pPr>
-                  <w:r>
-                    <w:t xml:space="preserve">d’Engihoul</w:t>
-                  </w:r>
-                </w:p>
-              </w:tc>
-              <w:tc>
-                <w:tcPr/>
-                <w:p>
-                  <w:pPr>
-                    <w:pStyle w:val="Compact"/>
-                    <w:jc w:val="left"/>
-                    <w:jc w:val="left"/>
-                  </w:pPr>
-                  <w:r>
-                    <w:t xml:space="preserve">B</w:t>
-                  </w:r>
-                </w:p>
-              </w:tc>
-              <w:tc>
-                <w:tcPr/>
-                <w:p>
-                  <w:pPr>
-                    <w:pStyle w:val="Compact"/>
-                    <w:jc w:val="left"/>
-                    <w:jc w:val="left"/>
-                  </w:pPr>
-                  <w:r>
-                    <w:t xml:space="preserve">1</w:t>
-                  </w:r>
-                </w:p>
-              </w:tc>
-              <w:tc>
-                <w:tcPr/>
-                <w:p>
-                  <w:pPr>
-                    <w:pStyle w:val="Compact"/>
-                    <w:jc w:val="left"/>
-                    <w:jc w:val="left"/>
-                  </w:pPr>
-                  <w:r>
-                    <w:t xml:space="preserve">1</w:t>
-                  </w:r>
-                </w:p>
-              </w:tc>
-              <w:tc>
-                <w:tcPr/>
-                <w:p>
-                  <w:pPr>
-                    <w:pStyle w:val="Compact"/>
-                    <w:jc w:val="left"/>
-                    <w:jc w:val="left"/>
-                  </w:pPr>
-                  <w:r>
-                    <w:t xml:space="preserve">No date_bp_max_min; Swiss site with published chronology but no SignBase date entry</w:t>
-                  </w:r>
-                </w:p>
-              </w:tc>
-            </w:tr>
-            <w:tr>
-              <w:tc>
-                <w:tcPr/>
-                <w:p>
-                  <w:pPr>
-                    <w:pStyle w:val="Compact"/>
-                    <w:jc w:val="left"/>
-                    <w:jc w:val="left"/>
-                  </w:pPr>
-                  <w:r>
-                    <w:t xml:space="preserve">El Rascaño</w:t>
-                  </w:r>
-                </w:p>
-              </w:tc>
-              <w:tc>
-                <w:tcPr/>
-                <w:p>
-                  <w:pPr>
-                    <w:pStyle w:val="Compact"/>
-                    <w:jc w:val="left"/>
-                    <w:jc w:val="left"/>
-                  </w:pPr>
-                  <w:r>
-                    <w:t xml:space="preserve">B</w:t>
-                  </w:r>
-                </w:p>
-              </w:tc>
-              <w:tc>
-                <w:tcPr/>
-                <w:p>
-                  <w:pPr>
-                    <w:pStyle w:val="Compact"/>
-                    <w:jc w:val="left"/>
-                    <w:jc w:val="left"/>
-                  </w:pPr>
-                  <w:r>
-                    <w:t xml:space="preserve">1</w:t>
-                  </w:r>
-                </w:p>
-              </w:tc>
-              <w:tc>
-                <w:tcPr/>
-                <w:p>
-                  <w:pPr>
-                    <w:pStyle w:val="Compact"/>
-                    <w:jc w:val="left"/>
-                    <w:jc w:val="left"/>
-                  </w:pPr>
-                  <w:r>
-                    <w:t xml:space="preserve">1</w:t>
-                  </w:r>
-                </w:p>
-              </w:tc>
-              <w:tc>
-                <w:tcPr/>
-                <w:p>
-                  <w:pPr>
-                    <w:pStyle w:val="Compact"/>
-                    <w:jc w:val="left"/>
-                    <w:jc w:val="left"/>
-                  </w:pPr>
-                  <w:r>
-                    <w:t xml:space="preserve">No date_bp_max_min</w:t>
-                  </w:r>
-                </w:p>
-              </w:tc>
-            </w:tr>
-            <w:tr>
-              <w:tc>
-                <w:tcPr/>
-                <w:p>
-                  <w:pPr>
-                    <w:pStyle w:val="Compact"/>
-                    <w:jc w:val="left"/>
-                    <w:jc w:val="left"/>
-                  </w:pPr>
-                  <w:r>
-                    <w:t xml:space="preserve">Göpfelsteinhöhle</w:t>
-                  </w:r>
-                </w:p>
-              </w:tc>
-              <w:tc>
-                <w:tcPr/>
-                <w:p>
-                  <w:pPr>
-                    <w:pStyle w:val="Compact"/>
-                    <w:jc w:val="left"/>
-                    <w:jc w:val="left"/>
-                  </w:pPr>
-                  <w:r>
-                    <w:t xml:space="preserve">B</w:t>
-                  </w:r>
-                </w:p>
-              </w:tc>
-              <w:tc>
-                <w:tcPr/>
-                <w:p>
-                  <w:pPr>
-                    <w:pStyle w:val="Compact"/>
-                    <w:jc w:val="left"/>
-                    <w:jc w:val="left"/>
-                  </w:pPr>
-                  <w:r>
-                    <w:t xml:space="preserve">1</w:t>
-                  </w:r>
-                </w:p>
-              </w:tc>
-              <w:tc>
-                <w:tcPr/>
-                <w:p>
-                  <w:pPr>
-                    <w:pStyle w:val="Compact"/>
-                    <w:jc w:val="left"/>
-                    <w:jc w:val="left"/>
-                  </w:pPr>
-                  <w:r>
-                    <w:t xml:space="preserve">1</w:t>
-                  </w:r>
-                </w:p>
-              </w:tc>
-              <w:tc>
-                <w:tcPr/>
-                <w:p>
-                  <w:pPr>
-                    <w:pStyle w:val="Compact"/>
-                    <w:jc w:val="left"/>
-                    <w:jc w:val="left"/>
-                  </w:pPr>
-                  <w:r>
-                    <w:t xml:space="preserve">No date_bp_max_min</w:t>
-                  </w:r>
-                </w:p>
-              </w:tc>
-            </w:tr>
-            <w:tr>
-              <w:tc>
-                <w:tcPr/>
-                <w:p>
-                  <w:pPr>
-                    <w:pStyle w:val="Compact"/>
-                    <w:jc w:val="left"/>
-                    <w:jc w:val="left"/>
-                  </w:pPr>
-                  <w:r>
-                    <w:t xml:space="preserve">Kvasice</w:t>
-                  </w:r>
-                </w:p>
-              </w:tc>
-              <w:tc>
-                <w:tcPr/>
-                <w:p>
-                  <w:pPr>
-                    <w:pStyle w:val="Compact"/>
-                    <w:jc w:val="left"/>
-                    <w:jc w:val="left"/>
-                  </w:pPr>
-                  <w:r>
-                    <w:t xml:space="preserve">B</w:t>
-                  </w:r>
-                </w:p>
-              </w:tc>
-              <w:tc>
-                <w:tcPr/>
-                <w:p>
-                  <w:pPr>
-                    <w:pStyle w:val="Compact"/>
-                    <w:jc w:val="left"/>
-                    <w:jc w:val="left"/>
-                  </w:pPr>
-                  <w:r>
-                    <w:t xml:space="preserve">1</w:t>
-                  </w:r>
-                </w:p>
-              </w:tc>
-              <w:tc>
-                <w:tcPr/>
-                <w:p>
-                  <w:pPr>
-                    <w:pStyle w:val="Compact"/>
-                    <w:jc w:val="left"/>
-                    <w:jc w:val="left"/>
-                  </w:pPr>
-                  <w:r>
-                    <w:t xml:space="preserve">1</w:t>
-                  </w:r>
-                </w:p>
-              </w:tc>
-              <w:tc>
-                <w:tcPr/>
-                <w:p>
-                  <w:pPr>
-                    <w:pStyle w:val="Compact"/>
-                    <w:jc w:val="left"/>
-                    <w:jc w:val="left"/>
-                  </w:pPr>
-                  <w:r>
-                    <w:t xml:space="preserve">No date_bp_max_min</w:t>
-                  </w:r>
-                </w:p>
-              </w:tc>
-            </w:tr>
-            <w:tr>
-              <w:tc>
-                <w:tcPr/>
-                <w:p>
-                  <w:pPr>
-                    <w:pStyle w:val="Compact"/>
-                    <w:jc w:val="left"/>
-                    <w:jc w:val="left"/>
-                  </w:pPr>
-                  <w:r>
-                    <w:t xml:space="preserve">La Souquette</w:t>
-                  </w:r>
-                </w:p>
-              </w:tc>
-              <w:tc>
-                <w:tcPr/>
-                <w:p>
-                  <w:pPr>
-                    <w:pStyle w:val="Compact"/>
-                    <w:jc w:val="left"/>
-                    <w:jc w:val="left"/>
-                  </w:pPr>
-                  <w:r>
-                    <w:t xml:space="preserve">B</w:t>
-                  </w:r>
-                </w:p>
-              </w:tc>
-              <w:tc>
-                <w:tcPr/>
-                <w:p>
-                  <w:pPr>
-                    <w:pStyle w:val="Compact"/>
-                    <w:jc w:val="left"/>
-                    <w:jc w:val="left"/>
-                  </w:pPr>
-                  <w:r>
-                    <w:t xml:space="preserve">2</w:t>
-                  </w:r>
-                </w:p>
-              </w:tc>
-              <w:tc>
-                <w:tcPr/>
-                <w:p>
-                  <w:pPr>
-                    <w:pStyle w:val="Compact"/>
-                    <w:jc w:val="left"/>
-                    <w:jc w:val="left"/>
-                  </w:pPr>
-                  <w:r>
-                    <w:t xml:space="preserve">2</w:t>
-                  </w:r>
-                </w:p>
-              </w:tc>
-              <w:tc>
-                <w:tcPr/>
-                <w:p>
-                  <w:pPr>
-                    <w:pStyle w:val="Compact"/>
-                    <w:jc w:val="left"/>
-                    <w:jc w:val="left"/>
-                  </w:pPr>
-                  <w:r>
-                    <w:t xml:space="preserve">No date_bp_max_min</w:t>
-                  </w:r>
-                </w:p>
-              </w:tc>
-            </w:tr>
-            <w:tr>
-              <w:tc>
-                <w:tcPr/>
-                <w:p>
-                  <w:pPr>
-                    <w:pStyle w:val="Compact"/>
-                    <w:jc w:val="left"/>
-                    <w:jc w:val="left"/>
-                  </w:pPr>
-                  <w:r>
-                    <w:t xml:space="preserve">Le Terme Pialat</w:t>
-                  </w:r>
-                </w:p>
-              </w:tc>
-              <w:tc>
-                <w:tcPr/>
-                <w:p>
-                  <w:pPr>
-                    <w:pStyle w:val="Compact"/>
-                    <w:jc w:val="left"/>
-                    <w:jc w:val="left"/>
-                  </w:pPr>
-                  <w:r>
-                    <w:t xml:space="preserve">B</w:t>
-                  </w:r>
-                </w:p>
-              </w:tc>
-              <w:tc>
-                <w:tcPr/>
-                <w:p>
-                  <w:pPr>
-                    <w:pStyle w:val="Compact"/>
-                    <w:jc w:val="left"/>
-                    <w:jc w:val="left"/>
-                  </w:pPr>
-                  <w:r>
-                    <w:t xml:space="preserve">1</w:t>
-                  </w:r>
-                </w:p>
-              </w:tc>
-              <w:tc>
-                <w:tcPr/>
-                <w:p>
-                  <w:pPr>
-                    <w:pStyle w:val="Compact"/>
-                    <w:jc w:val="left"/>
-                    <w:jc w:val="left"/>
-                  </w:pPr>
-                  <w:r>
-                    <w:t xml:space="preserve">1</w:t>
-                  </w:r>
-                </w:p>
-              </w:tc>
-              <w:tc>
-                <w:tcPr/>
-                <w:p>
-                  <w:pPr>
-                    <w:pStyle w:val="Compact"/>
-                    <w:jc w:val="left"/>
-                    <w:jc w:val="left"/>
-                  </w:pPr>
-                  <w:r>
-                    <w:t xml:space="preserve">No date_bp_max_min</w:t>
-                  </w:r>
-                </w:p>
-              </w:tc>
-            </w:tr>
-            <w:tr>
-              <w:tc>
-                <w:tcPr/>
-                <w:p>
-                  <w:pPr>
-                    <w:pStyle w:val="Compact"/>
-                    <w:jc w:val="left"/>
-                    <w:jc w:val="left"/>
-                  </w:pPr>
-                  <w:r>
-                    <w:t xml:space="preserve">Lhotka</w:t>
-                  </w:r>
-                </w:p>
-              </w:tc>
-              <w:tc>
-                <w:tcPr/>
-                <w:p>
-                  <w:pPr>
-                    <w:pStyle w:val="Compact"/>
-                    <w:jc w:val="left"/>
-                    <w:jc w:val="left"/>
-                  </w:pPr>
-                  <w:r>
-                    <w:t xml:space="preserve">B</w:t>
-                  </w:r>
-                </w:p>
-              </w:tc>
-              <w:tc>
-                <w:tcPr/>
-                <w:p>
-                  <w:pPr>
-                    <w:pStyle w:val="Compact"/>
-                    <w:jc w:val="left"/>
-                    <w:jc w:val="left"/>
-                  </w:pPr>
-                  <w:r>
-                    <w:t xml:space="preserve">1</w:t>
-                  </w:r>
-                </w:p>
-              </w:tc>
-              <w:tc>
-                <w:tcPr/>
-                <w:p>
-                  <w:pPr>
-                    <w:pStyle w:val="Compact"/>
-                    <w:jc w:val="left"/>
-                    <w:jc w:val="left"/>
-                  </w:pPr>
-                  <w:r>
-                    <w:t xml:space="preserve">1</w:t>
-                  </w:r>
-                </w:p>
-              </w:tc>
-              <w:tc>
-                <w:tcPr/>
-                <w:p>
-                  <w:pPr>
-                    <w:pStyle w:val="Compact"/>
-                    <w:jc w:val="left"/>
-                    <w:jc w:val="left"/>
-                  </w:pPr>
-                  <w:r>
-                    <w:t xml:space="preserve">No date_bp_max_min</w:t>
-                  </w:r>
-                </w:p>
-              </w:tc>
-            </w:tr>
-            <w:tr>
-              <w:tc>
-                <w:tcPr/>
-                <w:p>
-                  <w:pPr>
-                    <w:pStyle w:val="Compact"/>
-                    <w:jc w:val="left"/>
-                    <w:jc w:val="left"/>
-                  </w:pPr>
-                  <w:r>
-                    <w:t xml:space="preserve">Otaslavice</w:t>
-                  </w:r>
-                </w:p>
-              </w:tc>
-              <w:tc>
-                <w:tcPr/>
-                <w:p>
-                  <w:pPr>
-                    <w:pStyle w:val="Compact"/>
-                    <w:jc w:val="left"/>
-                    <w:jc w:val="left"/>
-                  </w:pPr>
-                  <w:r>
-                    <w:t xml:space="preserve">B</w:t>
-                  </w:r>
-                </w:p>
-              </w:tc>
-              <w:tc>
-                <w:tcPr/>
-                <w:p>
-                  <w:pPr>
-                    <w:pStyle w:val="Compact"/>
-                    <w:jc w:val="left"/>
-                    <w:jc w:val="left"/>
-                  </w:pPr>
-                  <w:r>
-                    <w:t xml:space="preserve">1</w:t>
-                  </w:r>
-                </w:p>
-              </w:tc>
-              <w:tc>
-                <w:tcPr/>
-                <w:p>
-                  <w:pPr>
-                    <w:pStyle w:val="Compact"/>
-                    <w:jc w:val="left"/>
-                    <w:jc w:val="left"/>
-                  </w:pPr>
-                  <w:r>
-                    <w:t xml:space="preserve">1</w:t>
-                  </w:r>
-                </w:p>
-              </w:tc>
-              <w:tc>
-                <w:tcPr/>
-                <w:p>
-                  <w:pPr>
-                    <w:pStyle w:val="Compact"/>
-                    <w:jc w:val="left"/>
-                    <w:jc w:val="left"/>
-                  </w:pPr>
-                  <w:r>
-                    <w:t xml:space="preserve">No date_bp_max_min</w:t>
-                  </w:r>
-                </w:p>
-              </w:tc>
-            </w:tr>
-            <w:tr>
-              <w:tc>
-                <w:tcPr/>
-                <w:p>
-                  <w:pPr>
-                    <w:pStyle w:val="Compact"/>
-                    <w:jc w:val="left"/>
-                    <w:jc w:val="left"/>
-                  </w:pPr>
-                  <w:r>
-                    <w:t xml:space="preserve">Slatinice</w:t>
-                  </w:r>
-                </w:p>
-              </w:tc>
-              <w:tc>
-                <w:tcPr/>
-                <w:p>
-                  <w:pPr>
-                    <w:pStyle w:val="Compact"/>
-                    <w:jc w:val="left"/>
-                    <w:jc w:val="left"/>
-                  </w:pPr>
-                  <w:r>
-                    <w:t xml:space="preserve">B</w:t>
-                  </w:r>
-                </w:p>
-              </w:tc>
-              <w:tc>
-                <w:tcPr/>
-                <w:p>
-                  <w:pPr>
-                    <w:pStyle w:val="Compact"/>
-                    <w:jc w:val="left"/>
-                    <w:jc w:val="left"/>
-                  </w:pPr>
-                  <w:r>
-                    <w:t xml:space="preserve">1</w:t>
-                  </w:r>
-                </w:p>
-              </w:tc>
-              <w:tc>
-                <w:tcPr/>
-                <w:p>
-                  <w:pPr>
-                    <w:pStyle w:val="Compact"/>
-                    <w:jc w:val="left"/>
-                    <w:jc w:val="left"/>
-                  </w:pPr>
-                  <w:r>
-                    <w:t xml:space="preserve">1</w:t>
-                  </w:r>
-                </w:p>
-              </w:tc>
-              <w:tc>
-                <w:tcPr/>
-                <w:p>
-                  <w:pPr>
-                    <w:pStyle w:val="Compact"/>
-                    <w:jc w:val="left"/>
-                    <w:jc w:val="left"/>
-                  </w:pPr>
-                  <w:r>
-                    <w:t xml:space="preserve">No date_bp_max_min</w:t>
-                  </w:r>
-                </w:p>
-              </w:tc>
-            </w:tr>
-            <w:tr>
-              <w:tc>
-                <w:tcPr/>
-                <w:p>
-                  <w:pPr>
-                    <w:pStyle w:val="Compact"/>
-                    <w:jc w:val="left"/>
-                    <w:jc w:val="left"/>
-                  </w:pPr>
-                  <w:r>
-                    <w:t xml:space="preserve">Nová Dědina</w:t>
-                  </w:r>
-                </w:p>
-              </w:tc>
-              <w:tc>
-                <w:tcPr/>
-                <w:p>
-                  <w:pPr>
-                    <w:pStyle w:val="Compact"/>
-                    <w:jc w:val="left"/>
-                    <w:jc w:val="left"/>
-                  </w:pPr>
-                  <w:r>
-                    <w:t xml:space="preserve">B</w:t>
-                  </w:r>
-                </w:p>
-              </w:tc>
-              <w:tc>
-                <w:tcPr/>
-                <w:p>
-                  <w:pPr>
-                    <w:pStyle w:val="Compact"/>
-                    <w:jc w:val="left"/>
-                    <w:jc w:val="left"/>
-                  </w:pPr>
-                  <w:r>
-                    <w:t xml:space="preserve">4</w:t>
-                  </w:r>
-                </w:p>
-              </w:tc>
-              <w:tc>
-                <w:tcPr/>
-                <w:p>
-                  <w:pPr>
-                    <w:pStyle w:val="Compact"/>
-                    <w:jc w:val="left"/>
-                    <w:jc w:val="left"/>
-                  </w:pPr>
-                  <w:r>
-                    <w:t xml:space="preserve">3</w:t>
-                  </w:r>
-                </w:p>
-              </w:tc>
-              <w:tc>
-                <w:tcPr/>
-                <w:p>
-                  <w:pPr>
-                    <w:pStyle w:val="Compact"/>
-                    <w:jc w:val="left"/>
-                    <w:jc w:val="left"/>
-                  </w:pPr>
-                  <w:r>
-                    <w:t xml:space="preserve">No date_bp_max_min; Late Aurignacian assemblage with 3 artifacts</w:t>
-                  </w:r>
-                </w:p>
-              </w:tc>
-            </w:tr>
-            <w:tr>
-              <w:tc>
-                <w:tcPr/>
-                <w:p>
-                  <w:pPr>
-                    <w:pStyle w:val="Compact"/>
-                    <w:jc w:val="left"/>
-                    <w:jc w:val="left"/>
-                  </w:pPr>
-                  <w:r>
-                    <w:t xml:space="preserve">Menton/Grottes du Grimaldi</w:t>
-                  </w:r>
-                </w:p>
-              </w:tc>
-              <w:tc>
-                <w:tcPr/>
-                <w:p>
-                  <w:pPr>
-                    <w:pStyle w:val="Compact"/>
-                    <w:jc w:val="left"/>
-                    <w:jc w:val="left"/>
-                  </w:pPr>
-                  <w:r>
-                    <w:t xml:space="preserve">B</w:t>
-                  </w:r>
-                </w:p>
-              </w:tc>
-              <w:tc>
-                <w:tcPr/>
-                <w:p>
-                  <w:pPr>
-                    <w:pStyle w:val="Compact"/>
-                    <w:jc w:val="left"/>
-                    <w:jc w:val="left"/>
-                  </w:pPr>
-                  <w:r>
-                    <w:t xml:space="preserve">3</w:t>
-                  </w:r>
-                </w:p>
-              </w:tc>
-              <w:tc>
-                <w:tcPr/>
-                <w:p>
-                  <w:pPr>
-                    <w:pStyle w:val="Compact"/>
-                    <w:jc w:val="left"/>
-                    <w:jc w:val="left"/>
-                  </w:pPr>
-                  <w:r>
-                    <w:t xml:space="preserve">2</w:t>
-                  </w:r>
-                </w:p>
-              </w:tc>
-              <w:tc>
-                <w:tcPr/>
-                <w:p>
-                  <w:pPr>
-                    <w:pStyle w:val="Compact"/>
-                    <w:jc w:val="left"/>
-                    <w:jc w:val="left"/>
-                  </w:pPr>
-                  <w:r>
-                    <w:t xml:space="preserve">No date_bp_max_min</w:t>
-                  </w:r>
-                </w:p>
-              </w:tc>
-            </w:tr>
-            <w:tr>
-              <w:tc>
-                <w:tcPr/>
-                <w:p>
-                  <w:pPr>
-                    <w:pStyle w:val="Compact"/>
-                    <w:jc w:val="left"/>
-                    <w:jc w:val="left"/>
-                  </w:pPr>
-                  <w:r>
-                    <w:t xml:space="preserve">Žlutava</w:t>
-                  </w:r>
-                </w:p>
-              </w:tc>
-              <w:tc>
-                <w:tcPr/>
-                <w:p>
-                  <w:pPr>
-                    <w:pStyle w:val="Compact"/>
-                    <w:jc w:val="left"/>
-                    <w:jc w:val="left"/>
-                  </w:pPr>
-                  <w:r>
-                    <w:t xml:space="preserve">B</w:t>
-                  </w:r>
-                </w:p>
-              </w:tc>
-              <w:tc>
-                <w:tcPr/>
-                <w:p>
-                  <w:pPr>
-                    <w:pStyle w:val="Compact"/>
-                    <w:jc w:val="left"/>
-                    <w:jc w:val="left"/>
-                  </w:pPr>
-                  <w:r>
-                    <w:t xml:space="preserve">3</w:t>
-                  </w:r>
-                </w:p>
-              </w:tc>
-              <w:tc>
-                <w:tcPr/>
-                <w:p>
-                  <w:pPr>
-                    <w:pStyle w:val="Compact"/>
-                    <w:jc w:val="left"/>
-                    <w:jc w:val="left"/>
-                  </w:pPr>
-                  <w:r>
-                    <w:t xml:space="preserve">3</w:t>
-                  </w:r>
-                </w:p>
-              </w:tc>
-              <w:tc>
-                <w:tcPr/>
-                <w:p>
-                  <w:pPr>
-                    <w:pStyle w:val="Compact"/>
-                    <w:jc w:val="left"/>
-                    <w:jc w:val="left"/>
-                  </w:pPr>
-                  <w:r>
-                    <w:t xml:space="preserve">No date_bp_max_min</w:t>
-                  </w:r>
-                </w:p>
-              </w:tc>
-            </w:tr>
-            <w:tr>
-              <w:tc>
-                <w:tcPr/>
-                <w:p>
-                  <w:pPr>
-                    <w:pStyle w:val="Compact"/>
-                    <w:jc w:val="left"/>
-                    <w:jc w:val="left"/>
-                  </w:pPr>
-                  <w:r>
-                    <w:t xml:space="preserve">Grotte de Goyet</w:t>
-                  </w:r>
-                </w:p>
-              </w:tc>
-              <w:tc>
-                <w:tcPr/>
-                <w:p>
-                  <w:pPr>
-                    <w:pStyle w:val="Compact"/>
-                    <w:jc w:val="left"/>
-                    <w:jc w:val="left"/>
-                  </w:pPr>
-                  <w:r>
-                    <w:t xml:space="preserve">C</w:t>
-                  </w:r>
-                </w:p>
-              </w:tc>
-              <w:tc>
-                <w:tcPr/>
-                <w:p>
-                  <w:pPr>
-                    <w:pStyle w:val="Compact"/>
-                    <w:jc w:val="left"/>
-                    <w:jc w:val="left"/>
-                  </w:pPr>
-                  <w:r>
-                    <w:t xml:space="preserve">13</w:t>
-                  </w:r>
-                </w:p>
-              </w:tc>
-              <w:tc>
-                <w:tcPr/>
-                <w:p>
-                  <w:pPr>
-                    <w:pStyle w:val="Compact"/>
-                    <w:jc w:val="left"/>
-                    <w:jc w:val="left"/>
-                  </w:pPr>
-                  <w:r>
-                    <w:t xml:space="preserve">12</w:t>
-                  </w:r>
-                </w:p>
-              </w:tc>
-              <w:tc>
-                <w:tcPr/>
-                <w:p>
-                  <w:pPr>
-                    <w:pStyle w:val="Compact"/>
-                    <w:jc w:val="left"/>
-                    <w:jc w:val="left"/>
-                  </w:pPr>
-                  <w:r>
-                    <w:t xml:space="preserve">No date_bp_max_min</w:t>
-                  </w:r>
-                </w:p>
-              </w:tc>
-            </w:tr>
-            <w:tr>
-              <w:tc>
-                <w:tcPr/>
-                <w:p>
-                  <w:pPr>
-                    <w:pStyle w:val="Compact"/>
-                    <w:jc w:val="left"/>
-                    <w:jc w:val="left"/>
-                  </w:pPr>
-                  <w:r>
-                    <w:t xml:space="preserve">Maisières-Canal</w:t>
-                  </w:r>
-                </w:p>
-              </w:tc>
-              <w:tc>
-                <w:tcPr/>
-                <w:p>
-                  <w:pPr>
-                    <w:pStyle w:val="Compact"/>
-                    <w:jc w:val="left"/>
-                    <w:jc w:val="left"/>
-                  </w:pPr>
-                  <w:r>
-                    <w:t xml:space="preserve">C</w:t>
-                  </w:r>
-                </w:p>
-              </w:tc>
-              <w:tc>
-                <w:tcPr/>
-                <w:p>
-                  <w:pPr>
-                    <w:pStyle w:val="Compact"/>
-                    <w:jc w:val="left"/>
-                    <w:jc w:val="left"/>
-                  </w:pPr>
-                  <w:r>
-                    <w:t xml:space="preserve">7</w:t>
-                  </w:r>
-                </w:p>
-              </w:tc>
-              <w:tc>
-                <w:tcPr/>
-                <w:p>
-                  <w:pPr>
-                    <w:pStyle w:val="Compact"/>
-                    <w:jc w:val="left"/>
-                    <w:jc w:val="left"/>
-                  </w:pPr>
-                  <w:r>
-                    <w:t xml:space="preserve">5</w:t>
-                  </w:r>
-                </w:p>
-              </w:tc>
-              <w:tc>
-                <w:tcPr/>
-                <w:p>
-                  <w:pPr>
-                    <w:pStyle w:val="Compact"/>
-                    <w:jc w:val="left"/>
-                    <w:jc w:val="left"/>
-                  </w:pPr>
-                  <w:r>
-                    <w:t xml:space="preserve">No date_bp_max_min</w:t>
-                  </w:r>
-                </w:p>
-              </w:tc>
-            </w:tr>
-            <w:tr>
-              <w:tc>
-                <w:tcPr/>
-                <w:p>
-                  <w:pPr>
-                    <w:pStyle w:val="Compact"/>
-                    <w:jc w:val="left"/>
-                    <w:jc w:val="left"/>
-                  </w:pPr>
-                  <w:r>
-                    <w:t xml:space="preserve">Brassempouy</w:t>
-                  </w:r>
-                </w:p>
-              </w:tc>
-              <w:tc>
-                <w:tcPr/>
-                <w:p>
-                  <w:pPr>
-                    <w:pStyle w:val="Compact"/>
-                    <w:jc w:val="left"/>
-                    <w:jc w:val="left"/>
-                  </w:pPr>
-                  <w:r>
-                    <w:t xml:space="preserve">C</w:t>
-                  </w:r>
-                </w:p>
-              </w:tc>
-              <w:tc>
-                <w:tcPr/>
-                <w:p>
-                  <w:pPr>
-                    <w:pStyle w:val="Compact"/>
-                    <w:jc w:val="left"/>
-                    <w:jc w:val="left"/>
-                  </w:pPr>
-                  <w:r>
-                    <w:t xml:space="preserve">3</w:t>
-                  </w:r>
-                </w:p>
-              </w:tc>
-              <w:tc>
-                <w:tcPr/>
-                <w:p>
-                  <w:pPr>
-                    <w:pStyle w:val="Compact"/>
-                    <w:jc w:val="left"/>
-                    <w:jc w:val="left"/>
-                  </w:pPr>
-                  <w:r>
-                    <w:t xml:space="preserve">3</w:t>
-                  </w:r>
-                </w:p>
-              </w:tc>
-              <w:tc>
-                <w:tcPr/>
-                <w:p>
-                  <w:pPr>
-                    <w:pStyle w:val="Compact"/>
-                    <w:jc w:val="left"/>
-                    <w:jc w:val="left"/>
-                  </w:pPr>
-                  <w:r>
-                    <w:t xml:space="preserve">Date string lacks ± error notation; C14 date range 35160-33140 uncalibratable</w:t>
-                  </w:r>
-                </w:p>
-              </w:tc>
-            </w:tr>
-            <w:tr>
-              <w:tc>
-                <w:tcPr/>
-                <w:p>
-                  <w:pPr>
-                    <w:pStyle w:val="Compact"/>
-                    <w:jc w:val="left"/>
-                    <w:jc w:val="left"/>
-                  </w:pPr>
-                  <w:r>
-                    <w:t xml:space="preserve">Istállóskő Cave</w:t>
-                  </w:r>
-                </w:p>
-              </w:tc>
-              <w:tc>
-                <w:tcPr/>
-                <w:p>
-                  <w:pPr>
-                    <w:pStyle w:val="Compact"/>
-                    <w:jc w:val="left"/>
-                    <w:jc w:val="left"/>
-                  </w:pPr>
-                  <w:r>
-                    <w:t xml:space="preserve">C</w:t>
-                  </w:r>
-                </w:p>
-              </w:tc>
-              <w:tc>
-                <w:tcPr/>
-                <w:p>
-                  <w:pPr>
-                    <w:pStyle w:val="Compact"/>
-                    <w:jc w:val="left"/>
-                    <w:jc w:val="left"/>
-                  </w:pPr>
-                  <w:r>
-                    <w:t xml:space="preserve">3</w:t>
-                  </w:r>
-                </w:p>
-              </w:tc>
-              <w:tc>
-                <w:tcPr/>
-                <w:p>
-                  <w:pPr>
-                    <w:pStyle w:val="Compact"/>
-                    <w:jc w:val="left"/>
-                    <w:jc w:val="left"/>
-                  </w:pPr>
-                  <w:r>
-                    <w:t xml:space="preserve">3</w:t>
-                  </w:r>
-                </w:p>
-              </w:tc>
-              <w:tc>
-                <w:tcPr/>
-                <w:p>
-                  <w:pPr>
-                    <w:pStyle w:val="Compact"/>
-                    <w:jc w:val="left"/>
-                    <w:jc w:val="left"/>
-                  </w:pPr>
-                  <w:r>
-                    <w:t xml:space="preserve">Date string lacks ± error notation; C14 date range 33000-32000 uncalibratable</w:t>
-                  </w:r>
-                </w:p>
-              </w:tc>
-            </w:tr>
-            <w:tr>
-              <w:tc>
-                <w:tcPr/>
-                <w:p>
-                  <w:pPr>
-                    <w:pStyle w:val="Compact"/>
-                    <w:jc w:val="left"/>
-                    <w:jc w:val="left"/>
-                  </w:pPr>
-                  <w:r>
-                    <w:t xml:space="preserve">Le Trou Du Renard</w:t>
-                  </w:r>
-                </w:p>
-              </w:tc>
-              <w:tc>
-                <w:tcPr/>
-                <w:p>
-                  <w:pPr>
-                    <w:pStyle w:val="Compact"/>
-                    <w:jc w:val="left"/>
-                    <w:jc w:val="left"/>
-                  </w:pPr>
-                  <w:r>
-                    <w:t xml:space="preserve">C</w:t>
-                  </w:r>
-                </w:p>
-              </w:tc>
-              <w:tc>
-                <w:tcPr/>
-                <w:p>
-                  <w:pPr>
-                    <w:pStyle w:val="Compact"/>
-                    <w:jc w:val="left"/>
-                    <w:jc w:val="left"/>
-                  </w:pPr>
-                  <w:r>
-                    <w:t xml:space="preserve">2</w:t>
-                  </w:r>
-                </w:p>
-              </w:tc>
-              <w:tc>
-                <w:tcPr/>
-                <w:p>
-                  <w:pPr>
-                    <w:pStyle w:val="Compact"/>
-                    <w:jc w:val="left"/>
-                    <w:jc w:val="left"/>
-                  </w:pPr>
-                  <w:r>
-                    <w:t xml:space="preserve">2</w:t>
-                  </w:r>
-                </w:p>
-              </w:tc>
-              <w:tc>
-                <w:tcPr/>
-                <w:p>
-                  <w:pPr>
-                    <w:pStyle w:val="Compact"/>
-                    <w:jc w:val="left"/>
-                    <w:jc w:val="left"/>
-                  </w:pPr>
-                  <w:r>
-                    <w:t xml:space="preserve">No date_bp_max_min in parsed form; AMS date range 35000-32000 lacks error field</w:t>
-                  </w:r>
-                </w:p>
-              </w:tc>
-            </w:tr>
-            <w:tr>
-              <w:tc>
-                <w:tcPr/>
-                <w:p>
-                  <w:pPr>
-                    <w:pStyle w:val="Compact"/>
-                    <w:jc w:val="left"/>
-                    <w:jc w:val="left"/>
-                  </w:pPr>
-                  <w:r>
-                    <w:t xml:space="preserve">Tuto de Camalhot</w:t>
-                  </w:r>
-                </w:p>
-              </w:tc>
-              <w:tc>
-                <w:tcPr/>
-                <w:p>
-                  <w:pPr>
-                    <w:pStyle w:val="Compact"/>
-                    <w:jc w:val="left"/>
-                    <w:jc w:val="left"/>
-                  </w:pPr>
-                  <w:r>
-                    <w:t xml:space="preserve">C</w:t>
-                  </w:r>
-                </w:p>
-              </w:tc>
-              <w:tc>
-                <w:tcPr/>
-                <w:p>
-                  <w:pPr>
-                    <w:pStyle w:val="Compact"/>
-                    <w:jc w:val="left"/>
-                    <w:jc w:val="left"/>
-                  </w:pPr>
-                  <w:r>
-                    <w:t xml:space="preserve">2</w:t>
-                  </w:r>
-                </w:p>
-              </w:tc>
-              <w:tc>
-                <w:tcPr/>
-                <w:p>
-                  <w:pPr>
-                    <w:pStyle w:val="Compact"/>
-                    <w:jc w:val="left"/>
-                    <w:jc w:val="left"/>
-                  </w:pPr>
-                  <w:r>
-                    <w:t xml:space="preserve">2</w:t>
-                  </w:r>
-                </w:p>
-              </w:tc>
-              <w:tc>
-                <w:tcPr/>
-                <w:p>
-                  <w:pPr>
-                    <w:pStyle w:val="Compact"/>
-                    <w:jc w:val="left"/>
-                    <w:jc w:val="left"/>
-                  </w:pPr>
-                  <w:r>
-                    <w:t xml:space="preserve">Date string lacks ± error notation; C14 date range 33000-32000 uncalibratable</w:t>
-                  </w:r>
-                </w:p>
-              </w:tc>
-            </w:tr>
-            <w:tr>
-              <w:tc>
-                <w:tcPr/>
-                <w:p>
-                  <w:pPr>
-                    <w:pStyle w:val="Compact"/>
-                    <w:jc w:val="left"/>
-                    <w:jc w:val="left"/>
-                  </w:pPr>
-                  <w:r>
-                    <w:t xml:space="preserve">Peskő Cave</w:t>
-                  </w:r>
-                </w:p>
-              </w:tc>
-              <w:tc>
-                <w:tcPr/>
-                <w:p>
-                  <w:pPr>
-                    <w:pStyle w:val="Compact"/>
-                    <w:jc w:val="left"/>
-                    <w:jc w:val="left"/>
-                  </w:pPr>
-                  <w:r>
-                    <w:t xml:space="preserve">C</w:t>
-                  </w:r>
-                </w:p>
-              </w:tc>
-              <w:tc>
-                <w:tcPr/>
-                <w:p>
-                  <w:pPr>
-                    <w:pStyle w:val="Compact"/>
-                    <w:jc w:val="left"/>
-                    <w:jc w:val="left"/>
-                  </w:pPr>
-                  <w:r>
-                    <w:t xml:space="preserve">1</w:t>
-                  </w:r>
-                </w:p>
-              </w:tc>
-              <w:tc>
-                <w:tcPr/>
-                <w:p>
-                  <w:pPr>
-                    <w:pStyle w:val="Compact"/>
-                    <w:jc w:val="left"/>
-                    <w:jc w:val="left"/>
-                  </w:pPr>
-                  <w:r>
-                    <w:t xml:space="preserve">1</w:t>
-                  </w:r>
-                </w:p>
-              </w:tc>
-              <w:tc>
-                <w:tcPr/>
-                <w:p>
-                  <w:pPr>
-                    <w:pStyle w:val="Compact"/>
-                    <w:jc w:val="left"/>
-                    <w:jc w:val="left"/>
-                  </w:pPr>
-                  <w:r>
-                    <w:t xml:space="preserve">Date string lacks ± error notation; C14 single value 34750 uncalibratable</w:t>
-                  </w:r>
-                </w:p>
-              </w:tc>
-            </w:tr>
-            <w:tr>
-              <w:tc>
-                <w:tcPr/>
-                <w:p>
-                  <w:pPr>
-                    <w:pStyle w:val="Compact"/>
-                    <w:jc w:val="left"/>
-                    <w:jc w:val="left"/>
-                  </w:pPr>
-                  <w:r>
-                    <w:t xml:space="preserve">Shelter Birów IV</w:t>
-                  </w:r>
-                </w:p>
-              </w:tc>
-              <w:tc>
-                <w:tcPr/>
-                <w:p>
-                  <w:pPr>
-                    <w:pStyle w:val="Compact"/>
-                    <w:jc w:val="left"/>
-                    <w:jc w:val="left"/>
-                  </w:pPr>
-                  <w:r>
-                    <w:t xml:space="preserve">C</w:t>
-                  </w:r>
-                </w:p>
-              </w:tc>
-              <w:tc>
-                <w:tcPr/>
-                <w:p>
-                  <w:pPr>
-                    <w:pStyle w:val="Compact"/>
-                    <w:jc w:val="left"/>
-                    <w:jc w:val="left"/>
-                  </w:pPr>
-                  <w:r>
-                    <w:t xml:space="preserve">1</w:t>
-                  </w:r>
-                </w:p>
-              </w:tc>
-              <w:tc>
-                <w:tcPr/>
-                <w:p>
-                  <w:pPr>
-                    <w:pStyle w:val="Compact"/>
-                    <w:jc w:val="left"/>
-                    <w:jc w:val="left"/>
-                  </w:pPr>
-                  <w:r>
-                    <w:t xml:space="preserve">1</w:t>
-                  </w:r>
-                </w:p>
-              </w:tc>
-              <w:tc>
-                <w:tcPr/>
-                <w:p>
-                  <w:pPr>
-                    <w:pStyle w:val="Compact"/>
-                    <w:jc w:val="left"/>
-                    <w:jc w:val="left"/>
-                  </w:pPr>
-                  <w:r>
-                    <w:t xml:space="preserve">Date string lacks ± error notation; AMS date range 38300-33500 uncalibratable</w:t>
-                  </w:r>
-                </w:p>
-              </w:tc>
-            </w:tr>
-            <w:tr>
-              <w:tc>
-                <w:tcPr/>
-                <w:p>
-                  <w:pPr>
-                    <w:pStyle w:val="Compact"/>
-                    <w:jc w:val="left"/>
-                    <w:jc w:val="left"/>
-                  </w:pPr>
-                  <w:r>
-                    <w:t xml:space="preserve">Wildscheuer</w:t>
-                  </w:r>
-                </w:p>
-              </w:tc>
-              <w:tc>
-                <w:tcPr/>
-                <w:p>
-                  <w:pPr>
-                    <w:pStyle w:val="Compact"/>
-                    <w:jc w:val="left"/>
-                    <w:jc w:val="left"/>
-                  </w:pPr>
-                  <w:r>
-                    <w:t xml:space="preserve">C</w:t>
-                  </w:r>
-                </w:p>
-              </w:tc>
-              <w:tc>
-                <w:tcPr/>
-                <w:p>
-                  <w:pPr>
-                    <w:pStyle w:val="Compact"/>
-                    <w:jc w:val="left"/>
-                    <w:jc w:val="left"/>
-                  </w:pPr>
-                  <w:r>
-                    <w:t xml:space="preserve">1</w:t>
-                  </w:r>
-                </w:p>
-              </w:tc>
-              <w:tc>
-                <w:tcPr/>
-                <w:p>
-                  <w:pPr>
-                    <w:pStyle w:val="Compact"/>
-                    <w:jc w:val="left"/>
-                    <w:jc w:val="left"/>
-                  </w:pPr>
-                  <w:r>
-                    <w:t xml:space="preserve">1</w:t>
-                  </w:r>
-                </w:p>
-              </w:tc>
-              <w:tc>
-                <w:tcPr/>
-                <w:p>
-                  <w:pPr>
-                    <w:pStyle w:val="Compact"/>
-                    <w:jc w:val="left"/>
-                    <w:jc w:val="left"/>
-                  </w:pPr>
-                  <w:r>
-                    <w:t xml:space="preserve">Date string lacks ± error notation; C14 date range 34000-30000 uncalibratable</w:t>
-                  </w:r>
-                </w:p>
-              </w:tc>
-            </w:tr>
-            <w:tr>
-              <w:tc>
-                <w:tcPr/>
-                <w:p>
-                  <w:pPr>
-                    <w:pStyle w:val="Compact"/>
-                    <w:jc w:val="left"/>
-                    <w:jc w:val="left"/>
-                  </w:pPr>
-                  <w:r>
-                    <w:t xml:space="preserve">Hornos de la Pena</w:t>
-                  </w:r>
-                </w:p>
-              </w:tc>
-              <w:tc>
-                <w:tcPr/>
-                <w:p>
-                  <w:pPr>
-                    <w:pStyle w:val="Compact"/>
-                    <w:jc w:val="left"/>
-                    <w:jc w:val="left"/>
-                  </w:pPr>
-                  <w:r>
-                    <w:t xml:space="preserve">C</w:t>
-                  </w:r>
-                </w:p>
-              </w:tc>
-              <w:tc>
-                <w:tcPr/>
-                <w:p>
-                  <w:pPr>
-                    <w:pStyle w:val="Compact"/>
-                    <w:jc w:val="left"/>
-                    <w:jc w:val="left"/>
-                  </w:pPr>
-                  <w:r>
-                    <w:t xml:space="preserve">1</w:t>
-                  </w:r>
-                </w:p>
-              </w:tc>
-              <w:tc>
-                <w:tcPr/>
-                <w:p>
-                  <w:pPr>
-                    <w:pStyle w:val="Compact"/>
-                    <w:jc w:val="left"/>
-                    <w:jc w:val="left"/>
-                  </w:pPr>
-                  <w:r>
-                    <w:t xml:space="preserve">1</w:t>
-                  </w:r>
-                </w:p>
-              </w:tc>
-              <w:tc>
-                <w:tcPr/>
-                <w:p>
-                  <w:pPr>
-                    <w:pStyle w:val="Compact"/>
-                    <w:jc w:val="left"/>
-                    <w:jc w:val="left"/>
-                  </w:pPr>
-                  <w:r>
-                    <w:t xml:space="preserve">Date string lacks ± error notation; C14 date range 34000-30000 uncalibratable</w:t>
-                  </w:r>
-                </w:p>
-              </w:tc>
-            </w:tr>
-            <w:tr>
-              <w:tc>
-                <w:tcPr/>
-                <w:p>
-                  <w:pPr>
-                    <w:pStyle w:val="Compact"/>
-                    <w:jc w:val="left"/>
-                    <w:jc w:val="left"/>
-                  </w:pPr>
-                  <w:r>
-                    <w:t xml:space="preserve">Breitenbach</w:t>
-                  </w:r>
-                </w:p>
-              </w:tc>
-              <w:tc>
-                <w:tcPr/>
-                <w:p>
-                  <w:pPr>
-                    <w:pStyle w:val="Compact"/>
-                    <w:jc w:val="left"/>
-                    <w:jc w:val="left"/>
-                  </w:pPr>
-                  <w:r>
-                    <w:t xml:space="preserve">C</w:t>
-                  </w:r>
-                </w:p>
-              </w:tc>
-              <w:tc>
-                <w:tcPr/>
-                <w:p>
-                  <w:pPr>
-                    <w:pStyle w:val="Compact"/>
-                    <w:jc w:val="left"/>
-                    <w:jc w:val="left"/>
-                  </w:pPr>
-                  <w:r>
-                    <w:t xml:space="preserve">1</w:t>
-                  </w:r>
-                </w:p>
-              </w:tc>
-              <w:tc>
-                <w:tcPr/>
-                <w:p>
-                  <w:pPr>
-                    <w:pStyle w:val="Compact"/>
-                    <w:jc w:val="left"/>
-                    <w:jc w:val="left"/>
-                  </w:pPr>
-                  <w:r>
-                    <w:t xml:space="preserve">1</w:t>
-                  </w:r>
-                </w:p>
-              </w:tc>
-              <w:tc>
-                <w:tcPr/>
-                <w:p>
-                  <w:pPr>
-                    <w:pStyle w:val="Compact"/>
-                    <w:jc w:val="left"/>
-                    <w:jc w:val="left"/>
-                  </w:pPr>
-                  <w:r>
-                    <w:t xml:space="preserve">Date string lacks ± error notation; C14 date range 34000-30000 uncalibratable</w:t>
+                    <w:t xml:space="preserve">Date string</w:t>
+                  </w:r>
+                  <w:r>
+                    <w:t xml:space="preserve"> </w:t>
+                  </w:r>
+                  <w:r>
+                    <w:t xml:space="preserve">‘</w:t>
+                  </w:r>
+                  <w:r>
+                    <w:t xml:space="preserve">34300 - 30000</w:t>
+                  </w:r>
+                  <w:r>
+                    <w:t xml:space="preserve">’</w:t>
+                  </w:r>
+                  <w:r>
+                    <w:t xml:space="preserve"> </w:t>
+                  </w:r>
+                  <w:r>
+                    <w:t xml:space="preserve">(C14) has no ± error</w:t>
                   </w:r>
                 </w:p>
               </w:tc>
@@ -7679,7 +7880,7 @@
               <w:pStyle w:val="ImageCaption"/>
             </w:pPr>
             <w:r>
-              <w:t xml:space="preserve">Table S 6: 27 sites excluded during the date-parsing/calibration step: 16 Category B (no date string) and 11 Category C (unparseable date string).</w:t>
+              <w:t xml:space="preserve">Table S 6: Sites excluded during the date-parsing/calibration step. Category B = no date string; Category C = date string without an error term.</w:t>
             </w:r>
           </w:p>
           <w:bookmarkEnd w:id="42"/>
@@ -7694,7 +7895,7 @@
         <w:rPr>
           <w:rStyle w:val="VerbatimChar"/>
         </w:rPr>
-        <w:t xml:space="preserve">**Summary:** 27 sites with 65 total objects (59 signed) failed date parsing. </w:t>
+        <w:t xml:space="preserve">**Summary:** 27 sites with 65 total objects (58 signed) failed date parsing. </w:t>
       </w:r>
     </w:p>
     <w:bookmarkEnd w:id="43"/>
@@ -8869,7 +9070,7 @@
         <w:t xml:space="preserve">individual objects</w:t>
       </w:r>
       <w:r>
-        <w:t xml:space="preserve">, not sites: 15 objects from 13 sites carry no geometric signs and are removed upstream by the</w:t>
+        <w:t xml:space="preserve">, not sites: 16 objects from 13 sites carry no geometric signs and are removed upstream by the</w:t>
       </w:r>
       <w:r>
         <w:t xml:space="preserve"> </w:t>
@@ -9011,6 +9212,60 @@
                     <w:jc w:val="left"/>
                   </w:pPr>
                   <w:r>
+                    <w:t xml:space="preserve">Abri de Laussel</w:t>
+                  </w:r>
+                </w:p>
+              </w:tc>
+              <w:tc>
+                <w:tcPr/>
+                <w:p>
+                  <w:pPr>
+                    <w:pStyle w:val="Compact"/>
+                    <w:jc w:val="left"/>
+                    <w:jc w:val="left"/>
+                  </w:pPr>
+                  <w:r>
+                    <w:t xml:space="preserve">2</w:t>
+                  </w:r>
+                </w:p>
+              </w:tc>
+              <w:tc>
+                <w:tcPr/>
+                <w:p>
+                  <w:pPr>
+                    <w:pStyle w:val="Compact"/>
+                    <w:jc w:val="left"/>
+                    <w:jc w:val="left"/>
+                  </w:pPr>
+                  <w:r>
+                    <w:t xml:space="preserve">4</w:t>
+                  </w:r>
+                </w:p>
+              </w:tc>
+              <w:tc>
+                <w:tcPr/>
+                <w:p>
+                  <w:pPr>
+                    <w:pStyle w:val="Compact"/>
+                    <w:jc w:val="left"/>
+                    <w:jc w:val="left"/>
+                  </w:pPr>
+                  <w:r>
+                    <w:t xml:space="preserve">No (date parsing)</w:t>
+                  </w:r>
+                </w:p>
+              </w:tc>
+            </w:tr>
+            <w:tr>
+              <w:tc>
+                <w:tcPr/>
+                <w:p>
+                  <w:pPr>
+                    <w:pStyle w:val="Compact"/>
+                    <w:jc w:val="left"/>
+                    <w:jc w:val="left"/>
+                  </w:pPr>
+                  <w:r>
                     <w:t xml:space="preserve">Maisières-Canal</w:t>
                   </w:r>
                 </w:p>
@@ -9105,60 +9360,6 @@
                   </w:pPr>
                   <w:r>
                     <w:t xml:space="preserve">Yes</w:t>
-                  </w:r>
-                </w:p>
-              </w:tc>
-            </w:tr>
-            <w:tr>
-              <w:tc>
-                <w:tcPr/>
-                <w:p>
-                  <w:pPr>
-                    <w:pStyle w:val="Compact"/>
-                    <w:jc w:val="left"/>
-                    <w:jc w:val="left"/>
-                  </w:pPr>
-                  <w:r>
-                    <w:t xml:space="preserve">Abri de Laussel</w:t>
-                  </w:r>
-                </w:p>
-              </w:tc>
-              <w:tc>
-                <w:tcPr/>
-                <w:p>
-                  <w:pPr>
-                    <w:pStyle w:val="Compact"/>
-                    <w:jc w:val="left"/>
-                    <w:jc w:val="left"/>
-                  </w:pPr>
-                  <w:r>
-                    <w:t xml:space="preserve">1</w:t>
-                  </w:r>
-                </w:p>
-              </w:tc>
-              <w:tc>
-                <w:tcPr/>
-                <w:p>
-                  <w:pPr>
-                    <w:pStyle w:val="Compact"/>
-                    <w:jc w:val="left"/>
-                    <w:jc w:val="left"/>
-                  </w:pPr>
-                  <w:r>
-                    <w:t xml:space="preserve">5</w:t>
-                  </w:r>
-                </w:p>
-              </w:tc>
-              <w:tc>
-                <w:tcPr/>
-                <w:p>
-                  <w:pPr>
-                    <w:pStyle w:val="Compact"/>
-                    <w:jc w:val="left"/>
-                    <w:jc w:val="left"/>
-                  </w:pPr>
-                  <w:r>
-                    <w:t xml:space="preserve">No (date parsing)</w:t>
                   </w:r>
                 </w:p>
               </w:tc>
@@ -9726,57 +9927,7 @@
         <w:pStyle w:val="BodyText"/>
       </w:pPr>
       <w:r>
-        <w:t xml:space="preserve">Only</w:t>
-      </w:r>
-      <w:r>
-        <w:t xml:space="preserve"> </w:t>
-      </w:r>
-      <w:r>
-        <w:rPr>
-          <w:bCs/>
-          <w:b/>
-        </w:rPr>
-        <w:t xml:space="preserve">Willendorf</w:t>
-      </w:r>
-      <w:r>
-        <w:t xml:space="preserve"> </w:t>
-      </w:r>
-      <w:r>
-        <w:t xml:space="preserve">and</w:t>
-      </w:r>
-      <w:r>
-        <w:t xml:space="preserve"> </w:t>
-      </w:r>
-      <w:r>
-        <w:rPr>
-          <w:bCs/>
-          <w:b/>
-        </w:rPr>
-        <w:t xml:space="preserve">Spy</w:t>
-      </w:r>
-      <w:r>
-        <w:t xml:space="preserve"> </w:t>
-      </w:r>
-      <w:r>
-        <w:t xml:space="preserve">drop out entirely; the remaining</w:t>
-      </w:r>
-      <w:r>
-        <w:t xml:space="preserve"> </w:t>
-      </w:r>
-      <w:r>
-        <w:t xml:space="preserve">“</w:t>
-      </w:r>
-      <w:r>
-        <w:t xml:space="preserve">No</w:t>
-      </w:r>
-      <w:r>
-        <w:t xml:space="preserve">”</w:t>
-      </w:r>
-      <w:r>
-        <w:t xml:space="preserve"> </w:t>
-      </w:r>
-      <w:r>
-        <w:t xml:space="preserve">sites are lost at the date-parsing/calibration step rather than because of the zero-sign filter (see</w:t>
+        <w:t xml:space="preserve">Of the sites in</w:t>
       </w:r>
       <w:r>
         <w:t xml:space="preserve"> </w:t>
@@ -9790,7 +9941,51 @@
         </w:r>
       </w:hyperlink>
       <w:r>
-        <w:t xml:space="preserve">).</w:t>
+        <w:t xml:space="preserve">, only Willendorf has no signed object, because its single object carries only a sign coded as</w:t>
+      </w:r>
+      <w:r>
+        <w:t xml:space="preserve"> </w:t>
+      </w:r>
+      <w:r>
+        <w:t xml:space="preserve">“</w:t>
+      </w:r>
+      <w:r>
+        <w:t xml:space="preserve">other</w:t>
+      </w:r>
+      <w:r>
+        <w:t xml:space="preserve">”</w:t>
+      </w:r>
+      <w:r>
+        <w:t xml:space="preserve">. Spy is excluded because its assemblage is mixed (</w:t>
+      </w:r>
+      <w:hyperlink w:anchor="tbl-excluded">
+        <w:r>
+          <w:rPr>
+            <w:rStyle w:val="Hyperlink"/>
+          </w:rPr>
+          <w:t xml:space="preserve">Table S 5</w:t>
+        </w:r>
+      </w:hyperlink>
+      <w:r>
+        <w:t xml:space="preserve">). The other</w:t>
+      </w:r>
+      <w:r>
+        <w:t xml:space="preserve"> </w:t>
+      </w:r>
+      <w:r>
+        <w:t xml:space="preserve">“</w:t>
+      </w:r>
+      <w:r>
+        <w:t xml:space="preserve">No</w:t>
+      </w:r>
+      <w:r>
+        <w:t xml:space="preserve">”</w:t>
+      </w:r>
+      <w:r>
+        <w:t xml:space="preserve"> </w:t>
+      </w:r>
+      <w:r>
+        <w:t xml:space="preserve">sites are lost at the date-parsing step, not because of the zero-sign filter.</w:t>
       </w:r>
     </w:p>
     <w:bookmarkEnd w:id="49"/>

</xml_diff>

<commit_message>
edits to paper done
</commit_message>
<xml_diff>
--- a/paper/S2-supplement-site-assignment.docx
+++ b/paper/S2-supplement-site-assignment.docx
@@ -384,7 +384,7 @@
         <w:t xml:space="preserve">[5–7]</w:t>
       </w:r>
       <w:r>
-        <w:t xml:space="preserve">. Two sites are excluded from the analysis because their assemblages are too mixed to assign to a single phase reliably: Spy</w:t>
+        <w:t xml:space="preserve">. Two sites are excluded from the analysis: Spy, because its assemblage is too mixed to assign to a single phase reliably</w:t>
       </w:r>
       <w:r>
         <w:t xml:space="preserve"> </w:t>
@@ -393,10 +393,19 @@
         <w:t xml:space="preserve">[8,9]</w:t>
       </w:r>
       <w:r>
-        <w:t xml:space="preserve"> </w:t>
-      </w:r>
-      <w:r>
-        <w:t xml:space="preserve">and El Castillo (see</w:t>
+        <w:t xml:space="preserve">, and El Castillo, because the Aurignacian attribution of its unit 18 is debated</w:t>
+      </w:r>
+      <w:r>
+        <w:t xml:space="preserve"> </w:t>
+      </w:r>
+      <w:r>
+        <w:t xml:space="preserve">[10]</w:t>
+      </w:r>
+      <w:r>
+        <w:t xml:space="preserve"> </w:t>
+      </w:r>
+      <w:r>
+        <w:t xml:space="preserve">(see</w:t>
       </w:r>
       <w:r>
         <w:t xml:space="preserve"> </w:t>
@@ -422,7 +431,7 @@
         <w:t xml:space="preserve"> </w:t>
       </w:r>
       <w:r>
-        <w:t xml:space="preserve">[10]</w:t>
+        <w:t xml:space="preserve">[11]</w:t>
       </w:r>
       <w:r>
         <w:t xml:space="preserve">. We detail the rationale and procedure for assigning archaeological sites to Aurignacian phases further below (</w:t>
@@ -993,7 +1002,7 @@
                     <w:t xml:space="preserve"> </w:t>
                   </w:r>
                   <w:r>
-                    <w:t xml:space="preserve">[11,12]</w:t>
+                    <w:t xml:space="preserve">[12,13]</w:t>
                   </w:r>
                   <w:r>
                     <w:t xml:space="preserve">)</w:t>
@@ -1136,7 +1145,7 @@
                     <w:t xml:space="preserve"> </w:t>
                   </w:r>
                   <w:r>
-                    <w:t xml:space="preserve">[13]</w:t>
+                    <w:t xml:space="preserve">[14]</w:t>
                   </w:r>
                 </w:p>
               </w:tc>
@@ -2037,7 +2046,7 @@
                     <w:t xml:space="preserve"> </w:t>
                   </w:r>
                   <w:r>
-                    <w:t xml:space="preserve">[14]</w:t>
+                    <w:t xml:space="preserve">[15]</w:t>
                   </w:r>
                 </w:p>
               </w:tc>
@@ -2579,7 +2588,7 @@
                     <w:t xml:space="preserve"> </w:t>
                   </w:r>
                   <w:r>
-                    <w:t xml:space="preserve">[5,10]</w:t>
+                    <w:t xml:space="preserve">[5,11]</w:t>
                   </w:r>
                 </w:p>
               </w:tc>
@@ -2755,7 +2764,7 @@
         <w:t xml:space="preserve"> </w:t>
       </w:r>
       <w:r>
-        <w:t xml:space="preserve">spans the whole Aurignacian sequence and is therefore excluded from the analysis, in line with the treatment of the mixed-assemblage sites Spy and El Castillo.</w:t>
+        <w:t xml:space="preserve">spans the whole Aurignacian sequence and is therefore excluded from the analysis, in line with the treatment of the mixed assemblage from Spy.</w:t>
       </w:r>
     </w:p>
     <w:bookmarkEnd w:id="24"/>
@@ -2795,7 +2804,7 @@
         <w:pStyle w:val="Compact"/>
       </w:pPr>
       <w:r>
-        <w:t xml:space="preserve">[15]</w:t>
+        <w:t xml:space="preserve">[16]</w:t>
       </w:r>
       <w:r>
         <w:t xml:space="preserve"> </w:t>
@@ -2819,7 +2828,7 @@
         <w:t xml:space="preserve"> </w:t>
       </w:r>
       <w:r>
-        <w:t xml:space="preserve">[16]</w:t>
+        <w:t xml:space="preserve">[17]</w:t>
       </w:r>
       <w:r>
         <w:t xml:space="preserve">, but this conflicts with the site’s own radiocarbon chronology and is not adopted here; the weight of the technological and stratigraphic evidence keeps both layers in Aur-P1.</w:t>
@@ -2877,7 +2886,7 @@
         <w:pStyle w:val="Compact"/>
       </w:pPr>
       <w:r>
-        <w:t xml:space="preserve">[10]</w:t>
+        <w:t xml:space="preserve">[11]</w:t>
       </w:r>
       <w:r>
         <w:t xml:space="preserve"> </w:t>
@@ -2895,7 +2904,7 @@
         <w:pStyle w:val="Compact"/>
       </w:pPr>
       <w:r>
-        <w:t xml:space="preserve">[17]</w:t>
+        <w:t xml:space="preserve">[18]</w:t>
       </w:r>
       <w:r>
         <w:t xml:space="preserve"> </w:t>
@@ -2923,7 +2932,7 @@
         <w:pStyle w:val="Compact"/>
       </w:pPr>
       <w:r>
-        <w:t xml:space="preserve">[11]</w:t>
+        <w:t xml:space="preserve">[12]</w:t>
       </w:r>
       <w:r>
         <w:t xml:space="preserve"> </w:t>
@@ -2941,7 +2950,7 @@
         <w:pStyle w:val="Compact"/>
       </w:pPr>
       <w:r>
-        <w:t xml:space="preserve">[12]</w:t>
+        <w:t xml:space="preserve">[13]</w:t>
       </w:r>
       <w:r>
         <w:t xml:space="preserve"> </w:t>
@@ -3055,7 +3064,7 @@
         <w:pStyle w:val="Compact"/>
       </w:pPr>
       <w:r>
-        <w:t xml:space="preserve">[14]</w:t>
+        <w:t xml:space="preserve">[15]</w:t>
       </w:r>
       <w:r>
         <w:t xml:space="preserve"> </w:t>
@@ -3137,7 +3146,7 @@
         <w:pStyle w:val="Compact"/>
       </w:pPr>
       <w:r>
-        <w:t xml:space="preserve">[18]</w:t>
+        <w:t xml:space="preserve">[19]</w:t>
       </w:r>
       <w:r>
         <w:t xml:space="preserve"> </w:t>
@@ -3207,7 +3216,7 @@
         <w:pStyle w:val="Compact"/>
       </w:pPr>
       <w:r>
-        <w:t xml:space="preserve">[13]</w:t>
+        <w:t xml:space="preserve">[14]</w:t>
       </w:r>
       <w:r>
         <w:t xml:space="preserve"> </w:t>
@@ -3255,7 +3264,7 @@
         <w:pStyle w:val="Compact"/>
       </w:pPr>
       <w:r>
-        <w:t xml:space="preserve">[19]</w:t>
+        <w:t xml:space="preserve">[20]</w:t>
       </w:r>
       <w:r>
         <w:t xml:space="preserve"> </w:t>
@@ -3283,7 +3292,28 @@
         <w:pStyle w:val="Compact"/>
       </w:pPr>
       <w:r>
-        <w:t xml:space="preserve">Mixed/contaminated layers preclude reliable phase assignment.</w:t>
+        <w:t xml:space="preserve">[10]</w:t>
+      </w:r>
+      <w:r>
+        <w:t xml:space="preserve"> </w:t>
+      </w:r>
+      <w:r>
+        <w:t xml:space="preserve">: The SignBase objects come from layer 18b of the modern excavations. This unit is the basis of the proposed</w:t>
+      </w:r>
+      <w:r>
+        <w:t xml:space="preserve"> </w:t>
+      </w:r>
+      <w:r>
+        <w:t xml:space="preserve">“</w:t>
+      </w:r>
+      <w:r>
+        <w:t xml:space="preserve">Transitional Aurignacian</w:t>
+      </w:r>
+      <w:r>
+        <w:t xml:space="preserve">”</w:t>
+      </w:r>
+      <w:r>
+        <w:t xml:space="preserve">, an interpretation that has been heavily debated, with criticism of the lithic and bone assemblages and of the chronology. Radiocarbon dates place unit 18 earlier than 42 ka cal BP, with no evidence of younger material in the new excavation area. Because the Aurignacian attribution of this unit is debated, we do not assign its objects to a phase.</w:t>
       </w:r>
     </w:p>
     <w:bookmarkEnd w:id="33"/>
@@ -3353,7 +3383,7 @@
         <w:t xml:space="preserve">”</w:t>
       </w:r>
       <w:r>
-        <w:t xml:space="preserve">; Riparo di Fontana Nuova, Muralovka, Shanidar Cave and Hayonim Cave, because of geographic isolation; El Salitre, because it lacks a reliable chronological context; and Grotte De La Princesse Pauline and Šandalja II, because they date much later than the other assemblages. After phase reclassification and the exclusion of the two mixed-assemblage sites Spy and El Castillo (see</w:t>
+        <w:t xml:space="preserve">; Riparo di Fontana Nuova, Muralovka, Shanidar Cave and Hayonim Cave, because of geographic isolation; El Salitre, because it lacks a reliable chronological context; and Grotte De La Princesse Pauline and Šandalja II, because they date much later than the other assemblages. After phase reclassification and the exclusion of Spy (mixed assemblage) and El Castillo (debated attribution; see</w:t>
       </w:r>
       <w:r>
         <w:t xml:space="preserve"> </w:t>
@@ -4906,7 +4936,7 @@
                     <w:t xml:space="preserve"> </w:t>
                   </w:r>
                   <w:r>
-                    <w:t xml:space="preserve">[5,10]</w:t>
+                    <w:t xml:space="preserve">[5,11]</w:t>
                   </w:r>
                 </w:p>
               </w:tc>
@@ -5141,7 +5171,7 @@
                     <w:t xml:space="preserve"> </w:t>
                   </w:r>
                   <w:r>
-                    <w:t xml:space="preserve">[13]</w:t>
+                    <w:t xml:space="preserve">[14]</w:t>
                   </w:r>
                 </w:p>
               </w:tc>
@@ -5357,7 +5387,7 @@
                     <w:t xml:space="preserve"> </w:t>
                   </w:r>
                   <w:r>
-                    <w:t xml:space="preserve">[14]</w:t>
+                    <w:t xml:space="preserve">[15]</w:t>
                   </w:r>
                 </w:p>
               </w:tc>
@@ -5381,13 +5411,13 @@
       </w:tr>
     </w:tbl>
     <w:bookmarkEnd w:id="39"/>
-    <w:bookmarkStart w:id="41" w:name="excluded-due-to-mixing"/>
+    <w:bookmarkStart w:id="41" w:name="Xbea03578033e329200c24c3fba54cf194a21f2d"/>
     <w:p>
       <w:pPr>
         <w:pStyle w:val="Heading3"/>
       </w:pPr>
       <w:r>
-        <w:t xml:space="preserve">Excluded due to mixing</w:t>
+        <w:t xml:space="preserve">Excluded because of mixing or debated attribution</w:t>
       </w:r>
     </w:p>
     <w:p>
@@ -5395,7 +5425,7 @@
         <w:pStyle w:val="FirstParagraph"/>
       </w:pPr>
       <w:r>
-        <w:t xml:space="preserve">Two sites are excluded for mixed/contaminated assemblages (see</w:t>
+        <w:t xml:space="preserve">Two sites are excluded: Spy, because its assemblage is mixed, and El Castillo, because the Aurignacian attribution of its unit 18 is debated (see</w:t>
       </w:r>
       <w:r>
         <w:t xml:space="preserve"> </w:t>
@@ -5520,7 +5550,13 @@
                     <w:jc w:val="left"/>
                   </w:pPr>
                   <w:r>
-                    <w:t xml:space="preserve">Mixed/contaminated layers preclude reliable assignment</w:t>
+                    <w:t xml:space="preserve">Aurignacian attribution of unit 18 (the Transitional Aurignacian) is debated</w:t>
+                  </w:r>
+                  <w:r>
+                    <w:t xml:space="preserve"> </w:t>
+                  </w:r>
+                  <w:r>
+                    <w:t xml:space="preserve">[10]</w:t>
                   </w:r>
                 </w:p>
               </w:tc>
@@ -5567,7 +5603,7 @@
                     <w:t xml:space="preserve"> </w:t>
                   </w:r>
                   <w:r>
-                    <w:t xml:space="preserve">[8,9,18]</w:t>
+                    <w:t xml:space="preserve">[8,9,19]</w:t>
                   </w:r>
                 </w:p>
               </w:tc>
@@ -5583,7 +5619,7 @@
               <w:pStyle w:val="ImageCaption"/>
             </w:pPr>
             <w:r>
-              <w:t xml:space="preserve">Table S 5: Sites excluded from the analysis because of mixed/contaminated assemblages.</w:t>
+              <w:t xml:space="preserve">Table S 5: Sites excluded from the analysis because of a mixed assemblage (Spy) or a debated cultural attribution (El Castillo).</w:t>
             </w:r>
           </w:p>
           <w:bookmarkEnd w:id="40"/>
@@ -8469,7 +8505,7 @@
                     <w:t xml:space="preserve"> </w:t>
                   </w:r>
                   <w:r>
-                    <w:t xml:space="preserve">[11,12]</w:t>
+                    <w:t xml:space="preserve">[12,13]</w:t>
                   </w:r>
                   <w:r>
                     <w:t xml:space="preserve">)</w:t>
@@ -9990,7 +10026,7 @@
     </w:p>
     <w:bookmarkEnd w:id="49"/>
     <w:bookmarkEnd w:id="50"/>
-    <w:bookmarkStart w:id="89" w:name="references-cited"/>
+    <w:bookmarkStart w:id="91" w:name="references-cited"/>
     <w:p>
       <w:pPr>
         <w:pStyle w:val="Heading2"/>
@@ -9999,7 +10035,7 @@
         <w:t xml:space="preserve">References cited</w:t>
       </w:r>
     </w:p>
-    <w:bookmarkStart w:id="88" w:name="refs"/>
+    <w:bookmarkStart w:id="90" w:name="refs"/>
     <w:bookmarkStart w:id="52" w:name="ref-Chiotti_2005"/>
     <w:p>
       <w:pPr>
@@ -10736,7 +10772,7 @@
       </w:r>
     </w:p>
     <w:bookmarkEnd w:id="67"/>
-    <w:bookmarkStart w:id="69" w:name="ref-Schurch_Conard_2026_reassess"/>
+    <w:bookmarkStart w:id="69" w:name="ref-Wood_2018"/>
     <w:p>
       <w:pPr>
         <w:pStyle w:val="Bibliography"/>
@@ -10751,6 +10787,75 @@
         <w:t xml:space="preserve">	</w:t>
       </w:r>
       <w:r>
+        <w:t xml:space="preserve">Wood R, Bernaldo de Quirós F, Maíllo-Fernández J-M, Tejero J-M, Neira A, Higham T.</w:t>
+      </w:r>
+      <w:r>
+        <w:t xml:space="preserve"> </w:t>
+      </w:r>
+      <w:r>
+        <w:t xml:space="preserve">El Castillo</w:t>
+      </w:r>
+      <w:r>
+        <w:t xml:space="preserve"> </w:t>
+      </w:r>
+      <w:r>
+        <w:t xml:space="preserve">(</w:t>
+      </w:r>
+      <w:r>
+        <w:t xml:space="preserve">Cantabria</w:t>
+      </w:r>
+      <w:r>
+        <w:t xml:space="preserve">, northern</w:t>
+      </w:r>
+      <w:r>
+        <w:t xml:space="preserve"> </w:t>
+      </w:r>
+      <w:r>
+        <w:t xml:space="preserve">Iberia</w:t>
+      </w:r>
+      <w:r>
+        <w:t xml:space="preserve">) and the</w:t>
+      </w:r>
+      <w:r>
+        <w:t xml:space="preserve"> </w:t>
+      </w:r>
+      <w:r>
+        <w:t xml:space="preserve">Transitional Aurignacian</w:t>
+      </w:r>
+      <w:r>
+        <w:t xml:space="preserve">: Using radiocarbon dating to assess site taphonomy. Quaternary International 2018;474:56–70.</w:t>
+      </w:r>
+      <w:r>
+        <w:t xml:space="preserve"> </w:t>
+      </w:r>
+      <w:hyperlink r:id="rId68">
+        <w:r>
+          <w:rPr>
+            <w:rStyle w:val="Hyperlink"/>
+          </w:rPr>
+          <w:t xml:space="preserve">https://doi.org/10.1016/j.quaint.2016.03.005</w:t>
+        </w:r>
+      </w:hyperlink>
+      <w:r>
+        <w:t xml:space="preserve">.</w:t>
+      </w:r>
+    </w:p>
+    <w:bookmarkEnd w:id="69"/>
+    <w:bookmarkStart w:id="71" w:name="ref-Schurch_Conard_2026_reassess"/>
+    <w:p>
+      <w:pPr>
+        <w:pStyle w:val="Bibliography"/>
+      </w:pPr>
+      <w:r>
+        <w:t xml:space="preserve">[11]</w:t>
+      </w:r>
+      <w:r>
+        <w:t xml:space="preserve"> </w:t>
+      </w:r>
+      <w:r>
+        <w:t xml:space="preserve">	</w:t>
+      </w:r>
+      <w:r>
         <w:t xml:space="preserve">Schürch B, Conard NJ. Reassessing the cultural stratigraphy of</w:t>
       </w:r>
       <w:r>
@@ -10771,7 +10876,7 @@
       <w:r>
         <w:t xml:space="preserve"> </w:t>
       </w:r>
-      <w:hyperlink r:id="rId68">
+      <w:hyperlink r:id="rId70">
         <w:r>
           <w:rPr>
             <w:rStyle w:val="Hyperlink"/>
@@ -10783,14 +10888,14 @@
         <w:t xml:space="preserve">.</w:t>
       </w:r>
     </w:p>
-    <w:bookmarkEnd w:id="69"/>
-    <w:bookmarkStart w:id="71" w:name="ref-Falcucci_Peresani_2017"/>
+    <w:bookmarkEnd w:id="71"/>
+    <w:bookmarkStart w:id="73" w:name="ref-Falcucci_Peresani_2017"/>
     <w:p>
       <w:pPr>
         <w:pStyle w:val="Bibliography"/>
       </w:pPr>
       <w:r>
-        <w:t xml:space="preserve">[11]</w:t>
+        <w:t xml:space="preserve">[12]</w:t>
       </w:r>
       <w:r>
         <w:t xml:space="preserve"> </w:t>
@@ -10837,7 +10942,7 @@
       <w:r>
         <w:t xml:space="preserve"> </w:t>
       </w:r>
-      <w:hyperlink r:id="rId70">
+      <w:hyperlink r:id="rId72">
         <w:r>
           <w:rPr>
             <w:rStyle w:val="Hyperlink"/>
@@ -10849,14 +10954,14 @@
         <w:t xml:space="preserve">.</w:t>
       </w:r>
     </w:p>
-    <w:bookmarkEnd w:id="71"/>
-    <w:bookmarkStart w:id="73" w:name="ref-falcucci2020breaking"/>
+    <w:bookmarkEnd w:id="73"/>
+    <w:bookmarkStart w:id="75" w:name="ref-falcucci2020breaking"/>
     <w:p>
       <w:pPr>
         <w:pStyle w:val="Bibliography"/>
       </w:pPr>
       <w:r>
-        <w:t xml:space="preserve">[12]</w:t>
+        <w:t xml:space="preserve">[13]</w:t>
       </w:r>
       <w:r>
         <w:t xml:space="preserve"> </w:t>
@@ -10903,7 +11008,7 @@
       <w:r>
         <w:t xml:space="preserve"> </w:t>
       </w:r>
-      <w:hyperlink r:id="rId72">
+      <w:hyperlink r:id="rId74">
         <w:r>
           <w:rPr>
             <w:rStyle w:val="Hyperlink"/>
@@ -10915,14 +11020,14 @@
         <w:t xml:space="preserve">.</w:t>
       </w:r>
     </w:p>
-    <w:bookmarkEnd w:id="73"/>
-    <w:bookmarkStart w:id="75" w:name="ref-Barshay_Szmidt_2012"/>
+    <w:bookmarkEnd w:id="75"/>
+    <w:bookmarkStart w:id="77" w:name="ref-Barshay_Szmidt_2012"/>
     <w:p>
       <w:pPr>
         <w:pStyle w:val="Bibliography"/>
       </w:pPr>
       <w:r>
-        <w:t xml:space="preserve">[13]</w:t>
+        <w:t xml:space="preserve">[14]</w:t>
       </w:r>
       <w:r>
         <w:t xml:space="preserve"> </w:t>
@@ -11044,7 +11149,7 @@
       <w:r>
         <w:t xml:space="preserve"> </w:t>
       </w:r>
-      <w:hyperlink r:id="rId74">
+      <w:hyperlink r:id="rId76">
         <w:r>
           <w:rPr>
             <w:rStyle w:val="Hyperlink"/>
@@ -11056,14 +11161,14 @@
         <w:t xml:space="preserve">.</w:t>
       </w:r>
     </w:p>
-    <w:bookmarkEnd w:id="75"/>
-    <w:bookmarkStart w:id="77" w:name="ref-Oliva_2006"/>
+    <w:bookmarkEnd w:id="77"/>
+    <w:bookmarkStart w:id="79" w:name="ref-Oliva_2006"/>
     <w:p>
       <w:pPr>
         <w:pStyle w:val="Bibliography"/>
       </w:pPr>
       <w:r>
-        <w:t xml:space="preserve">[14]</w:t>
+        <w:t xml:space="preserve">[15]</w:t>
       </w:r>
       <w:r>
         <w:t xml:space="preserve"> </w:t>
@@ -11125,7 +11230,7 @@
       <w:r>
         <w:t xml:space="preserve"> </w:t>
       </w:r>
-      <w:hyperlink r:id="rId76">
+      <w:hyperlink r:id="rId78">
         <w:r>
           <w:rPr>
             <w:rStyle w:val="Hyperlink"/>
@@ -11137,14 +11242,14 @@
         <w:t xml:space="preserve">.</w:t>
       </w:r>
     </w:p>
-    <w:bookmarkEnd w:id="77"/>
-    <w:bookmarkStart w:id="79" w:name="ref-Higham_2012"/>
+    <w:bookmarkEnd w:id="79"/>
+    <w:bookmarkStart w:id="81" w:name="ref-Higham_2012"/>
     <w:p>
       <w:pPr>
         <w:pStyle w:val="Bibliography"/>
       </w:pPr>
       <w:r>
-        <w:t xml:space="preserve">[15]</w:t>
+        <w:t xml:space="preserve">[16]</w:t>
       </w:r>
       <w:r>
         <w:t xml:space="preserve"> </w:t>
@@ -11191,7 +11296,7 @@
       <w:r>
         <w:t xml:space="preserve"> </w:t>
       </w:r>
-      <w:hyperlink r:id="rId78">
+      <w:hyperlink r:id="rId80">
         <w:r>
           <w:rPr>
             <w:rStyle w:val="Hyperlink"/>
@@ -11203,14 +11308,14 @@
         <w:t xml:space="preserve">.</w:t>
       </w:r>
     </w:p>
-    <w:bookmarkEnd w:id="79"/>
-    <w:bookmarkStart w:id="81" w:name="ref-zilhao2003aurignacian"/>
+    <w:bookmarkEnd w:id="81"/>
+    <w:bookmarkStart w:id="83" w:name="ref-zilhao2003aurignacian"/>
     <w:p>
       <w:pPr>
         <w:pStyle w:val="Bibliography"/>
       </w:pPr>
       <w:r>
-        <w:t xml:space="preserve">[16]</w:t>
+        <w:t xml:space="preserve">[17]</w:t>
       </w:r>
       <w:r>
         <w:t xml:space="preserve"> </w:t>
@@ -11305,7 +11410,7 @@
       <w:r>
         <w:t xml:space="preserve"> </w:t>
       </w:r>
-      <w:hyperlink r:id="rId80">
+      <w:hyperlink r:id="rId82">
         <w:r>
           <w:rPr>
             <w:rStyle w:val="Hyperlink"/>
@@ -11317,14 +11422,14 @@
         <w:t xml:space="preserve">.</w:t>
       </w:r>
     </w:p>
-    <w:bookmarkEnd w:id="81"/>
-    <w:bookmarkStart w:id="83" w:name="ref-Schurch_et_al_2025_bladelet"/>
+    <w:bookmarkEnd w:id="83"/>
+    <w:bookmarkStart w:id="85" w:name="ref-Schurch_et_al_2025_bladelet"/>
     <w:p>
       <w:pPr>
         <w:pStyle w:val="Bibliography"/>
       </w:pPr>
       <w:r>
-        <w:t xml:space="preserve">[17]</w:t>
+        <w:t xml:space="preserve">[18]</w:t>
       </w:r>
       <w:r>
         <w:t xml:space="preserve"> </w:t>
@@ -11359,7 +11464,7 @@
       <w:r>
         <w:t xml:space="preserve"> </w:t>
       </w:r>
-      <w:hyperlink r:id="rId82">
+      <w:hyperlink r:id="rId84">
         <w:r>
           <w:rPr>
             <w:rStyle w:val="Hyperlink"/>
@@ -11371,14 +11476,14 @@
         <w:t xml:space="preserve">.</w:t>
       </w:r>
     </w:p>
-    <w:bookmarkEnd w:id="83"/>
-    <w:bookmarkStart w:id="85" w:name="ref-Semal_2009"/>
+    <w:bookmarkEnd w:id="85"/>
+    <w:bookmarkStart w:id="87" w:name="ref-Semal_2009"/>
     <w:p>
       <w:pPr>
         <w:pStyle w:val="Bibliography"/>
       </w:pPr>
       <w:r>
-        <w:t xml:space="preserve">[18]</w:t>
+        <w:t xml:space="preserve">[19]</w:t>
       </w:r>
       <w:r>
         <w:t xml:space="preserve"> </w:t>
@@ -11419,7 +11524,7 @@
       <w:r>
         <w:t xml:space="preserve"> </w:t>
       </w:r>
-      <w:hyperlink r:id="rId84">
+      <w:hyperlink r:id="rId86">
         <w:r>
           <w:rPr>
             <w:rStyle w:val="Hyperlink"/>
@@ -11431,14 +11536,14 @@
         <w:t xml:space="preserve">.</w:t>
       </w:r>
     </w:p>
-    <w:bookmarkEnd w:id="85"/>
-    <w:bookmarkStart w:id="87" w:name="ref-Deschamps_2019"/>
+    <w:bookmarkEnd w:id="87"/>
+    <w:bookmarkStart w:id="89" w:name="ref-Deschamps_2019"/>
     <w:p>
       <w:pPr>
         <w:pStyle w:val="Bibliography"/>
       </w:pPr>
       <w:r>
-        <w:t xml:space="preserve">[19]</w:t>
+        <w:t xml:space="preserve">[20]</w:t>
       </w:r>
       <w:r>
         <w:t xml:space="preserve"> </w:t>
@@ -11515,7 +11620,7 @@
       <w:r>
         <w:t xml:space="preserve"> </w:t>
       </w:r>
-      <w:hyperlink r:id="rId86">
+      <w:hyperlink r:id="rId88">
         <w:r>
           <w:rPr>
             <w:rStyle w:val="Hyperlink"/>
@@ -11527,9 +11632,9 @@
         <w:t xml:space="preserve">.</w:t>
       </w:r>
     </w:p>
-    <w:bookmarkEnd w:id="87"/>
-    <w:bookmarkEnd w:id="88"/>
     <w:bookmarkEnd w:id="89"/>
+    <w:bookmarkEnd w:id="90"/>
+    <w:bookmarkEnd w:id="91"/>
     <w:sectPr>
       <w:footnotePr>
         <w:numRestart w:val="eachSect"/>

</xml_diff>

<commit_message>
checking consistency between claims and evidence
</commit_message>
<xml_diff>
--- a/paper/S2-supplement-site-assignment.docx
+++ b/paper/S2-supplement-site-assignment.docx
@@ -2647,10 +2647,13 @@
         <w:pStyle w:val="Compact"/>
       </w:pPr>
       <w:r>
+        <w:t xml:space="preserve">Bataille and Conard</w:t>
+      </w:r>
+      <w:r>
+        <w:t xml:space="preserve"> </w:t>
+      </w:r>
+      <w:r>
         <w:t xml:space="preserve">[5]</w:t>
-      </w:r>
-      <w:r>
-        <w:t xml:space="preserve"> </w:t>
       </w:r>
       <w:r>
         <w:t xml:space="preserve">: AH IV is a</w:t>
@@ -2683,10 +2686,13 @@
         <w:pStyle w:val="Compact"/>
       </w:pPr>
       <w:r>
+        <w:t xml:space="preserve">Bataille and Conard</w:t>
+      </w:r>
+      <w:r>
+        <w:t xml:space="preserve"> </w:t>
+      </w:r>
+      <w:r>
         <w:t xml:space="preserve">[6]</w:t>
-      </w:r>
-      <w:r>
-        <w:t xml:space="preserve"> </w:t>
       </w:r>
       <w:r>
         <w:t xml:space="preserve">: AH IIIa and IV share similar tool/core assemblages typical of the Swabian Aurignacian, forming a coherent upper unit that contrasts with AH V.</w:t>
@@ -2701,10 +2707,13 @@
         <w:pStyle w:val="Compact"/>
       </w:pPr>
       <w:r>
+        <w:t xml:space="preserve">Dinnis et al.</w:t>
+      </w:r>
+      <w:r>
+        <w:t xml:space="preserve"> </w:t>
+      </w:r>
+      <w:r>
         <w:t xml:space="preserve">[7]</w:t>
-      </w:r>
-      <w:r>
-        <w:t xml:space="preserve"> </w:t>
       </w:r>
       <w:r>
         <w:t xml:space="preserve">: Hohle Fels IV shows</w:t>
@@ -2786,10 +2795,13 @@
         <w:pStyle w:val="Compact"/>
       </w:pPr>
       <w:r>
+        <w:t xml:space="preserve">Bataille and Conard</w:t>
+      </w:r>
+      <w:r>
+        <w:t xml:space="preserve"> </w:t>
+      </w:r>
+      <w:r>
         <w:t xml:space="preserve">[5]</w:t>
-      </w:r>
-      <w:r>
-        <w:t xml:space="preserve"> </w:t>
       </w:r>
       <w:r>
         <w:t xml:space="preserve">: The Geissenklösterle Aurignacian (AH III and II) is assigned to the Early Aurignacian on technological grounds.</w:t>
@@ -2804,10 +2816,13 @@
         <w:pStyle w:val="Compact"/>
       </w:pPr>
       <w:r>
+        <w:t xml:space="preserve">Higham et al.</w:t>
+      </w:r>
+      <w:r>
+        <w:t xml:space="preserve"> </w:t>
+      </w:r>
+      <w:r>
         <w:t xml:space="preserve">[16]</w:t>
-      </w:r>
-      <w:r>
-        <w:t xml:space="preserve"> </w:t>
       </w:r>
       <w:r>
         <w:t xml:space="preserve">: Radiocarbon chronology of Geißenklösterle provides the direct dating basis for this assignment.</w:t>
@@ -2886,10 +2901,13 @@
         <w:pStyle w:val="Compact"/>
       </w:pPr>
       <w:r>
+        <w:t xml:space="preserve">Schürch and Conard</w:t>
+      </w:r>
+      <w:r>
+        <w:t xml:space="preserve"> </w:t>
+      </w:r>
+      <w:r>
         <w:t xml:space="preserve">[11]</w:t>
-      </w:r>
-      <w:r>
-        <w:t xml:space="preserve"> </w:t>
       </w:r>
       <w:r>
         <w:t xml:space="preserve">: Reassesses cultural stratigraphy; AH IV–V are Aurignacian but with severe mixing (38 refit connections between layers); 15 radiocarbon dates span 42–34.5 ka cal BP; Gravettian also present.</w:t>
@@ -2904,10 +2922,13 @@
         <w:pStyle w:val="Compact"/>
       </w:pPr>
       <w:r>
+        <w:t xml:space="preserve">Schürch et al.</w:t>
+      </w:r>
+      <w:r>
+        <w:t xml:space="preserve"> </w:t>
+      </w:r>
+      <w:r>
         <w:t xml:space="preserve">[18]</w:t>
-      </w:r>
-      <w:r>
-        <w:t xml:space="preserve"> </w:t>
       </w:r>
       <w:r>
         <w:t xml:space="preserve">: Blade/bladelet production analysis; mixing documented but majority of artifacts are Aurignacian.</w:t>
@@ -2932,10 +2953,13 @@
         <w:pStyle w:val="Compact"/>
       </w:pPr>
       <w:r>
+        <w:t xml:space="preserve">Falcucci et al.</w:t>
+      </w:r>
+      <w:r>
+        <w:t xml:space="preserve"> </w:t>
+      </w:r>
+      <w:r>
         <w:t xml:space="preserve">[12]</w:t>
-      </w:r>
-      <w:r>
-        <w:t xml:space="preserve"> </w:t>
       </w:r>
       <w:r>
         <w:t xml:space="preserve">: Protoaurignacian techno-typology persists throughout sequence at Fumane (A2-A1 through D3).</w:t>
@@ -2950,10 +2974,13 @@
         <w:pStyle w:val="Compact"/>
       </w:pPr>
       <w:r>
+        <w:t xml:space="preserve">Falcucci et al.</w:t>
+      </w:r>
+      <w:r>
+        <w:t xml:space="preserve"> </w:t>
+      </w:r>
+      <w:r>
         <w:t xml:space="preserve">[13]</w:t>
-      </w:r>
-      <w:r>
-        <w:t xml:space="preserve"> </w:t>
       </w:r>
       <w:r>
         <w:t xml:space="preserve">:</w:t>
@@ -2990,10 +3017,13 @@
         <w:pStyle w:val="Compact"/>
       </w:pPr>
       <w:r>
+        <w:t xml:space="preserve">Talamo et al.</w:t>
+      </w:r>
+      <w:r>
+        <w:t xml:space="preserve"> </w:t>
+      </w:r>
+      <w:r>
         <w:t xml:space="preserve">[3]</w:t>
-      </w:r>
-      <w:r>
-        <w:t xml:space="preserve"> </w:t>
       </w:r>
       <w:r>
         <w:t xml:space="preserve">: Technological attribution places La Ferrassie in the Early Aurignacian.</w:t>
@@ -3018,10 +3048,13 @@
         <w:pStyle w:val="Compact"/>
       </w:pPr>
       <w:r>
+        <w:t xml:space="preserve">Chiotti</w:t>
+      </w:r>
+      <w:r>
+        <w:t xml:space="preserve"> </w:t>
+      </w:r>
+      <w:r>
         <w:t xml:space="preserve">[1]</w:t>
-      </w:r>
-      <w:r>
-        <w:t xml:space="preserve"> </w:t>
       </w:r>
       <w:r>
         <w:t xml:space="preserve">: Technological analysis assigns Abri Pataud to the Early Aurignacian.</w:t>
@@ -3036,10 +3069,13 @@
         <w:pStyle w:val="Compact"/>
       </w:pPr>
       <w:r>
+        <w:t xml:space="preserve">Higham et al.</w:t>
+      </w:r>
+      <w:r>
+        <w:t xml:space="preserve"> </w:t>
+      </w:r>
+      <w:r>
         <w:t xml:space="preserve">[2]</w:t>
-      </w:r>
-      <w:r>
-        <w:t xml:space="preserve"> </w:t>
       </w:r>
       <w:r>
         <w:t xml:space="preserve">: Radiocarbon dating supports Early Aurignacian placement.</w:t>
@@ -3064,10 +3100,13 @@
         <w:pStyle w:val="Compact"/>
       </w:pPr>
       <w:r>
+        <w:t xml:space="preserve">Oliva</w:t>
+      </w:r>
+      <w:r>
+        <w:t xml:space="preserve"> </w:t>
+      </w:r>
+      <w:r>
         <w:t xml:space="preserve">[15]</w:t>
-      </w:r>
-      <w:r>
-        <w:t xml:space="preserve"> </w:t>
       </w:r>
       <w:r>
         <w:t xml:space="preserve">: Technological and typological analysis assigns Mladeč to the Evolved Aurignacian.</w:t>
@@ -3082,10 +3121,13 @@
         <w:pStyle w:val="Compact"/>
       </w:pPr>
       <w:r>
+        <w:t xml:space="preserve">Wild et al.</w:t>
+      </w:r>
+      <w:r>
+        <w:t xml:space="preserve"> </w:t>
+      </w:r>
+      <w:r>
         <w:t xml:space="preserve">[4]</w:t>
-      </w:r>
-      <w:r>
-        <w:t xml:space="preserve"> </w:t>
       </w:r>
       <w:r>
         <w:t xml:space="preserve">: Direct AMS dates of ~31 ka ¹⁴C BP (~35–36 ka cal BP) support an Evolved Aurignacian attribution.</w:t>
@@ -3110,10 +3152,13 @@
         <w:pStyle w:val="Compact"/>
       </w:pPr>
       <w:r>
+        <w:t xml:space="preserve">Flas et al.</w:t>
+      </w:r>
+      <w:r>
+        <w:t xml:space="preserve"> </w:t>
+      </w:r>
+      <w:r>
         <w:t xml:space="preserve">[8]</w:t>
-      </w:r>
-      <w:r>
-        <w:t xml:space="preserve"> </w:t>
       </w:r>
       <w:r>
         <w:t xml:space="preserve">: The Spy Aurignacian assemblage exhibits features of both Early and Late Aurignacian phases. Split-based osseous points suggest Early Aurignacian; small curved bladelets from nosed endscrapers, burins busqués, and Vachons burins suggest Late Aurignacian.</w:t>
@@ -3128,10 +3173,13 @@
         <w:pStyle w:val="Compact"/>
       </w:pPr>
       <w:r>
+        <w:t xml:space="preserve">Flas</w:t>
+      </w:r>
+      <w:r>
+        <w:t xml:space="preserve"> </w:t>
+      </w:r>
+      <w:r>
         <w:t xml:space="preserve">[9]</w:t>
-      </w:r>
-      <w:r>
-        <w:t xml:space="preserve"> </w:t>
       </w:r>
       <w:r>
         <w:t xml:space="preserve">: The Aurignacian at Spy is a mixed assemblage containing a small Early Aurignacian component and several Late Aurignacian components. The earliest convincing Aurignacian date in the region is about 33,000–32,000 BP.</w:t>
@@ -3146,10 +3194,13 @@
         <w:pStyle w:val="Compact"/>
       </w:pPr>
       <w:r>
+        <w:t xml:space="preserve">Semal et al.</w:t>
+      </w:r>
+      <w:r>
+        <w:t xml:space="preserve"> </w:t>
+      </w:r>
+      <w:r>
         <w:t xml:space="preserve">[19]</w:t>
-      </w:r>
-      <w:r>
-        <w:t xml:space="preserve"> </w:t>
       </w:r>
       <w:r>
         <w:t xml:space="preserve">: The Spy Neandertals date to ~36,000 BP, associated with the Lincombian-Ranisian-Jerzmanowician (LRJ). The LRJ and Aurignacian are mixed in the</w:t>
@@ -3216,10 +3267,13 @@
         <w:pStyle w:val="Compact"/>
       </w:pPr>
       <w:r>
+        <w:t xml:space="preserve">Barshay-Szmidt et al.</w:t>
+      </w:r>
+      <w:r>
+        <w:t xml:space="preserve"> </w:t>
+      </w:r>
+      <w:r>
         <w:t xml:space="preserve">[14]</w:t>
-      </w:r>
-      <w:r>
-        <w:t xml:space="preserve"> </w:t>
       </w:r>
       <w:r>
         <w:t xml:space="preserve">: Layer Cjn2 is a Proto-Aurignacian —</w:t>
@@ -3264,10 +3318,13 @@
         <w:pStyle w:val="Compact"/>
       </w:pPr>
       <w:r>
+        <w:t xml:space="preserve">Deschamps</w:t>
+      </w:r>
+      <w:r>
+        <w:t xml:space="preserve"> </w:t>
+      </w:r>
+      <w:r>
         <w:t xml:space="preserve">[20]</w:t>
-      </w:r>
-      <w:r>
-        <w:t xml:space="preserve"> </w:t>
       </w:r>
       <w:r>
         <w:t xml:space="preserve">: Confirms complex stratigraphy and mixing concerns, but notes Cjn2 is internally coherent in the anterior zone.</w:t>
@@ -3292,10 +3349,13 @@
         <w:pStyle w:val="Compact"/>
       </w:pPr>
       <w:r>
+        <w:t xml:space="preserve">Wood et al.</w:t>
+      </w:r>
+      <w:r>
+        <w:t xml:space="preserve"> </w:t>
+      </w:r>
+      <w:r>
         <w:t xml:space="preserve">[10]</w:t>
-      </w:r>
-      <w:r>
-        <w:t xml:space="preserve"> </w:t>
       </w:r>
       <w:r>
         <w:t xml:space="preserve">: The SignBase objects come from layer 18b of the modern excavations. This unit is the basis of the proposed</w:t>
@@ -10042,7 +10102,7 @@
         <w:pStyle w:val="Bibliography"/>
       </w:pPr>
       <w:r>
-        <w:t xml:space="preserve">[1]</w:t>
+        <w:t xml:space="preserve">1.</w:t>
       </w:r>
       <w:r>
         <w:t xml:space="preserve"> </w:t>
@@ -10078,22 +10138,16 @@
         <w:t xml:space="preserve">France</w:t>
       </w:r>
       <w:r>
-        <w:t xml:space="preserve">. Oxford: Archaeopress; 2005.</w:t>
-      </w:r>
-      <w:r>
-        <w:t xml:space="preserve"> </w:t>
+        <w:t xml:space="preserve">. Oxford: Archaeopress; 2005. doi:</w:t>
       </w:r>
       <w:hyperlink r:id="rId51">
         <w:r>
           <w:rPr>
             <w:rStyle w:val="Hyperlink"/>
           </w:rPr>
-          <w:t xml:space="preserve">https://doi.org/10.30861/9781841718309</w:t>
+          <w:t xml:space="preserve">10.30861/9781841718309</w:t>
         </w:r>
       </w:hyperlink>
-      <w:r>
-        <w:t xml:space="preserve">.</w:t>
-      </w:r>
     </w:p>
     <w:bookmarkEnd w:id="52"/>
     <w:bookmarkStart w:id="54" w:name="ref-Higham_Abri_Pataud_2011"/>
@@ -10102,7 +10156,7 @@
         <w:pStyle w:val="Bibliography"/>
       </w:pPr>
       <w:r>
-        <w:t xml:space="preserve">[2]</w:t>
+        <w:t xml:space="preserve">2.</w:t>
       </w:r>
       <w:r>
         <w:t xml:space="preserve"> </w:t>
@@ -10150,22 +10204,16 @@
         <w:t xml:space="preserve"> </w:t>
       </w:r>
       <w:r>
-        <w:t xml:space="preserve">sequence. Journal of Human Evolution 2011;61:549–63.</w:t>
-      </w:r>
-      <w:r>
-        <w:t xml:space="preserve"> </w:t>
+        <w:t xml:space="preserve">sequence. J Hum Evol. 2011;61: 549–563. doi:</w:t>
       </w:r>
       <w:hyperlink r:id="rId53">
         <w:r>
           <w:rPr>
             <w:rStyle w:val="Hyperlink"/>
           </w:rPr>
-          <w:t xml:space="preserve">https://doi.org/10.1016/j.jhevol.2011.06.005</w:t>
+          <w:t xml:space="preserve">10.1016/j.jhevol.2011.06.005</w:t>
         </w:r>
       </w:hyperlink>
-      <w:r>
-        <w:t xml:space="preserve">.</w:t>
-      </w:r>
     </w:p>
     <w:bookmarkEnd w:id="54"/>
     <w:bookmarkStart w:id="56" w:name="ref-Talamo_La_Ferrassie_2020"/>
@@ -10174,7 +10222,7 @@
         <w:pStyle w:val="Bibliography"/>
       </w:pPr>
       <w:r>
-        <w:t xml:space="preserve">[3]</w:t>
+        <w:t xml:space="preserve">3.</w:t>
       </w:r>
       <w:r>
         <w:t xml:space="preserve"> </w:t>
@@ -10264,22 +10312,16 @@
         <w:t xml:space="preserve">France</w:t>
       </w:r>
       <w:r>
-        <w:t xml:space="preserve">. Journal of Quaternary Science 2020;35:961–73.</w:t>
-      </w:r>
-      <w:r>
-        <w:t xml:space="preserve"> </w:t>
+        <w:t xml:space="preserve">. J Quat Sci. 2020;35: 961–973. doi:</w:t>
       </w:r>
       <w:hyperlink r:id="rId55">
         <w:r>
           <w:rPr>
             <w:rStyle w:val="Hyperlink"/>
           </w:rPr>
-          <w:t xml:space="preserve">https://doi.org/10.1002/jqs.3236</w:t>
+          <w:t xml:space="preserve">10.1002/jqs.3236</w:t>
         </w:r>
       </w:hyperlink>
-      <w:r>
-        <w:t xml:space="preserve">.</w:t>
-      </w:r>
     </w:p>
     <w:bookmarkEnd w:id="56"/>
     <w:bookmarkStart w:id="58" w:name="ref-Wild_et_al_2005"/>
@@ -10288,7 +10330,7 @@
         <w:pStyle w:val="Bibliography"/>
       </w:pPr>
       <w:r>
-        <w:t xml:space="preserve">[4]</w:t>
+        <w:t xml:space="preserve">4.</w:t>
       </w:r>
       <w:r>
         <w:t xml:space="preserve"> </w:t>
@@ -10333,22 +10375,16 @@
         <w:t xml:space="preserve">č</w:t>
       </w:r>
       <w:r>
-        <w:t xml:space="preserve">. Nature 2005;435:332–5.</w:t>
-      </w:r>
-      <w:r>
-        <w:t xml:space="preserve"> </w:t>
+        <w:t xml:space="preserve">. Nature. 2005;435: 332–335. doi:</w:t>
       </w:r>
       <w:hyperlink r:id="rId57">
         <w:r>
           <w:rPr>
             <w:rStyle w:val="Hyperlink"/>
           </w:rPr>
-          <w:t xml:space="preserve">https://doi.org/10.1038/nature03585</w:t>
+          <w:t xml:space="preserve">10.1038/nature03585</w:t>
         </w:r>
       </w:hyperlink>
-      <w:r>
-        <w:t xml:space="preserve">.</w:t>
-      </w:r>
     </w:p>
     <w:bookmarkEnd w:id="58"/>
     <w:bookmarkStart w:id="60" w:name="ref-Bataille_Conard_2018"/>
@@ -10357,7 +10393,7 @@
         <w:pStyle w:val="Bibliography"/>
       </w:pPr>
       <w:r>
-        <w:t xml:space="preserve">[5]</w:t>
+        <w:t xml:space="preserve">5.</w:t>
       </w:r>
       <w:r>
         <w:t xml:space="preserve"> </w:t>
@@ -10420,22 +10456,16 @@
         <w:t xml:space="preserve">Central Europe</w:t>
       </w:r>
       <w:r>
-        <w:t xml:space="preserve">. PLOS ONE 2018;13:e0194097.</w:t>
-      </w:r>
-      <w:r>
-        <w:t xml:space="preserve"> </w:t>
+        <w:t xml:space="preserve">. PLoS One. 2018;13: e0194097. doi:</w:t>
       </w:r>
       <w:hyperlink r:id="rId59">
         <w:r>
           <w:rPr>
             <w:rStyle w:val="Hyperlink"/>
           </w:rPr>
-          <w:t xml:space="preserve">https://doi.org/10.1371/journal.pone.0194097</w:t>
+          <w:t xml:space="preserve">10.1371/journal.pone.0194097</w:t>
         </w:r>
       </w:hyperlink>
-      <w:r>
-        <w:t xml:space="preserve">.</w:t>
-      </w:r>
     </w:p>
     <w:bookmarkEnd w:id="60"/>
     <w:bookmarkStart w:id="62" w:name="ref-Bataille_Conard_2019"/>
@@ -10444,7 +10474,7 @@
         <w:pStyle w:val="Bibliography"/>
       </w:pPr>
       <w:r>
-        <w:t xml:space="preserve">[6]</w:t>
+        <w:t xml:space="preserve">6.</w:t>
       </w:r>
       <w:r>
         <w:t xml:space="preserve"> </w:t>
@@ -10507,22 +10537,16 @@
         <w:t xml:space="preserve">Southwestern Germany</w:t>
       </w:r>
       <w:r>
-        <w:t xml:space="preserve">). Quartär 2018;65:7–49.</w:t>
-      </w:r>
-      <w:r>
-        <w:t xml:space="preserve"> </w:t>
+        <w:t xml:space="preserve">). Quartar. 2018;65: 7–49. doi:</w:t>
       </w:r>
       <w:hyperlink r:id="rId61">
         <w:r>
           <w:rPr>
             <w:rStyle w:val="Hyperlink"/>
           </w:rPr>
-          <w:t xml:space="preserve">https://doi.org/10.7485/QU65_1</w:t>
+          <w:t xml:space="preserve">10.7485/QU65_1</w:t>
         </w:r>
       </w:hyperlink>
-      <w:r>
-        <w:t xml:space="preserve">.</w:t>
-      </w:r>
     </w:p>
     <w:bookmarkEnd w:id="62"/>
     <w:bookmarkStart w:id="64" w:name="ref-Dinnis_et_al_2019"/>
@@ -10531,7 +10555,7 @@
         <w:pStyle w:val="Bibliography"/>
       </w:pPr>
       <w:r>
-        <w:t xml:space="preserve">[7]</w:t>
+        <w:t xml:space="preserve">7.</w:t>
       </w:r>
       <w:r>
         <w:t xml:space="preserve"> </w:t>
@@ -10564,22 +10588,16 @@
         <w:t xml:space="preserve">Hohle Fels IV</w:t>
       </w:r>
       <w:r>
-        <w:t xml:space="preserve">. Proceedings of the Prehistoric Society 2019;85:29–60.</w:t>
-      </w:r>
-      <w:r>
-        <w:t xml:space="preserve"> </w:t>
+        <w:t xml:space="preserve">. Proc Prehist Soc. 2019;85: 29–60. doi:</w:t>
       </w:r>
       <w:hyperlink r:id="rId63">
         <w:r>
           <w:rPr>
             <w:rStyle w:val="Hyperlink"/>
           </w:rPr>
-          <w:t xml:space="preserve">https://doi.org/10.1017/ppr.2019.11</w:t>
+          <w:t xml:space="preserve">10.1017/ppr.2019.11</w:t>
         </w:r>
       </w:hyperlink>
-      <w:r>
-        <w:t xml:space="preserve">.</w:t>
-      </w:r>
     </w:p>
     <w:bookmarkEnd w:id="64"/>
     <w:bookmarkStart w:id="65" w:name="ref-Flas_et_al_2013"/>
@@ -10588,7 +10606,7 @@
         <w:pStyle w:val="Bibliography"/>
       </w:pPr>
       <w:r>
-        <w:t xml:space="preserve">[8]</w:t>
+        <w:t xml:space="preserve">8.</w:t>
       </w:r>
       <w:r>
         <w:t xml:space="preserve"> </w:t>
@@ -10630,7 +10648,7 @@
         <w:t xml:space="preserve"> </w:t>
       </w:r>
       <w:r>
-        <w:t xml:space="preserve">cave. 125 years of multidisciplinary research at the</w:t>
+        <w:t xml:space="preserve">cave 125 years of multidisciplinary research at the</w:t>
       </w:r>
       <w:r>
         <w:t xml:space="preserve"> </w:t>
@@ -10684,7 +10702,10 @@
         <w:t xml:space="preserve">Belgium</w:t>
       </w:r>
       <w:r>
-        <w:t xml:space="preserve">), volume 1, vol. 123/2012, Royal Belgian Institute of Natural Sciences, Royal Belgian Society of Anthropology; Prehistory,; NESPOS Society; 2013, p. 231–55.</w:t>
+        <w:t xml:space="preserve">), volume 1. Royal Belgian Institute of Natural Sciences, Royal Belgian Society of Anthropology; Prehistory,; NESPOS Society; 2013. pp. 231–255.</w:t>
+      </w:r>
+      <w:r>
+        <w:t xml:space="preserve"> </w:t>
       </w:r>
     </w:p>
     <w:bookmarkEnd w:id="65"/>
@@ -10694,7 +10715,7 @@
         <w:pStyle w:val="Bibliography"/>
       </w:pPr>
       <w:r>
-        <w:t xml:space="preserve">[9]</w:t>
+        <w:t xml:space="preserve">9.</w:t>
       </w:r>
       <w:r>
         <w:t xml:space="preserve"> </w:t>
@@ -10754,22 +10775,16 @@
         <w:t xml:space="preserve">Europe</w:t>
       </w:r>
       <w:r>
-        <w:t xml:space="preserve">, vol. 7, Palethnology, Toulouse; 2015, p. 57–75.</w:t>
-      </w:r>
-      <w:r>
-        <w:t xml:space="preserve"> </w:t>
+        <w:t xml:space="preserve">. Palethnology, Toulouse; 2015. pp. 57–75. doi:</w:t>
       </w:r>
       <w:hyperlink r:id="rId66">
         <w:r>
           <w:rPr>
             <w:rStyle w:val="Hyperlink"/>
           </w:rPr>
-          <w:t xml:space="preserve">https://doi.org/10.4000/palethnologie.736</w:t>
+          <w:t xml:space="preserve">10.4000/palethnologie.736</w:t>
         </w:r>
       </w:hyperlink>
-      <w:r>
-        <w:t xml:space="preserve">.</w:t>
-      </w:r>
     </w:p>
     <w:bookmarkEnd w:id="67"/>
     <w:bookmarkStart w:id="69" w:name="ref-Wood_2018"/>
@@ -10778,7 +10793,7 @@
         <w:pStyle w:val="Bibliography"/>
       </w:pPr>
       <w:r>
-        <w:t xml:space="preserve">[10]</w:t>
+        <w:t xml:space="preserve">10.</w:t>
       </w:r>
       <w:r>
         <w:t xml:space="preserve"> </w:t>
@@ -10823,22 +10838,16 @@
         <w:t xml:space="preserve">Transitional Aurignacian</w:t>
       </w:r>
       <w:r>
-        <w:t xml:space="preserve">: Using radiocarbon dating to assess site taphonomy. Quaternary International 2018;474:56–70.</w:t>
-      </w:r>
-      <w:r>
-        <w:t xml:space="preserve"> </w:t>
+        <w:t xml:space="preserve">: Using radiocarbon dating to assess site taphonomy. Quat Int. 2018;474: 56–70. doi:</w:t>
       </w:r>
       <w:hyperlink r:id="rId68">
         <w:r>
           <w:rPr>
             <w:rStyle w:val="Hyperlink"/>
           </w:rPr>
-          <w:t xml:space="preserve">https://doi.org/10.1016/j.quaint.2016.03.005</w:t>
+          <w:t xml:space="preserve">10.1016/j.quaint.2016.03.005</w:t>
         </w:r>
       </w:hyperlink>
-      <w:r>
-        <w:t xml:space="preserve">.</w:t>
-      </w:r>
     </w:p>
     <w:bookmarkEnd w:id="69"/>
     <w:bookmarkStart w:id="71" w:name="ref-Schurch_Conard_2026_reassess"/>
@@ -10847,7 +10856,7 @@
         <w:pStyle w:val="Bibliography"/>
       </w:pPr>
       <w:r>
-        <w:t xml:space="preserve">[11]</w:t>
+        <w:t xml:space="preserve">11.</w:t>
       </w:r>
       <w:r>
         <w:t xml:space="preserve"> </w:t>
@@ -10871,22 +10880,16 @@
         <w:t xml:space="preserve">Cave</w:t>
       </w:r>
       <w:r>
-        <w:t xml:space="preserve">. Journal of Paleolithic Archaeology 2026;9.</w:t>
-      </w:r>
-      <w:r>
-        <w:t xml:space="preserve"> </w:t>
+        <w:t xml:space="preserve">. J Paleolit Archaeol. 2026;9. doi:</w:t>
       </w:r>
       <w:hyperlink r:id="rId70">
         <w:r>
           <w:rPr>
             <w:rStyle w:val="Hyperlink"/>
           </w:rPr>
-          <w:t xml:space="preserve">https://doi.org/10.1007/s41982-025-00246-x</w:t>
+          <w:t xml:space="preserve">10.1007/s41982-025-00246-x</w:t>
         </w:r>
       </w:hyperlink>
-      <w:r>
-        <w:t xml:space="preserve">.</w:t>
-      </w:r>
     </w:p>
     <w:bookmarkEnd w:id="71"/>
     <w:bookmarkStart w:id="73" w:name="ref-Falcucci_Peresani_2017"/>
@@ -10895,7 +10898,7 @@
         <w:pStyle w:val="Bibliography"/>
       </w:pPr>
       <w:r>
-        <w:t xml:space="preserve">[12]</w:t>
+        <w:t xml:space="preserve">12.</w:t>
       </w:r>
       <w:r>
         <w:t xml:space="preserve"> </w:t>
@@ -10937,22 +10940,16 @@
         <w:t xml:space="preserve">Aurignacian</w:t>
       </w:r>
       <w:r>
-        <w:t xml:space="preserve">. PLOS ONE 2017;12:e0189241.</w:t>
-      </w:r>
-      <w:r>
-        <w:t xml:space="preserve"> </w:t>
+        <w:t xml:space="preserve">. PLoS One. 2017;12: e0189241. doi:</w:t>
       </w:r>
       <w:hyperlink r:id="rId72">
         <w:r>
           <w:rPr>
             <w:rStyle w:val="Hyperlink"/>
           </w:rPr>
-          <w:t xml:space="preserve">https://doi.org/10.1371/journal.pone.0189241</w:t>
+          <w:t xml:space="preserve">10.1371/journal.pone.0189241</w:t>
         </w:r>
       </w:hyperlink>
-      <w:r>
-        <w:t xml:space="preserve">.</w:t>
-      </w:r>
     </w:p>
     <w:bookmarkEnd w:id="73"/>
     <w:bookmarkStart w:id="75" w:name="ref-falcucci2020breaking"/>
@@ -10961,7 +10958,7 @@
         <w:pStyle w:val="Bibliography"/>
       </w:pPr>
       <w:r>
-        <w:t xml:space="preserve">[13]</w:t>
+        <w:t xml:space="preserve">13.</w:t>
       </w:r>
       <w:r>
         <w:t xml:space="preserve"> </w:t>
@@ -11003,22 +11000,16 @@
         <w:t xml:space="preserve">Europe</w:t>
       </w:r>
       <w:r>
-        <w:t xml:space="preserve">. Journal of Anthropological Sciences 2020;98:99–140.</w:t>
-      </w:r>
-      <w:r>
-        <w:t xml:space="preserve"> </w:t>
+        <w:t xml:space="preserve">. J Anthropol Sci. 2020;98: 99–140. doi:</w:t>
       </w:r>
       <w:hyperlink r:id="rId74">
         <w:r>
           <w:rPr>
             <w:rStyle w:val="Hyperlink"/>
           </w:rPr>
-          <w:t xml:space="preserve">https://doi.org/10.4436/JASS.98021</w:t>
+          <w:t xml:space="preserve">10.4436/JASS.98021</w:t>
         </w:r>
       </w:hyperlink>
-      <w:r>
-        <w:t xml:space="preserve">.</w:t>
-      </w:r>
     </w:p>
     <w:bookmarkEnd w:id="75"/>
     <w:bookmarkStart w:id="77" w:name="ref-Barshay_Szmidt_2012"/>
@@ -11027,7 +11018,7 @@
         <w:pStyle w:val="Bibliography"/>
       </w:pPr>
       <w:r>
-        <w:t xml:space="preserve">[14]</w:t>
+        <w:t xml:space="preserve">14.</w:t>
       </w:r>
       <w:r>
         <w:t xml:space="preserve"> </w:t>
@@ -11138,28 +11129,16 @@
         <w:t xml:space="preserve">France</w:t>
       </w:r>
       <w:r>
-        <w:t xml:space="preserve">). Pal</w:t>
-      </w:r>
-      <w:r>
-        <w:t xml:space="preserve">é</w:t>
-      </w:r>
-      <w:r>
-        <w:t xml:space="preserve">o 2012;23:11–38.</w:t>
-      </w:r>
-      <w:r>
-        <w:t xml:space="preserve"> </w:t>
+        <w:t xml:space="preserve">). Paleo. 2012;23: 11–38. doi:</w:t>
       </w:r>
       <w:hyperlink r:id="rId76">
         <w:r>
           <w:rPr>
             <w:rStyle w:val="Hyperlink"/>
           </w:rPr>
-          <w:t xml:space="preserve">https://doi.org/10.4000/paleo.2250</w:t>
+          <w:t xml:space="preserve">10.4000/paleo.2250</w:t>
         </w:r>
       </w:hyperlink>
-      <w:r>
-        <w:t xml:space="preserve">.</w:t>
-      </w:r>
     </w:p>
     <w:bookmarkEnd w:id="77"/>
     <w:bookmarkStart w:id="79" w:name="ref-Oliva_2006"/>
@@ -11168,7 +11147,7 @@
         <w:pStyle w:val="Bibliography"/>
       </w:pPr>
       <w:r>
-        <w:t xml:space="preserve">[15]</w:t>
+        <w:t xml:space="preserve">15.</w:t>
       </w:r>
       <w:r>
         <w:t xml:space="preserve"> </w:t>
@@ -11225,22 +11204,16 @@
         <w:t xml:space="preserve"> </w:t>
       </w:r>
       <w:r>
-        <w:t xml:space="preserve">and their remains, Vienna: Springer; 2006, p. 41–74.</w:t>
-      </w:r>
-      <w:r>
-        <w:t xml:space="preserve"> </w:t>
+        <w:t xml:space="preserve">and their remains. Vienna: Springer; 2006. pp. 41–74. doi:</w:t>
       </w:r>
       <w:hyperlink r:id="rId78">
         <w:r>
           <w:rPr>
             <w:rStyle w:val="Hyperlink"/>
           </w:rPr>
-          <w:t xml:space="preserve">https://doi.org/10.1007/978-3-211-49294-9_4</w:t>
+          <w:t xml:space="preserve">10.1007/978-3-211-49294-9_4</w:t>
         </w:r>
       </w:hyperlink>
-      <w:r>
-        <w:t xml:space="preserve">.</w:t>
-      </w:r>
     </w:p>
     <w:bookmarkEnd w:id="79"/>
     <w:bookmarkStart w:id="81" w:name="ref-Higham_2012"/>
@@ -11249,7 +11222,7 @@
         <w:pStyle w:val="Bibliography"/>
       </w:pPr>
       <w:r>
-        <w:t xml:space="preserve">[16]</w:t>
+        <w:t xml:space="preserve">16.</w:t>
       </w:r>
       <w:r>
         <w:t xml:space="preserve"> </w:t>
@@ -11291,22 +11264,16 @@
         <w:t xml:space="preserve">sterle</w:t>
       </w:r>
       <w:r>
-        <w:t xml:space="preserve">. Journal of Human Evolution 2012;62:664–76.</w:t>
-      </w:r>
-      <w:r>
-        <w:t xml:space="preserve"> </w:t>
+        <w:t xml:space="preserve">. J Hum Evol. 2012;62: 664–676. doi:</w:t>
       </w:r>
       <w:hyperlink r:id="rId80">
         <w:r>
           <w:rPr>
             <w:rStyle w:val="Hyperlink"/>
           </w:rPr>
-          <w:t xml:space="preserve">https://doi.org/10.1016/j.jhevol.2012.03.003</w:t>
+          <w:t xml:space="preserve">10.1016/j.jhevol.2012.03.003</w:t>
         </w:r>
       </w:hyperlink>
-      <w:r>
-        <w:t xml:space="preserve">.</w:t>
-      </w:r>
     </w:p>
     <w:bookmarkEnd w:id="81"/>
     <w:bookmarkStart w:id="83" w:name="ref-zilhao2003aurignacian"/>
@@ -11315,7 +11282,7 @@
         <w:pStyle w:val="Bibliography"/>
       </w:pPr>
       <w:r>
-        <w:t xml:space="preserve">[17]</w:t>
+        <w:t xml:space="preserve">17.</w:t>
       </w:r>
       <w:r>
         <w:t xml:space="preserve"> </w:t>
@@ -11393,34 +11360,16 @@
         <w:t xml:space="preserve"> </w:t>
       </w:r>
       <w:r>
-        <w:t xml:space="preserve">model. PALEO Revue d’arch</w:t>
-      </w:r>
-      <w:r>
-        <w:t xml:space="preserve">é</w:t>
-      </w:r>
-      <w:r>
-        <w:t xml:space="preserve">ologie Pr</w:t>
-      </w:r>
-      <w:r>
-        <w:t xml:space="preserve">é</w:t>
-      </w:r>
-      <w:r>
-        <w:t xml:space="preserve">historique 2003:69–86.</w:t>
-      </w:r>
-      <w:r>
-        <w:t xml:space="preserve"> </w:t>
+        <w:t xml:space="preserve">model. Paleo. 2003; 69–86. doi:</w:t>
       </w:r>
       <w:hyperlink r:id="rId82">
         <w:r>
           <w:rPr>
             <w:rStyle w:val="Hyperlink"/>
           </w:rPr>
-          <w:t xml:space="preserve">https://doi.org/10.4000/paleo.1231</w:t>
+          <w:t xml:space="preserve">10.4000/paleo.1231</w:t>
         </w:r>
       </w:hyperlink>
-      <w:r>
-        <w:t xml:space="preserve">.</w:t>
-      </w:r>
     </w:p>
     <w:bookmarkEnd w:id="83"/>
     <w:bookmarkStart w:id="85" w:name="ref-Schurch_et_al_2025_bladelet"/>
@@ -11429,7 +11378,7 @@
         <w:pStyle w:val="Bibliography"/>
       </w:pPr>
       <w:r>
-        <w:t xml:space="preserve">[18]</w:t>
+        <w:t xml:space="preserve">18.</w:t>
       </w:r>
       <w:r>
         <w:t xml:space="preserve"> </w:t>
@@ -11459,22 +11408,16 @@
         <w:t xml:space="preserve">Vogelherd</w:t>
       </w:r>
       <w:r>
-        <w:t xml:space="preserve">. PLOS ONE 2025;20:e0331921.</w:t>
-      </w:r>
-      <w:r>
-        <w:t xml:space="preserve"> </w:t>
+        <w:t xml:space="preserve">. PLoS One. 2025;20: e0331921. doi:</w:t>
       </w:r>
       <w:hyperlink r:id="rId84">
         <w:r>
           <w:rPr>
             <w:rStyle w:val="Hyperlink"/>
           </w:rPr>
-          <w:t xml:space="preserve">https://doi.org/10.1371/journal.pone.0331921</w:t>
+          <w:t xml:space="preserve">10.1371/journal.pone.0331921</w:t>
         </w:r>
       </w:hyperlink>
-      <w:r>
-        <w:t xml:space="preserve">.</w:t>
-      </w:r>
     </w:p>
     <w:bookmarkEnd w:id="85"/>
     <w:bookmarkStart w:id="87" w:name="ref-Semal_2009"/>
@@ -11483,7 +11426,7 @@
         <w:pStyle w:val="Bibliography"/>
       </w:pPr>
       <w:r>
-        <w:t xml:space="preserve">[19]</w:t>
+        <w:t xml:space="preserve">19.</w:t>
       </w:r>
       <w:r>
         <w:t xml:space="preserve"> </w:t>
@@ -11519,22 +11462,16 @@
         <w:t xml:space="preserve"> </w:t>
       </w:r>
       <w:r>
-        <w:t xml:space="preserve">fossils. American Journal of Physical Anthropology 2009;138:421–8.</w:t>
-      </w:r>
-      <w:r>
-        <w:t xml:space="preserve"> </w:t>
+        <w:t xml:space="preserve">fossils. Am J Phys Anthropol. 2009;138: 421–428. doi:</w:t>
       </w:r>
       <w:hyperlink r:id="rId86">
         <w:r>
           <w:rPr>
             <w:rStyle w:val="Hyperlink"/>
           </w:rPr>
-          <w:t xml:space="preserve">https://doi.org/10.1002/ajpa.20954</w:t>
+          <w:t xml:space="preserve">10.1002/ajpa.20954</w:t>
         </w:r>
       </w:hyperlink>
-      <w:r>
-        <w:t xml:space="preserve">.</w:t>
-      </w:r>
     </w:p>
     <w:bookmarkEnd w:id="87"/>
     <w:bookmarkStart w:id="89" w:name="ref-Deschamps_2019"/>
@@ -11543,7 +11480,7 @@
         <w:pStyle w:val="Bibliography"/>
       </w:pPr>
       <w:r>
-        <w:t xml:space="preserve">[20]</w:t>
+        <w:t xml:space="preserve">20.</w:t>
       </w:r>
       <w:r>
         <w:t xml:space="preserve"> </w:t>
@@ -11615,22 +11552,16 @@
         <w:t xml:space="preserve"> </w:t>
       </w:r>
       <w:r>
-        <w:t xml:space="preserve">collections. Comptes Rendus Palevol 2019;18:569–86.</w:t>
-      </w:r>
-      <w:r>
-        <w:t xml:space="preserve"> </w:t>
+        <w:t xml:space="preserve">collections. C R Palevol. 2019;18: 569–586. doi:</w:t>
       </w:r>
       <w:hyperlink r:id="rId88">
         <w:r>
           <w:rPr>
             <w:rStyle w:val="Hyperlink"/>
           </w:rPr>
-          <w:t xml:space="preserve">https://doi.org/10.1016/j.crpv.2019.04.001</w:t>
+          <w:t xml:space="preserve">10.1016/j.crpv.2019.04.001</w:t>
         </w:r>
       </w:hyperlink>
-      <w:r>
-        <w:t xml:space="preserve">.</w:t>
-      </w:r>
     </w:p>
     <w:bookmarkEnd w:id="89"/>
     <w:bookmarkEnd w:id="90"/>

</xml_diff>

<commit_message>
preparing for final submit
</commit_message>
<xml_diff>
--- a/paper/S2-supplement-site-assignment.docx
+++ b/paper/S2-supplement-site-assignment.docx
@@ -476,7 +476,7 @@
         <w:pStyle w:val="FirstParagraph"/>
       </w:pPr>
       <w:r>
-        <w:t xml:space="preserve">The following code loads the raw SignBase dataset, parses radiocarbon dates, calibrates them, and assigns objects to phases. Sites excluded from the main analysis are filtered out, and sites reassigned based on technological attribution are overridden. Date parsing handles both ends of date ranges, routes OSL ages around radiocarbon calibration, and uses IntCal20 explicitly. Sensitivity to variant choice is explored in Supplement S1. The resulting per-site assignment and basis are listed in</w:t>
+        <w:t xml:space="preserve">The pipeline in this supplement’s source document loads the raw SignBase dataset, parses radiocarbon dates, calibrates them, and assigns objects to phases. Sites excluded from the main analysis are filtered out, and sites reassigned based on technological attribution are overridden. Date parsing handles both ends of date ranges, routes OSL ages around radiocarbon calibration, and uses IntCal20 explicitly. Sensitivity to variant choice is explored in Supplement S1. The resulting per-site assignment and basis are listed in</w:t>
       </w:r>
       <w:r>
         <w:t xml:space="preserve"> </w:t>
@@ -2864,23 +2864,25 @@
         <w:pStyle w:val="FirstParagraph"/>
       </w:pPr>
       <w:r>
-        <w:t xml:space="preserve">Vogelherd is kept as a single site-level Aur-P1 unit rather than split by layer: unlike Hohle Fels, its documented mixing is</w:t>
-      </w:r>
-      <w:r>
-        <w:t xml:space="preserve"> </w:t>
-      </w:r>
-      <w:r>
-        <w:rPr>
-          <w:iCs/>
-          <w:i/>
-        </w:rPr>
-        <w:t xml:space="preserve">between</w:t>
-      </w:r>
-      <w:r>
-        <w:t xml:space="preserve"> </w:t>
-      </w:r>
-      <w:r>
-        <w:t xml:space="preserve">the Aurignacian and other technocomplexes (Gravettian, Magdalenian), not between Aur-P1 and Aur-P2 Aurignacian facies, so no layer-level phase boundary can be drawn from the published reassessments. The mixing concern is instead addressed directly in S1 §</w:t>
+        <w:t xml:space="preserve">Vogelherd is kept as a single site-level Aur-P1 unit rather than split by layer. The reassessment documents mixing inside the Aurignacian sequence, with 38 refit connections between AH IV and AH V, and some mixing with later material</w:t>
+      </w:r>
+      <w:r>
+        <w:t xml:space="preserve"> </w:t>
+      </w:r>
+      <w:r>
+        <w:t xml:space="preserve">[11]</w:t>
+      </w:r>
+      <w:r>
+        <w:t xml:space="preserve">. Only 27 of the 173 analysed Vogelherd objects carry an AH IV or AH V layer code in SignBase, so a layer-level phase boundary cannot be applied to them. The 15 radiocarbon dates in the reassessment span 42–34.5 ka cal BP</w:t>
+      </w:r>
+      <w:r>
+        <w:t xml:space="preserve"> </w:t>
+      </w:r>
+      <w:r>
+        <w:t xml:space="preserve">[11]</w:t>
+      </w:r>
+      <w:r>
+        <w:t xml:space="preserve">. This span crosses the Aur-P1/Aur-P2 boundary, so the Aur-P1 assignment of the whole site is a simplification. The mixing concern is instead addressed directly in S1 §</w:t>
       </w:r>
       <w:r>
         <w:t xml:space="preserve">S1.5.5</w:t>

</xml_diff>